<commit_message>
add kolmogorov criterion & theoretical distribution function
</commit_message>
<xml_diff>
--- a/report.docx
+++ b/report.docx
@@ -707,7 +707,7 @@
             <m:oMath>
               <m:r>
                 <m:rPr>
-                  <m:sty m:val="bi"/>
+                  <m:sty m:val="p"/>
                 </m:rPr>
                 <w:rPr>
                   <w:rFonts w:ascii="Cambria Math" w:hAnsi="Cambria Math"/>
@@ -718,7 +718,7 @@
               </m:r>
               <m:r>
                 <m:rPr>
-                  <m:sty m:val="bi"/>
+                  <m:sty m:val="p"/>
                 </m:rPr>
                 <w:rPr>
                   <w:rFonts w:ascii="Cambria Math" w:hAnsi="Cambria Math"/>
@@ -730,7 +730,7 @@
               </m:r>
               <m:r>
                 <m:rPr>
-                  <m:sty m:val="bi"/>
+                  <m:sty m:val="p"/>
                 </m:rPr>
                 <w:rPr>
                   <w:rFonts w:ascii="Cambria Math" w:hAnsi="Cambria Math"/>
@@ -741,7 +741,7 @@
               </m:r>
               <m:r>
                 <m:rPr>
-                  <m:sty m:val="bi"/>
+                  <m:sty m:val="p"/>
                 </m:rPr>
                 <w:rPr>
                   <w:rFonts w:ascii="Cambria Math" w:hAnsi="Cambria Math"/>
@@ -752,7 +752,7 @@
               </m:r>
               <m:r>
                 <m:rPr>
-                  <m:sty m:val="bi"/>
+                  <m:sty m:val="p"/>
                 </m:rPr>
                 <w:rPr>
                   <w:rFonts w:ascii="Cambria Math" w:hAnsi="Cambria Math"/>
@@ -764,7 +764,7 @@
               </m:r>
               <m:r>
                 <m:rPr>
-                  <m:sty m:val="bi"/>
+                  <m:sty m:val="p"/>
                 </m:rPr>
                 <w:rPr>
                   <w:rFonts w:ascii="Cambria Math" w:hAnsi="Cambria Math"/>
@@ -775,7 +775,7 @@
               </m:r>
               <m:r>
                 <m:rPr>
-                  <m:sty m:val="bi"/>
+                  <m:sty m:val="p"/>
                 </m:rPr>
                 <w:rPr>
                   <w:rFonts w:ascii="Cambria Math" w:hAnsi="Cambria Math"/>
@@ -835,6 +835,7 @@
                 <w:b w:val="0"/>
                 <w:bCs w:val="0"/>
                 <w:i w:val="0"/>
+                <w:iCs w:val="0"/>
                 <w:sz w:val="24"/>
                 <w:szCs w:val="24"/>
                 <w:lang w:val="en-US"/>
@@ -842,23 +843,24 @@
             </w:pPr>
             <m:oMathPara>
               <m:oMath>
-                <m:sSup>
-                  <m:sSupPr>
+                <m:sSubSup>
+                  <m:sSubSupPr>
                     <m:ctrlPr>
                       <w:rPr>
                         <w:rFonts w:ascii="Cambria Math" w:hAnsi="Cambria Math"/>
                         <w:b w:val="0"/>
                         <w:bCs w:val="0"/>
                         <w:i w:val="0"/>
+                        <w:iCs w:val="0"/>
                         <w:sz w:val="24"/>
                         <w:szCs w:val="24"/>
                       </w:rPr>
                     </m:ctrlPr>
-                  </m:sSupPr>
+                  </m:sSubSupPr>
                   <m:e>
                     <m:r>
                       <m:rPr>
-                        <m:sty m:val="bi"/>
+                        <m:sty m:val="p"/>
                       </m:rPr>
                       <w:rPr>
                         <w:rFonts w:ascii="Cambria Math" w:hAnsi="Cambria Math"/>
@@ -867,22 +869,24 @@
                       </w:rPr>
                       <m:t>x</m:t>
                     </m:r>
+                  </m:e>
+                  <m:sub>
                     <m:r>
                       <m:rPr>
-                        <m:sty m:val="bi"/>
+                        <m:sty m:val="p"/>
                       </m:rPr>
                       <w:rPr>
                         <w:rFonts w:ascii="Cambria Math" w:hAnsi="Cambria Math"/>
-                        <w:w w:val="105"/>
-                        <w:sz w:val="14"/>
+                        <w:sz w:val="24"/>
+                        <w:szCs w:val="24"/>
                       </w:rPr>
                       <m:t>i</m:t>
                     </m:r>
-                  </m:e>
+                  </m:sub>
                   <m:sup>
                     <m:r>
                       <m:rPr>
-                        <m:sty m:val="bi"/>
+                        <m:sty m:val="p"/>
                       </m:rPr>
                       <w:rPr>
                         <w:rFonts w:ascii="Cambria Math" w:hAnsi="Cambria Math"/>
@@ -892,10 +896,10 @@
                       <m:t>^</m:t>
                     </m:r>
                   </m:sup>
-                </m:sSup>
+                </m:sSubSup>
                 <m:r>
                   <m:rPr>
-                    <m:sty m:val="bi"/>
+                    <m:sty m:val="p"/>
                   </m:rPr>
                   <w:rPr>
                     <w:rFonts w:ascii="Cambria Math" w:hAnsi="Cambria Math"/>
@@ -906,7 +910,7 @@
                 </m:r>
                 <m:r>
                   <m:rPr>
-                    <m:sty m:val="bi"/>
+                    <m:sty m:val="p"/>
                   </m:rPr>
                   <w:rPr>
                     <w:rFonts w:ascii="Cambria Math" w:hAnsi="Cambria Math"/>
@@ -924,6 +928,7 @@
                         <w:b w:val="0"/>
                         <w:bCs w:val="0"/>
                         <w:i w:val="0"/>
+                        <w:iCs w:val="0"/>
                         <w:sz w:val="24"/>
                         <w:szCs w:val="24"/>
                         <w:lang w:val="en-US"/>
@@ -933,7 +938,7 @@
                   <m:num>
                     <m:r>
                       <m:rPr>
-                        <m:sty m:val="bi"/>
+                        <m:sty m:val="p"/>
                       </m:rPr>
                       <w:rPr>
                         <w:rFonts w:ascii="Cambria Math" w:hAnsi="Cambria Math"/>
@@ -945,7 +950,7 @@
                     </m:r>
                     <m:r>
                       <m:rPr>
-                        <m:sty m:val="bi"/>
+                        <m:sty m:val="p"/>
                       </m:rPr>
                       <w:rPr>
                         <w:rFonts w:ascii="Cambria Math" w:hAnsi="Cambria Math"/>
@@ -956,7 +961,7 @@
                     </m:r>
                     <m:r>
                       <m:rPr>
-                        <m:sty m:val="bi"/>
+                        <m:sty m:val="p"/>
                       </m:rPr>
                       <w:rPr>
                         <w:rFonts w:ascii="Cambria Math" w:hAnsi="Cambria Math"/>
@@ -968,7 +973,7 @@
                     </m:r>
                     <m:r>
                       <m:rPr>
-                        <m:sty m:val="bi"/>
+                        <m:sty m:val="p"/>
                       </m:rPr>
                       <w:rPr>
                         <w:rFonts w:ascii="Cambria Math" w:hAnsi="Cambria Math"/>
@@ -981,7 +986,7 @@
                   <m:den>
                     <m:r>
                       <m:rPr>
-                        <m:sty m:val="bi"/>
+                        <m:sty m:val="p"/>
                       </m:rPr>
                       <w:rPr>
                         <w:rFonts w:ascii="Cambria Math" w:hAnsi="Cambria Math"/>
@@ -1043,7 +1048,7 @@
               <m:oMath>
                 <m:r>
                   <m:rPr>
-                    <m:sty m:val="bi"/>
+                    <m:sty m:val="p"/>
                   </m:rPr>
                   <w:rPr>
                     <w:rFonts w:ascii="Cambria Math" w:hAnsi="Cambria Math"/>
@@ -1055,7 +1060,7 @@
                 </m:r>
                 <m:r>
                   <m:rPr>
-                    <m:sty m:val="bi"/>
+                    <m:sty m:val="p"/>
                   </m:rPr>
                   <w:rPr>
                     <w:rFonts w:ascii="Cambria Math" w:hAnsi="Cambria Math"/>
@@ -1111,7 +1116,7 @@
             <m:oMath>
               <m:r>
                 <m:rPr>
-                  <m:sty m:val="bi"/>
+                  <m:sty m:val="p"/>
                 </m:rPr>
                 <w:rPr>
                   <w:rFonts w:ascii="Cambria Math" w:hAnsi="Cambria Math"/>
@@ -1123,7 +1128,7 @@
               </m:r>
               <m:r>
                 <m:rPr>
-                  <m:sty m:val="bi"/>
+                  <m:sty m:val="p"/>
                 </m:rPr>
                 <w:rPr>
                   <w:rFonts w:ascii="Cambria Math" w:hAnsi="Cambria Math"/>
@@ -1149,7 +1154,7 @@
             <m:oMath>
               <m:r>
                 <m:rPr>
-                  <m:sty m:val="bi"/>
+                  <m:sty m:val="p"/>
                 </m:rPr>
                 <w:rPr>
                   <w:rFonts w:ascii="Cambria Math" w:hAnsi="Cambria Math"/>
@@ -1176,7 +1181,7 @@
                 <m:num>
                   <m:r>
                     <m:rPr>
-                      <m:sty m:val="bi"/>
+                      <m:sty m:val="p"/>
                     </m:rPr>
                     <w:rPr>
                       <w:rFonts w:ascii="Cambria Math" w:hAnsi="Cambria Math"/>
@@ -1188,7 +1193,7 @@
                   </m:r>
                   <m:r>
                     <m:rPr>
-                      <m:sty m:val="bi"/>
+                      <m:sty m:val="p"/>
                     </m:rPr>
                     <w:rPr>
                       <w:rFonts w:ascii="Cambria Math" w:hAnsi="Cambria Math"/>
@@ -1201,7 +1206,7 @@
                 <m:den>
                   <m:r>
                     <m:rPr>
-                      <m:sty m:val="bi"/>
+                      <m:sty m:val="p"/>
                     </m:rPr>
                     <w:rPr>
                       <w:rFonts w:ascii="Cambria Math" w:hAnsi="Cambria Math"/>
@@ -1256,151 +1261,190 @@
                 <w:szCs w:val="24"/>
               </w:rPr>
             </w:pPr>
+            <m:oMathPara>
+              <m:oMath>
+                <m:sSubSup>
+                  <m:sSubSupPr>
+                    <m:ctrlPr>
+                      <w:rPr>
+                        <w:rFonts w:ascii="Cambria Math" w:hAnsi="Cambria Math"/>
+                        <w:b w:val="0"/>
+                        <w:bCs w:val="0"/>
+                        <w:i w:val="0"/>
+                        <w:iCs w:val="0"/>
+                        <w:sz w:val="20"/>
+                        <w:szCs w:val="20"/>
+                        <w:lang w:val="en-US"/>
+                      </w:rPr>
+                    </m:ctrlPr>
+                  </m:sSubSupPr>
+                  <m:e>
+                    <m:r>
+                      <m:rPr>
+                        <m:sty m:val="p"/>
+                      </m:rPr>
+                      <w:rPr>
+                        <w:rFonts w:ascii="Cambria Math" w:hAnsi="Cambria Math"/>
+                        <w:sz w:val="20"/>
+                        <w:szCs w:val="20"/>
+                        <w:lang w:val="en-US"/>
+                      </w:rPr>
+                      <m:t>F</m:t>
+                    </m:r>
+                  </m:e>
+                  <m:sub>
+                    <m:r>
+                      <m:rPr>
+                        <m:sty m:val="p"/>
+                      </m:rPr>
+                      <w:rPr>
+                        <w:rFonts w:ascii="Cambria Math" w:hAnsi="Cambria Math"/>
+                        <w:sz w:val="20"/>
+                        <w:szCs w:val="20"/>
+                        <w:lang w:val="en-US"/>
+                      </w:rPr>
+                      <m:t>n</m:t>
+                    </m:r>
+                  </m:sub>
+                  <m:sup>
+                    <m:r>
+                      <m:rPr>
+                        <m:sty m:val="p"/>
+                      </m:rPr>
+                      <w:rPr>
+                        <w:rFonts w:ascii="Cambria Math" w:hAnsi="Cambria Math"/>
+                        <w:sz w:val="20"/>
+                        <w:szCs w:val="20"/>
+                        <w:lang w:val="en-US"/>
+                      </w:rPr>
+                      <m:t>*</m:t>
+                    </m:r>
+                  </m:sup>
+                </m:sSubSup>
+                <m:sSubSup>
+                  <m:sSubSupPr>
+                    <m:ctrlPr>
+                      <w:rPr>
+                        <w:rFonts w:ascii="Cambria Math" w:hAnsi="Cambria Math"/>
+                        <w:b w:val="0"/>
+                        <w:bCs w:val="0"/>
+                        <w:i w:val="0"/>
+                        <w:iCs w:val="0"/>
+                        <w:sz w:val="24"/>
+                        <w:szCs w:val="24"/>
+                      </w:rPr>
+                    </m:ctrlPr>
+                  </m:sSubSupPr>
+                  <m:e>
+                    <m:r>
+                      <m:rPr>
+                        <m:sty m:val="p"/>
+                      </m:rPr>
+                      <w:rPr>
+                        <w:rFonts w:ascii="Cambria Math" w:hAnsi="Cambria Math"/>
+                        <w:sz w:val="24"/>
+                        <w:szCs w:val="24"/>
+                      </w:rPr>
+                      <m:t>(</m:t>
+                    </m:r>
+                    <m:r>
+                      <m:rPr>
+                        <m:sty m:val="p"/>
+                      </m:rPr>
+                      <w:rPr>
+                        <w:rFonts w:ascii="Cambria Math" w:hAnsi="Cambria Math"/>
+                        <w:sz w:val="24"/>
+                        <w:szCs w:val="24"/>
+                      </w:rPr>
+                      <m:t>x</m:t>
+                    </m:r>
+                  </m:e>
+                  <m:sub>
+                    <m:r>
+                      <m:rPr>
+                        <m:sty m:val="p"/>
+                      </m:rPr>
+                      <w:rPr>
+                        <w:rFonts w:ascii="Cambria Math" w:hAnsi="Cambria Math"/>
+                        <w:sz w:val="24"/>
+                        <w:szCs w:val="24"/>
+                      </w:rPr>
+                      <m:t>i</m:t>
+                    </m:r>
+                  </m:sub>
+                  <m:sup>
+                    <m:r>
+                      <m:rPr>
+                        <m:sty m:val="p"/>
+                      </m:rPr>
+                      <w:rPr>
+                        <w:rFonts w:ascii="Cambria Math" w:hAnsi="Cambria Math"/>
+                        <w:sz w:val="24"/>
+                        <w:szCs w:val="24"/>
+                      </w:rPr>
+                      <m:t>^</m:t>
+                    </m:r>
+                  </m:sup>
+                </m:sSubSup>
+                <m:r>
+                  <m:rPr>
+                    <m:sty m:val="p"/>
+                  </m:rPr>
+                  <w:rPr>
+                    <w:rFonts w:ascii="Cambria Math" w:hAnsi="Cambria Math"/>
+                    <w:sz w:val="24"/>
+                    <w:szCs w:val="24"/>
+                  </w:rPr>
+                  <m:t>)</m:t>
+                </m:r>
+              </m:oMath>
+            </m:oMathPara>
+          </w:p>
+        </w:tc>
+        <w:tc>
+          <w:tcPr>
+            <w:tcW w:w="1307" w:type="dxa"/>
+          </w:tcPr>
+          <w:p>
+            <w:pPr>
+              <w:pStyle w:val="23"/>
+              <w:rPr>
+                <w:b w:val="0"/>
+                <w:bCs w:val="0"/>
+                <w:i w:val="0"/>
+                <w:iCs w:val="0"/>
+                <w:sz w:val="24"/>
+                <w:szCs w:val="24"/>
+              </w:rPr>
+            </w:pPr>
+            <w:r>
+              <w:rPr>
+                <w:b w:val="0"/>
+                <w:bCs w:val="0"/>
+                <w:i w:val="0"/>
+                <w:iCs w:val="0"/>
+                <w:sz w:val="24"/>
+                <w:szCs w:val="24"/>
+              </w:rPr>
+              <w:t>Плотность частоты</w:t>
+            </w:r>
+          </w:p>
+          <w:p>
+            <w:pPr>
+              <w:pStyle w:val="23"/>
+              <w:rPr>
+                <w:b w:val="0"/>
+                <w:bCs w:val="0"/>
+                <w:i w:val="0"/>
+                <w:iCs w:val="0"/>
+                <w:sz w:val="24"/>
+                <w:szCs w:val="24"/>
+              </w:rPr>
+            </w:pPr>
             <m:oMath>
               <m:r>
                 <m:rPr>
-                  <m:sty m:val="bi"/>
-                </m:rPr>
-                <w:rPr>
-                  <w:rFonts w:ascii="Cambria Math" w:hAnsi="Cambria Math"/>
-                  <w:sz w:val="24"/>
-                  <w:szCs w:val="24"/>
-                  <w:lang w:val="en-US"/>
-                </w:rPr>
-                <m:t>F</m:t>
-              </m:r>
-            </m:oMath>
-            <w:r>
-              <w:rPr>
-                <w:rFonts w:ascii="Cambria Math" w:hAnsi="Cambria Math"/>
-                <w:b w:val="0"/>
-                <w:bCs w:val="0"/>
-                <w:i w:val="0"/>
-                <w:iCs w:val="0"/>
-                <w:sz w:val="24"/>
-                <w:szCs w:val="24"/>
-                <w:vertAlign w:val="superscript"/>
-              </w:rPr>
-              <w:t>∗</w:t>
-            </w:r>
-            <w:r>
-              <w:rPr>
-                <w:rFonts w:ascii="Cambria Math" w:hAnsi="Cambria Math"/>
-                <w:b w:val="0"/>
-                <w:bCs w:val="0"/>
-                <w:i w:val="0"/>
-                <w:iCs w:val="0"/>
-                <w:sz w:val="24"/>
-                <w:szCs w:val="24"/>
-                <w:vertAlign w:val="subscript"/>
-                <w:lang w:val="en-US"/>
-              </w:rPr>
-              <w:t>n</w:t>
-            </w:r>
-            <m:oMath>
-              <m:r>
-                <m:rPr>
-                  <m:sty m:val="bi"/>
-                </m:rPr>
-                <w:rPr>
-                  <w:rFonts w:ascii="Cambria Math" w:hAnsi="Cambria Math"/>
-                  <w:sz w:val="24"/>
-                  <w:szCs w:val="24"/>
-                </w:rPr>
-                <m:t xml:space="preserve"> (</m:t>
-              </m:r>
-              <m:r>
-                <m:rPr>
-                  <m:sty m:val="bi"/>
-                </m:rPr>
-                <w:rPr>
-                  <w:rFonts w:ascii="Cambria Math" w:hAnsi="Cambria Math"/>
-                  <w:sz w:val="24"/>
-                  <w:szCs w:val="24"/>
-                  <w:lang w:val="en-US"/>
-                </w:rPr>
-                <m:t>x</m:t>
-              </m:r>
-              <m:r>
-                <m:rPr>
-                  <m:sty m:val="bi"/>
-                </m:rPr>
-                <w:rPr>
-                  <w:rFonts w:ascii="Cambria Math" w:hAnsi="Cambria Math"/>
-                  <w:sz w:val="24"/>
-                  <w:szCs w:val="24"/>
-                </w:rPr>
-                <m:t>^</m:t>
-              </m:r>
-              <m:r>
-                <m:rPr>
-                  <m:sty m:val="bi"/>
-                </m:rPr>
-                <w:rPr>
-                  <w:rFonts w:ascii="Cambria Math" w:hAnsi="Cambria Math"/>
-                  <w:w w:val="105"/>
-                  <w:sz w:val="14"/>
-                </w:rPr>
-                <m:t>i</m:t>
-              </m:r>
-              <m:r>
-                <m:rPr>
-                  <m:sty m:val="bi"/>
-                </m:rPr>
-                <w:rPr>
-                  <w:rFonts w:ascii="Cambria Math" w:hAnsi="Cambria Math"/>
-                  <w:sz w:val="24"/>
-                  <w:szCs w:val="24"/>
-                </w:rPr>
-                <m:t>)</m:t>
-              </m:r>
-            </m:oMath>
-          </w:p>
-        </w:tc>
-        <w:tc>
-          <w:tcPr>
-            <w:tcW w:w="1307" w:type="dxa"/>
-          </w:tcPr>
-          <w:p>
-            <w:pPr>
-              <w:pStyle w:val="23"/>
-              <w:rPr>
-                <w:b w:val="0"/>
-                <w:bCs w:val="0"/>
-                <w:i w:val="0"/>
-                <w:iCs w:val="0"/>
-                <w:sz w:val="24"/>
-                <w:szCs w:val="24"/>
-              </w:rPr>
-            </w:pPr>
-            <w:r>
-              <w:rPr>
-                <w:b w:val="0"/>
-                <w:bCs w:val="0"/>
-                <w:i w:val="0"/>
-                <w:iCs w:val="0"/>
-                <w:sz w:val="24"/>
-                <w:szCs w:val="24"/>
-              </w:rPr>
-              <w:t>Плотность частоты</w:t>
-            </w:r>
-          </w:p>
-          <w:p>
-            <w:pPr>
-              <w:pStyle w:val="23"/>
-              <w:rPr>
-                <w:b w:val="0"/>
-                <w:bCs w:val="0"/>
-                <w:i w:val="0"/>
-                <w:iCs w:val="0"/>
-                <w:sz w:val="24"/>
-                <w:szCs w:val="24"/>
-              </w:rPr>
-            </w:pPr>
-            <m:oMath>
-              <m:r>
-                <m:rPr>
-                  <m:sty m:val="bi"/>
+                  <m:sty m:val="p"/>
                 </m:rPr>
                 <w:rPr>
                   <w:rFonts w:ascii="Cambria Math" w:hAnsi="Cambria Math"/>
@@ -1411,7 +1455,7 @@
               </m:r>
               <m:r>
                 <m:rPr>
-                  <m:sty m:val="bi"/>
+                  <m:sty m:val="p"/>
                 </m:rPr>
                 <w:rPr>
                   <w:rFonts w:ascii="Cambria Math" w:hAnsi="Cambria Math"/>
@@ -1437,7 +1481,7 @@
             <m:oMath>
               <m:r>
                 <m:rPr>
-                  <m:sty m:val="bi"/>
+                  <m:sty m:val="p"/>
                 </m:rPr>
                 <w:rPr>
                   <w:rFonts w:ascii="Cambria Math" w:hAnsi="Cambria Math"/>
@@ -1464,7 +1508,7 @@
                 <m:num>
                   <m:r>
                     <m:rPr>
-                      <m:sty m:val="bi"/>
+                      <m:sty m:val="p"/>
                     </m:rPr>
                     <w:rPr>
                       <w:rFonts w:ascii="Cambria Math" w:hAnsi="Cambria Math"/>
@@ -1476,7 +1520,7 @@
                   </m:r>
                   <m:r>
                     <m:rPr>
-                      <m:sty m:val="bi"/>
+                      <m:sty m:val="p"/>
                     </m:rPr>
                     <w:rPr>
                       <w:rFonts w:ascii="Cambria Math" w:hAnsi="Cambria Math"/>
@@ -1487,7 +1531,7 @@
                   </m:r>
                   <m:r>
                     <m:rPr>
-                      <m:sty m:val="bi"/>
+                      <m:sty m:val="p"/>
                     </m:rPr>
                     <w:rPr>
                       <w:rFonts w:ascii="Cambria Math" w:hAnsi="Cambria Math"/>
@@ -1501,7 +1545,7 @@
                 <m:den>
                   <m:r>
                     <m:rPr>
-                      <m:sty m:val="bi"/>
+                      <m:sty m:val="p"/>
                     </m:rPr>
                     <w:rPr>
                       <w:rFonts w:ascii="Cambria Math" w:hAnsi="Cambria Math"/>
@@ -1514,7 +1558,7 @@
               </m:f>
               <m:r>
                 <m:rPr>
-                  <m:sty m:val="bi"/>
+                  <m:sty m:val="p"/>
                 </m:rPr>
                 <w:rPr>
                   <w:rFonts w:ascii="Cambria Math" w:hAnsi="Cambria Math"/>
@@ -3481,6 +3525,117 @@
     <w:p>
       <w:pPr>
         <w:pStyle w:val="23"/>
+        <w:keepNext/>
+      </w:pPr>
+      <w:r>
+        <w:rPr>
+          <w:b w:val="0"/>
+          <w:bCs w:val="0"/>
+          <w:i w:val="0"/>
+          <w:iCs w:val="0"/>
+          <w:noProof/>
+          <w:sz w:val="24"/>
+          <w:szCs w:val="24"/>
+        </w:rPr>
+        <w:drawing>
+          <wp:inline distT="0" distB="0" distL="0" distR="0" wp14:anchorId="74358679" wp14:editId="5E556045">
+            <wp:extent cx="4937760" cy="3703320"/>
+            <wp:effectExtent l="0" t="0" r="0" b="0"/>
+            <wp:docPr id="826064790" name="Рисунок 1" descr="Изображение выглядит как текст, линия, График, диаграмма&#10;&#10;Содержимое, созданное искусственным интеллектом, может быть неверным."/>
+            <wp:cNvGraphicFramePr>
+              <a:graphicFrameLocks xmlns:a="http://schemas.openxmlformats.org/drawingml/2006/main" noChangeAspect="1"/>
+            </wp:cNvGraphicFramePr>
+            <a:graphic xmlns:a="http://schemas.openxmlformats.org/drawingml/2006/main">
+              <a:graphicData uri="http://schemas.openxmlformats.org/drawingml/2006/picture">
+                <pic:pic xmlns:pic="http://schemas.openxmlformats.org/drawingml/2006/picture">
+                  <pic:nvPicPr>
+                    <pic:cNvPr id="826064790" name="Рисунок 1" descr="Изображение выглядит как текст, линия, График, диаграмма&#10;&#10;Содержимое, созданное искусственным интеллектом, может быть неверным."/>
+                    <pic:cNvPicPr/>
+                  </pic:nvPicPr>
+                  <pic:blipFill>
+                    <a:blip r:embed="rId8">
+                      <a:extLst>
+                        <a:ext uri="{28A0092B-C50C-407E-A947-70E740481C1C}">
+                          <a14:useLocalDpi xmlns:a14="http://schemas.microsoft.com/office/drawing/2010/main" val="0"/>
+                        </a:ext>
+                      </a:extLst>
+                    </a:blip>
+                    <a:stretch>
+                      <a:fillRect/>
+                    </a:stretch>
+                  </pic:blipFill>
+                  <pic:spPr>
+                    <a:xfrm>
+                      <a:off x="0" y="0"/>
+                      <a:ext cx="4955559" cy="3716669"/>
+                    </a:xfrm>
+                    <a:prstGeom prst="rect">
+                      <a:avLst/>
+                    </a:prstGeom>
+                  </pic:spPr>
+                </pic:pic>
+              </a:graphicData>
+            </a:graphic>
+          </wp:inline>
+        </w:drawing>
+      </w:r>
+    </w:p>
+    <w:p>
+      <w:pPr>
+        <w:pStyle w:val="af4"/>
+        <w:jc w:val="center"/>
+        <w:rPr>
+          <w:b/>
+          <w:bCs/>
+          <w:i w:val="0"/>
+          <w:iCs w:val="0"/>
+          <w:sz w:val="24"/>
+          <w:szCs w:val="24"/>
+        </w:rPr>
+      </w:pPr>
+      <w:r>
+        <w:t xml:space="preserve">Рисунок </w:t>
+      </w:r>
+      <w:fldSimple w:instr=" SEQ Рисунок \* ARABIC ">
+        <w:r>
+          <w:rPr>
+            <w:noProof/>
+          </w:rPr>
+          <w:t>5</w:t>
+        </w:r>
+      </w:fldSimple>
+      <w:r>
+        <w:t>. Теоретическая функция распределения</w:t>
+      </w:r>
+    </w:p>
+    <w:p>
+      <w:pPr>
+        <w:pStyle w:val="23"/>
+        <w:jc w:val="both"/>
+        <w:rPr>
+          <w:b w:val="0"/>
+          <w:bCs w:val="0"/>
+          <w:i w:val="0"/>
+          <w:iCs w:val="0"/>
+          <w:sz w:val="24"/>
+          <w:szCs w:val="24"/>
+        </w:rPr>
+      </w:pPr>
+      <w:r>
+        <w:rPr>
+          <w:b w:val="0"/>
+          <w:bCs w:val="0"/>
+          <w:i w:val="0"/>
+          <w:iCs w:val="0"/>
+          <w:sz w:val="24"/>
+          <w:szCs w:val="24"/>
+        </w:rPr>
+        <w:br w:type="page"/>
+      </w:r>
+    </w:p>
+    <w:p>
+      <w:pPr>
+        <w:pStyle w:val="23"/>
         <w:jc w:val="both"/>
         <w:rPr>
           <w:b w:val="0"/>
@@ -3619,9 +3774,6 @@
                     </m:accPr>
                     <m:e>
                       <m:r>
-                        <m:rPr>
-                          <m:sty m:val="bi"/>
-                        </m:rPr>
                         <w:rPr>
                           <w:rFonts w:ascii="Cambria Math" w:hAnsi="Cambria Math"/>
                           <w:sz w:val="24"/>
@@ -3634,9 +3786,6 @@
                 </m:e>
                 <m:sub>
                   <m:r>
-                    <m:rPr>
-                      <m:sty m:val="bi"/>
-                    </m:rPr>
                     <w:rPr>
                       <w:rFonts w:ascii="Cambria Math" w:hAnsi="Cambria Math"/>
                       <w:sz w:val="24"/>
@@ -3647,9 +3796,6 @@
                 </m:sub>
               </m:sSub>
               <m:r>
-                <m:rPr>
-                  <m:sty m:val="bi"/>
-                </m:rPr>
                 <w:rPr>
                   <w:rFonts w:ascii="Cambria Math" w:hAnsi="Cambria Math"/>
                   <w:sz w:val="24"/>
@@ -3658,9 +3804,6 @@
                 <m:t xml:space="preserve">  = </m:t>
               </m:r>
               <m:r>
-                <m:rPr>
-                  <m:sty m:val="bi"/>
-                </m:rPr>
                 <w:rPr>
                   <w:rFonts w:ascii="Cambria Math" w:eastAsiaTheme="minorEastAsia" w:hAnsi="Cambria Math"/>
                   <w:sz w:val="24"/>
@@ -3747,9 +3890,6 @@
                 </m:sSubPr>
                 <m:e>
                   <m:r>
-                    <m:rPr>
-                      <m:sty m:val="bi"/>
-                    </m:rPr>
                     <w:rPr>
                       <w:rFonts w:ascii="Cambria Math" w:hAnsi="Cambria Math"/>
                       <w:sz w:val="24"/>
@@ -3760,9 +3900,6 @@
                 </m:e>
                 <m:sub>
                   <m:r>
-                    <m:rPr>
-                      <m:sty m:val="bi"/>
-                    </m:rPr>
                     <w:rPr>
                       <w:rFonts w:ascii="Cambria Math" w:hAnsi="Cambria Math"/>
                       <w:sz w:val="24"/>
@@ -3773,9 +3910,6 @@
                 </m:sub>
               </m:sSub>
               <m:r>
-                <m:rPr>
-                  <m:sty m:val="bi"/>
-                </m:rPr>
                 <w:rPr>
                   <w:rFonts w:ascii="Cambria Math" w:hAnsi="Cambria Math"/>
                   <w:sz w:val="24"/>
@@ -3784,9 +3918,6 @@
                 <m:t xml:space="preserve"> </m:t>
               </m:r>
               <m:r>
-                <m:rPr>
-                  <m:sty m:val="bi"/>
-                </m:rPr>
                 <w:rPr>
                   <w:rFonts w:ascii="Cambria Math" w:hAnsi="Cambria Math"/>
                   <w:sz w:val="24"/>
@@ -3796,9 +3927,6 @@
                 <m:t xml:space="preserve">= </m:t>
               </m:r>
               <m:r>
-                <m:rPr>
-                  <m:sty m:val="bi"/>
-                </m:rPr>
                 <w:rPr>
                   <w:rFonts w:ascii="Cambria Math" w:eastAsiaTheme="minorEastAsia" w:hAnsi="Cambria Math"/>
                   <w:sz w:val="24"/>
@@ -3886,9 +4014,6 @@
                 </m:sSubPr>
                 <m:e>
                   <m:r>
-                    <m:rPr>
-                      <m:sty m:val="bi"/>
-                    </m:rPr>
                     <w:rPr>
                       <w:rFonts w:ascii="Cambria Math" w:hAnsi="Cambria Math"/>
                       <w:sz w:val="24"/>
@@ -3899,9 +4024,6 @@
                 </m:e>
                 <m:sub>
                   <m:r>
-                    <m:rPr>
-                      <m:sty m:val="bi"/>
-                    </m:rPr>
                     <w:rPr>
                       <w:rFonts w:ascii="Cambria Math" w:hAnsi="Cambria Math"/>
                       <w:sz w:val="24"/>
@@ -3912,9 +4034,6 @@
                 </m:sub>
               </m:sSub>
               <m:r>
-                <m:rPr>
-                  <m:sty m:val="bi"/>
-                </m:rPr>
                 <w:rPr>
                   <w:rFonts w:ascii="Cambria Math" w:hAnsi="Cambria Math"/>
                   <w:sz w:val="24"/>
@@ -3923,9 +4042,6 @@
                 <m:t xml:space="preserve">= </m:t>
               </m:r>
               <m:r>
-                <m:rPr>
-                  <m:sty m:val="bi"/>
-                </m:rPr>
                 <w:rPr>
                   <w:rFonts w:ascii="Cambria Math" w:eastAsiaTheme="minorEastAsia" w:hAnsi="Cambria Math"/>
                   <w:sz w:val="24"/>
@@ -4015,9 +4131,6 @@
                 </m:sSupPr>
                 <m:e>
                   <m:r>
-                    <m:rPr>
-                      <m:sty m:val="bi"/>
-                    </m:rPr>
                     <w:rPr>
                       <w:rFonts w:ascii="Cambria Math" w:hAnsi="Cambria Math"/>
                       <w:sz w:val="24"/>
@@ -4030,9 +4143,6 @@
                 </m:e>
                 <m:sup>
                   <m:r>
-                    <m:rPr>
-                      <m:sty m:val="bi"/>
-                    </m:rPr>
                     <w:rPr>
                       <w:rFonts w:ascii="Cambria Math" w:hAnsi="Cambria Math"/>
                       <w:sz w:val="24"/>
@@ -4045,9 +4155,6 @@
                 </m:sup>
               </m:sSup>
               <m:r>
-                <m:rPr>
-                  <m:sty m:val="bi"/>
-                </m:rPr>
                 <w:rPr>
                   <w:rFonts w:ascii="Cambria Math" w:hAnsi="Cambria Math"/>
                   <w:sz w:val="24"/>
@@ -4120,9 +4227,6 @@
             </w:pPr>
             <m:oMath>
               <m:r>
-                <m:rPr>
-                  <m:sty m:val="bi"/>
-                </m:rPr>
                 <w:rPr>
                   <w:rFonts w:ascii="Cambria Math" w:hAnsi="Cambria Math"/>
                   <w:sz w:val="24"/>
@@ -4131,9 +4235,6 @@
                 <m:t>S</m:t>
               </m:r>
               <m:r>
-                <m:rPr>
-                  <m:sty m:val="bi"/>
-                </m:rPr>
                 <w:rPr>
                   <w:rFonts w:ascii="Cambria Math" w:hAnsi="Cambria Math"/>
                   <w:sz w:val="24"/>
@@ -4143,9 +4244,6 @@
                 <m:t xml:space="preserve">= </m:t>
               </m:r>
               <m:r>
-                <m:rPr>
-                  <m:sty m:val="bi"/>
-                </m:rPr>
                 <w:rPr>
                   <w:rFonts w:ascii="Cambria Math" w:eastAsiaTheme="minorEastAsia" w:hAnsi="Cambria Math"/>
                   <w:sz w:val="24"/>
@@ -4233,9 +4331,6 @@
                 </m:sSubPr>
                 <m:e>
                   <m:r>
-                    <m:rPr>
-                      <m:sty m:val="bi"/>
-                    </m:rPr>
                     <w:rPr>
                       <w:rFonts w:ascii="Cambria Math" w:hAnsi="Cambria Math"/>
                       <w:sz w:val="24"/>
@@ -4246,9 +4341,6 @@
                 </m:e>
                 <m:sub>
                   <m:r>
-                    <m:rPr>
-                      <m:sty m:val="bi"/>
-                    </m:rPr>
                     <w:rPr>
                       <w:rFonts w:ascii="Cambria Math" w:hAnsi="Cambria Math"/>
                       <w:sz w:val="24"/>
@@ -4259,9 +4351,6 @@
                 </m:sub>
               </m:sSub>
               <m:r>
-                <m:rPr>
-                  <m:sty m:val="bi"/>
-                </m:rPr>
                 <w:rPr>
                   <w:rFonts w:ascii="Cambria Math" w:hAnsi="Cambria Math"/>
                   <w:sz w:val="24"/>
@@ -4270,9 +4359,6 @@
                 <m:t xml:space="preserve"> </m:t>
               </m:r>
               <m:r>
-                <m:rPr>
-                  <m:sty m:val="bi"/>
-                </m:rPr>
                 <w:rPr>
                   <w:rFonts w:ascii="Cambria Math" w:hAnsi="Cambria Math"/>
                   <w:sz w:val="24"/>
@@ -4359,9 +4445,6 @@
                 </m:sSubPr>
                 <m:e>
                   <m:r>
-                    <m:rPr>
-                      <m:sty m:val="bi"/>
-                    </m:rPr>
                     <w:rPr>
                       <w:rFonts w:ascii="Cambria Math" w:hAnsi="Cambria Math"/>
                       <w:sz w:val="24"/>
@@ -4372,9 +4455,6 @@
                 </m:e>
                 <m:sub>
                   <m:r>
-                    <m:rPr>
-                      <m:sty m:val="bi"/>
-                    </m:rPr>
                     <w:rPr>
                       <w:rFonts w:ascii="Cambria Math" w:hAnsi="Cambria Math"/>
                       <w:sz w:val="24"/>
@@ -4383,9 +4463,6 @@
                     <m:t>o</m:t>
                   </m:r>
                   <m:r>
-                    <m:rPr>
-                      <m:sty m:val="bi"/>
-                    </m:rPr>
                     <w:rPr>
                       <w:rFonts w:ascii="Cambria Math" w:hAnsi="Cambria Math"/>
                       <w:sz w:val="24"/>
@@ -4397,9 +4474,6 @@
                 </m:sub>
               </m:sSub>
               <m:r>
-                <m:rPr>
-                  <m:sty m:val="bi"/>
-                </m:rPr>
                 <w:rPr>
                   <w:rFonts w:ascii="Cambria Math" w:hAnsi="Cambria Math"/>
                   <w:sz w:val="24"/>
@@ -4408,9 +4482,6 @@
                 <m:t xml:space="preserve"> </m:t>
               </m:r>
               <m:r>
-                <m:rPr>
-                  <m:sty m:val="bi"/>
-                </m:rPr>
                 <w:rPr>
                   <w:rFonts w:ascii="Cambria Math" w:hAnsi="Cambria Math"/>
                   <w:sz w:val="24"/>
@@ -4420,9 +4491,6 @@
                 <m:t xml:space="preserve">= </m:t>
               </m:r>
               <m:r>
-                <m:rPr>
-                  <m:sty m:val="bi"/>
-                </m:rPr>
                 <w:rPr>
                   <w:rFonts w:ascii="Cambria Math" w:eastAsiaTheme="minorEastAsia" w:hAnsi="Cambria Math"/>
                   <w:sz w:val="24"/>
@@ -4484,16 +4552,8 @@
       <w:pPr>
         <w:pStyle w:val="af5"/>
         <w:jc w:val="both"/>
-        <w:rPr>
-          <w:sz w:val="26"/>
-          <w:szCs w:val="26"/>
-        </w:rPr>
       </w:pPr>
       <w:r>
-        <w:rPr>
-          <w:sz w:val="26"/>
-          <w:szCs w:val="26"/>
-        </w:rPr>
         <w:t>Доверительный интервал для математического ожидания, в предположении, что дисперсия известна:</w:t>
       </w:r>
     </w:p>
@@ -5049,30 +5109,14 @@
       <w:pPr>
         <w:pStyle w:val="af5"/>
         <w:jc w:val="both"/>
-        <w:rPr>
-          <w:sz w:val="26"/>
-          <w:szCs w:val="26"/>
-        </w:rPr>
       </w:pPr>
       <w:r>
-        <w:rPr>
-          <w:sz w:val="26"/>
-          <w:szCs w:val="26"/>
-        </w:rPr>
         <w:t>Доверительный интервал для математического ожидания, в предположении, что дисперсия неизвес</w:t>
       </w:r>
       <w:r>
-        <w:rPr>
-          <w:sz w:val="26"/>
-          <w:szCs w:val="26"/>
-        </w:rPr>
         <w:t>т</w:t>
       </w:r>
       <w:r>
-        <w:rPr>
-          <w:sz w:val="26"/>
-          <w:szCs w:val="26"/>
-        </w:rPr>
         <w:t>на:</w:t>
       </w:r>
     </w:p>
@@ -5377,7 +5421,6 @@
                 <w:sz w:val="24"/>
                 <w:szCs w:val="24"/>
               </w:rPr>
-              <w:lastRenderedPageBreak/>
               <w:t>Доверительный интервал</w:t>
             </w:r>
             <w:r>
@@ -8508,6 +8551,7 @@
           </w:tcPr>
           <w:p>
             <w:pPr>
+              <w:jc w:val="center"/>
               <w:rPr>
                 <w:rFonts w:ascii="Cambria Math" w:hAnsi="Cambria Math"/>
                 <w:iCs/>
@@ -9223,6 +9267,7 @@
           </w:tcPr>
           <w:p>
             <w:pPr>
+              <w:jc w:val="center"/>
               <w:rPr>
                 <w:rFonts w:ascii="Cambria Math" w:hAnsi="Cambria Math"/>
                 <w:iCs/>
@@ -9236,7 +9281,3683 @@
                 <w:sz w:val="24"/>
                 <w:szCs w:val="24"/>
               </w:rPr>
-              <w:t>Гипотеза не отвергается</w:t>
+              <w:t xml:space="preserve">Гипотеза </w:t>
+            </w:r>
+            <w:r>
+              <w:rPr>
+                <w:rFonts w:ascii="Times New Roman" w:hAnsi="Times New Roman" w:cs="Times New Roman"/>
+                <w:sz w:val="24"/>
+                <w:szCs w:val="24"/>
+              </w:rPr>
+              <w:t>принимается</w:t>
+            </w:r>
+          </w:p>
+        </w:tc>
+      </w:tr>
+    </w:tbl>
+    <w:p>
+      <w:pPr>
+        <w:pStyle w:val="23"/>
+        <w:jc w:val="both"/>
+        <w:rPr>
+          <w:sz w:val="26"/>
+          <w:szCs w:val="26"/>
+        </w:rPr>
+      </w:pPr>
+      <w:r>
+        <w:rPr>
+          <w:sz w:val="26"/>
+          <w:szCs w:val="26"/>
+        </w:rPr>
+        <w:lastRenderedPageBreak/>
+        <w:t xml:space="preserve">Таблица </w:t>
+      </w:r>
+      <w:r>
+        <w:rPr>
+          <w:sz w:val="26"/>
+          <w:szCs w:val="26"/>
+        </w:rPr>
+        <w:t>3</w:t>
+      </w:r>
+      <w:r>
+        <w:rPr>
+          <w:sz w:val="26"/>
+          <w:szCs w:val="26"/>
+        </w:rPr>
+        <w:t xml:space="preserve">. Проверка статистической гипотезы с помощью критерия </w:t>
+      </w:r>
+      <w:r>
+        <w:rPr>
+          <w:sz w:val="26"/>
+          <w:szCs w:val="26"/>
+        </w:rPr>
+        <w:t>Колмогорова</w:t>
+      </w:r>
+    </w:p>
+    <w:tbl>
+      <w:tblPr>
+        <w:tblStyle w:val="af3"/>
+        <w:tblW w:w="10490" w:type="dxa"/>
+        <w:tblInd w:w="-289" w:type="dxa"/>
+        <w:tblLayout w:type="fixed"/>
+        <w:tblLook w:val="04A0" w:firstRow="1" w:lastRow="0" w:firstColumn="1" w:lastColumn="0" w:noHBand="0" w:noVBand="1"/>
+      </w:tblPr>
+      <w:tblGrid>
+        <w:gridCol w:w="426"/>
+        <w:gridCol w:w="1134"/>
+        <w:gridCol w:w="709"/>
+        <w:gridCol w:w="992"/>
+        <w:gridCol w:w="1134"/>
+        <w:gridCol w:w="1559"/>
+        <w:gridCol w:w="2127"/>
+        <w:gridCol w:w="2409"/>
+      </w:tblGrid>
+      <w:tr>
+        <w:trPr>
+          <w:trHeight w:val="685"/>
+        </w:trPr>
+        <w:tc>
+          <w:tcPr>
+            <w:tcW w:w="426" w:type="dxa"/>
+          </w:tcPr>
+          <w:p>
+            <w:pPr>
+              <w:pStyle w:val="23"/>
+              <w:rPr>
+                <w:b w:val="0"/>
+                <w:bCs w:val="0"/>
+                <w:i w:val="0"/>
+                <w:iCs w:val="0"/>
+                <w:sz w:val="20"/>
+                <w:szCs w:val="20"/>
+              </w:rPr>
+            </w:pPr>
+            <w:r>
+              <w:rPr>
+                <w:b w:val="0"/>
+                <w:bCs w:val="0"/>
+                <w:i w:val="0"/>
+                <w:iCs w:val="0"/>
+                <w:sz w:val="20"/>
+                <w:szCs w:val="20"/>
+              </w:rPr>
+              <w:t>№</w:t>
+            </w:r>
+          </w:p>
+        </w:tc>
+        <w:tc>
+          <w:tcPr>
+            <w:tcW w:w="1134" w:type="dxa"/>
+          </w:tcPr>
+          <w:p>
+            <w:pPr>
+              <w:pStyle w:val="23"/>
+              <w:rPr>
+                <w:b w:val="0"/>
+                <w:bCs w:val="0"/>
+                <w:i w:val="0"/>
+                <w:iCs w:val="0"/>
+                <w:sz w:val="20"/>
+                <w:szCs w:val="20"/>
+              </w:rPr>
+            </w:pPr>
+            <m:oMathPara>
+              <m:oMath>
+                <m:sSubSup>
+                  <m:sSubSupPr>
+                    <m:ctrlPr>
+                      <w:rPr>
+                        <w:rFonts w:ascii="Cambria Math" w:hAnsi="Cambria Math"/>
+                        <w:b w:val="0"/>
+                        <w:bCs w:val="0"/>
+                        <w:i w:val="0"/>
+                        <w:iCs w:val="0"/>
+                        <w:sz w:val="24"/>
+                        <w:szCs w:val="24"/>
+                      </w:rPr>
+                    </m:ctrlPr>
+                  </m:sSubSupPr>
+                  <m:e>
+                    <m:r>
+                      <m:rPr>
+                        <m:sty m:val="p"/>
+                      </m:rPr>
+                      <w:rPr>
+                        <w:rFonts w:ascii="Cambria Math" w:hAnsi="Cambria Math"/>
+                        <w:sz w:val="24"/>
+                        <w:szCs w:val="24"/>
+                      </w:rPr>
+                      <m:t>x</m:t>
+                    </m:r>
+                  </m:e>
+                  <m:sub>
+                    <m:r>
+                      <m:rPr>
+                        <m:sty m:val="p"/>
+                      </m:rPr>
+                      <w:rPr>
+                        <w:rFonts w:ascii="Cambria Math" w:hAnsi="Cambria Math"/>
+                        <w:sz w:val="24"/>
+                        <w:szCs w:val="24"/>
+                      </w:rPr>
+                      <m:t>i</m:t>
+                    </m:r>
+                  </m:sub>
+                  <m:sup>
+                    <m:r>
+                      <m:rPr>
+                        <m:sty m:val="p"/>
+                      </m:rPr>
+                      <w:rPr>
+                        <w:rFonts w:ascii="Cambria Math" w:hAnsi="Cambria Math"/>
+                        <w:sz w:val="24"/>
+                        <w:szCs w:val="24"/>
+                      </w:rPr>
+                      <m:t>^</m:t>
+                    </m:r>
+                  </m:sup>
+                </m:sSubSup>
+              </m:oMath>
+            </m:oMathPara>
+          </w:p>
+        </w:tc>
+        <w:tc>
+          <w:tcPr>
+            <w:tcW w:w="709" w:type="dxa"/>
+          </w:tcPr>
+          <w:p>
+            <w:pPr>
+              <w:pStyle w:val="23"/>
+              <w:rPr>
+                <w:b w:val="0"/>
+                <w:bCs w:val="0"/>
+                <w:i w:val="0"/>
+                <w:iCs w:val="0"/>
+                <w:sz w:val="20"/>
+                <w:szCs w:val="20"/>
+              </w:rPr>
+            </w:pPr>
+            <m:oMathPara>
+              <m:oMath>
+                <m:sSub>
+                  <m:sSubPr>
+                    <m:ctrlPr>
+                      <w:rPr>
+                        <w:rFonts w:ascii="Cambria Math" w:hAnsi="Cambria Math"/>
+                        <w:b w:val="0"/>
+                        <w:bCs w:val="0"/>
+                        <w:i w:val="0"/>
+                        <w:iCs w:val="0"/>
+                        <w:sz w:val="20"/>
+                        <w:szCs w:val="20"/>
+                      </w:rPr>
+                    </m:ctrlPr>
+                  </m:sSubPr>
+                  <m:e>
+                    <m:r>
+                      <m:rPr>
+                        <m:sty m:val="p"/>
+                      </m:rPr>
+                      <w:rPr>
+                        <w:rFonts w:ascii="Cambria Math" w:hAnsi="Cambria Math"/>
+                        <w:sz w:val="20"/>
+                        <w:szCs w:val="20"/>
+                      </w:rPr>
+                      <m:t>n</m:t>
+                    </m:r>
+                  </m:e>
+                  <m:sub>
+                    <m:r>
+                      <m:rPr>
+                        <m:sty m:val="p"/>
+                      </m:rPr>
+                      <w:rPr>
+                        <w:rFonts w:ascii="Cambria Math" w:hAnsi="Cambria Math"/>
+                        <w:sz w:val="20"/>
+                        <w:szCs w:val="20"/>
+                      </w:rPr>
+                      <m:t>i</m:t>
+                    </m:r>
+                  </m:sub>
+                </m:sSub>
+              </m:oMath>
+            </m:oMathPara>
+          </w:p>
+        </w:tc>
+        <w:tc>
+          <w:tcPr>
+            <w:tcW w:w="992" w:type="dxa"/>
+          </w:tcPr>
+          <w:p>
+            <w:pPr>
+              <w:pStyle w:val="23"/>
+              <w:rPr>
+                <w:b w:val="0"/>
+                <w:bCs w:val="0"/>
+                <w:i w:val="0"/>
+                <w:iCs w:val="0"/>
+                <w:sz w:val="20"/>
+                <w:szCs w:val="20"/>
+                <w:lang w:val="en-US"/>
+              </w:rPr>
+            </w:pPr>
+            <m:oMathPara>
+              <m:oMath>
+                <m:sSub>
+                  <m:sSubPr>
+                    <m:ctrlPr>
+                      <w:rPr>
+                        <w:rFonts w:ascii="Cambria Math" w:hAnsi="Cambria Math"/>
+                        <w:b w:val="0"/>
+                        <w:bCs w:val="0"/>
+                        <w:i w:val="0"/>
+                        <w:iCs w:val="0"/>
+                        <w:sz w:val="20"/>
+                        <w:szCs w:val="20"/>
+                        <w:lang w:val="en-US"/>
+                      </w:rPr>
+                    </m:ctrlPr>
+                  </m:sSubPr>
+                  <m:e>
+                    <m:r>
+                      <m:rPr>
+                        <m:sty m:val="p"/>
+                      </m:rPr>
+                      <w:rPr>
+                        <w:rFonts w:ascii="Cambria Math" w:hAnsi="Cambria Math"/>
+                        <w:sz w:val="20"/>
+                        <w:szCs w:val="20"/>
+                        <w:lang w:val="en-US"/>
+                      </w:rPr>
+                      <m:t>p</m:t>
+                    </m:r>
+                  </m:e>
+                  <m:sub>
+                    <m:r>
+                      <m:rPr>
+                        <m:sty m:val="p"/>
+                      </m:rPr>
+                      <w:rPr>
+                        <w:rFonts w:ascii="Cambria Math" w:hAnsi="Cambria Math"/>
+                        <w:sz w:val="20"/>
+                        <w:szCs w:val="20"/>
+                        <w:lang w:val="en-US"/>
+                      </w:rPr>
+                      <m:t>i</m:t>
+                    </m:r>
+                  </m:sub>
+                </m:sSub>
+              </m:oMath>
+            </m:oMathPara>
+          </w:p>
+        </w:tc>
+        <w:tc>
+          <w:tcPr>
+            <w:tcW w:w="1134" w:type="dxa"/>
+          </w:tcPr>
+          <w:p>
+            <w:pPr>
+              <w:pStyle w:val="23"/>
+              <w:rPr>
+                <w:b w:val="0"/>
+                <w:bCs w:val="0"/>
+                <w:i w:val="0"/>
+                <w:iCs w:val="0"/>
+                <w:sz w:val="20"/>
+                <w:szCs w:val="20"/>
+                <w:lang w:val="en-US"/>
+              </w:rPr>
+            </w:pPr>
+            <m:oMathPara>
+              <m:oMath>
+                <m:sSubSup>
+                  <m:sSubSupPr>
+                    <m:ctrlPr>
+                      <w:rPr>
+                        <w:rFonts w:ascii="Cambria Math" w:hAnsi="Cambria Math"/>
+                        <w:b w:val="0"/>
+                        <w:bCs w:val="0"/>
+                        <w:i w:val="0"/>
+                        <w:iCs w:val="0"/>
+                        <w:sz w:val="20"/>
+                        <w:szCs w:val="20"/>
+                        <w:lang w:val="en-US"/>
+                      </w:rPr>
+                    </m:ctrlPr>
+                  </m:sSubSupPr>
+                  <m:e>
+                    <m:r>
+                      <m:rPr>
+                        <m:sty m:val="p"/>
+                      </m:rPr>
+                      <w:rPr>
+                        <w:rFonts w:ascii="Cambria Math" w:hAnsi="Cambria Math"/>
+                        <w:sz w:val="20"/>
+                        <w:szCs w:val="20"/>
+                        <w:lang w:val="en-US"/>
+                      </w:rPr>
+                      <m:t>F</m:t>
+                    </m:r>
+                  </m:e>
+                  <m:sub>
+                    <m:r>
+                      <m:rPr>
+                        <m:sty m:val="p"/>
+                      </m:rPr>
+                      <w:rPr>
+                        <w:rFonts w:ascii="Cambria Math" w:hAnsi="Cambria Math"/>
+                        <w:sz w:val="20"/>
+                        <w:szCs w:val="20"/>
+                        <w:lang w:val="en-US"/>
+                      </w:rPr>
+                      <m:t>n</m:t>
+                    </m:r>
+                  </m:sub>
+                  <m:sup>
+                    <m:r>
+                      <m:rPr>
+                        <m:sty m:val="p"/>
+                      </m:rPr>
+                      <w:rPr>
+                        <w:rFonts w:ascii="Cambria Math" w:hAnsi="Cambria Math"/>
+                        <w:sz w:val="20"/>
+                        <w:szCs w:val="20"/>
+                        <w:lang w:val="en-US"/>
+                      </w:rPr>
+                      <m:t>*</m:t>
+                    </m:r>
+                  </m:sup>
+                </m:sSubSup>
+                <m:sSubSup>
+                  <m:sSubSupPr>
+                    <m:ctrlPr>
+                      <w:rPr>
+                        <w:rFonts w:ascii="Cambria Math" w:hAnsi="Cambria Math"/>
+                        <w:b w:val="0"/>
+                        <w:bCs w:val="0"/>
+                        <w:i w:val="0"/>
+                        <w:iCs w:val="0"/>
+                        <w:sz w:val="24"/>
+                        <w:szCs w:val="24"/>
+                      </w:rPr>
+                    </m:ctrlPr>
+                  </m:sSubSupPr>
+                  <m:e>
+                    <m:r>
+                      <m:rPr>
+                        <m:sty m:val="p"/>
+                      </m:rPr>
+                      <w:rPr>
+                        <w:rFonts w:ascii="Cambria Math" w:hAnsi="Cambria Math"/>
+                        <w:sz w:val="24"/>
+                        <w:szCs w:val="24"/>
+                      </w:rPr>
+                      <m:t>(</m:t>
+                    </m:r>
+                    <m:r>
+                      <m:rPr>
+                        <m:sty m:val="p"/>
+                      </m:rPr>
+                      <w:rPr>
+                        <w:rFonts w:ascii="Cambria Math" w:hAnsi="Cambria Math"/>
+                        <w:sz w:val="24"/>
+                        <w:szCs w:val="24"/>
+                      </w:rPr>
+                      <m:t>x</m:t>
+                    </m:r>
+                  </m:e>
+                  <m:sub>
+                    <m:r>
+                      <m:rPr>
+                        <m:sty m:val="p"/>
+                      </m:rPr>
+                      <w:rPr>
+                        <w:rFonts w:ascii="Cambria Math" w:hAnsi="Cambria Math"/>
+                        <w:sz w:val="24"/>
+                        <w:szCs w:val="24"/>
+                      </w:rPr>
+                      <m:t>i</m:t>
+                    </m:r>
+                  </m:sub>
+                  <m:sup>
+                    <m:r>
+                      <m:rPr>
+                        <m:sty m:val="p"/>
+                      </m:rPr>
+                      <w:rPr>
+                        <w:rFonts w:ascii="Cambria Math" w:hAnsi="Cambria Math"/>
+                        <w:sz w:val="24"/>
+                        <w:szCs w:val="24"/>
+                      </w:rPr>
+                      <m:t>^</m:t>
+                    </m:r>
+                  </m:sup>
+                </m:sSubSup>
+                <m:r>
+                  <m:rPr>
+                    <m:sty m:val="p"/>
+                  </m:rPr>
+                  <w:rPr>
+                    <w:rFonts w:ascii="Cambria Math" w:hAnsi="Cambria Math"/>
+                    <w:sz w:val="24"/>
+                    <w:szCs w:val="24"/>
+                  </w:rPr>
+                  <m:t>)</m:t>
+                </m:r>
+              </m:oMath>
+            </m:oMathPara>
+          </w:p>
+        </w:tc>
+        <w:tc>
+          <w:tcPr>
+            <w:tcW w:w="1559" w:type="dxa"/>
+          </w:tcPr>
+          <w:p>
+            <w:pPr>
+              <w:pStyle w:val="23"/>
+              <w:rPr>
+                <w:b w:val="0"/>
+                <w:bCs w:val="0"/>
+                <w:i w:val="0"/>
+                <w:iCs w:val="0"/>
+                <w:sz w:val="20"/>
+                <w:szCs w:val="20"/>
+                <w:lang w:val="en-US"/>
+              </w:rPr>
+            </w:pPr>
+            <m:oMathPara>
+              <m:oMath>
+                <m:sSub>
+                  <m:sSubPr>
+                    <m:ctrlPr>
+                      <w:rPr>
+                        <w:rFonts w:ascii="Cambria Math" w:hAnsi="Cambria Math"/>
+                        <w:b w:val="0"/>
+                        <w:bCs w:val="0"/>
+                        <w:i w:val="0"/>
+                        <w:iCs w:val="0"/>
+                        <w:sz w:val="20"/>
+                        <w:szCs w:val="20"/>
+                      </w:rPr>
+                    </m:ctrlPr>
+                  </m:sSubPr>
+                  <m:e>
+                    <m:r>
+                      <m:rPr>
+                        <m:sty m:val="p"/>
+                      </m:rPr>
+                      <w:rPr>
+                        <w:rFonts w:ascii="Cambria Math" w:hAnsi="Cambria Math"/>
+                        <w:sz w:val="20"/>
+                        <w:szCs w:val="20"/>
+                      </w:rPr>
+                      <m:t>u</m:t>
+                    </m:r>
+                  </m:e>
+                  <m:sub>
+                    <m:r>
+                      <m:rPr>
+                        <m:sty m:val="p"/>
+                      </m:rPr>
+                      <w:rPr>
+                        <w:rFonts w:ascii="Cambria Math" w:hAnsi="Cambria Math"/>
+                        <w:sz w:val="20"/>
+                        <w:szCs w:val="20"/>
+                      </w:rPr>
+                      <m:t>i</m:t>
+                    </m:r>
+                  </m:sub>
+                </m:sSub>
+                <m:r>
+                  <m:rPr>
+                    <m:sty m:val="p"/>
+                  </m:rPr>
+                  <w:rPr>
+                    <w:rFonts w:ascii="Cambria Math" w:hAnsi="Cambria Math"/>
+                    <w:sz w:val="20"/>
+                    <w:szCs w:val="20"/>
+                    <w:lang w:val="en-US"/>
+                  </w:rPr>
+                  <m:t xml:space="preserve">= </m:t>
+                </m:r>
+                <m:f>
+                  <m:fPr>
+                    <m:ctrlPr>
+                      <w:rPr>
+                        <w:rFonts w:ascii="Cambria Math" w:hAnsi="Cambria Math"/>
+                        <w:b w:val="0"/>
+                        <w:bCs w:val="0"/>
+                        <w:i w:val="0"/>
+                        <w:iCs w:val="0"/>
+                        <w:sz w:val="20"/>
+                        <w:szCs w:val="20"/>
+                        <w:lang w:val="en-US"/>
+                      </w:rPr>
+                    </m:ctrlPr>
+                  </m:fPr>
+                  <m:num>
+                    <m:sSubSup>
+                      <m:sSubSupPr>
+                        <m:ctrlPr>
+                          <w:rPr>
+                            <w:rFonts w:ascii="Cambria Math" w:hAnsi="Cambria Math"/>
+                            <w:b w:val="0"/>
+                            <w:bCs w:val="0"/>
+                            <w:i w:val="0"/>
+                            <w:iCs w:val="0"/>
+                            <w:sz w:val="24"/>
+                            <w:szCs w:val="24"/>
+                          </w:rPr>
+                        </m:ctrlPr>
+                      </m:sSubSupPr>
+                      <m:e>
+                        <m:r>
+                          <m:rPr>
+                            <m:sty m:val="p"/>
+                          </m:rPr>
+                          <w:rPr>
+                            <w:rFonts w:ascii="Cambria Math" w:hAnsi="Cambria Math"/>
+                            <w:sz w:val="24"/>
+                            <w:szCs w:val="24"/>
+                          </w:rPr>
+                          <m:t>x</m:t>
+                        </m:r>
+                      </m:e>
+                      <m:sub>
+                        <m:r>
+                          <m:rPr>
+                            <m:sty m:val="p"/>
+                          </m:rPr>
+                          <w:rPr>
+                            <w:rFonts w:ascii="Cambria Math" w:hAnsi="Cambria Math"/>
+                            <w:sz w:val="24"/>
+                            <w:szCs w:val="24"/>
+                          </w:rPr>
+                          <m:t>i</m:t>
+                        </m:r>
+                      </m:sub>
+                      <m:sup>
+                        <m:r>
+                          <m:rPr>
+                            <m:sty m:val="p"/>
+                          </m:rPr>
+                          <w:rPr>
+                            <w:rFonts w:ascii="Cambria Math" w:hAnsi="Cambria Math"/>
+                            <w:sz w:val="24"/>
+                            <w:szCs w:val="24"/>
+                          </w:rPr>
+                          <m:t>^</m:t>
+                        </m:r>
+                      </m:sup>
+                    </m:sSubSup>
+                    <m:r>
+                      <m:rPr>
+                        <m:sty m:val="p"/>
+                      </m:rPr>
+                      <w:rPr>
+                        <w:rFonts w:ascii="Cambria Math" w:hAnsi="Cambria Math"/>
+                        <w:sz w:val="20"/>
+                        <w:szCs w:val="20"/>
+                        <w:lang w:val="en-US"/>
+                      </w:rPr>
+                      <m:t xml:space="preserve">- </m:t>
+                    </m:r>
+                    <m:sSubSup>
+                      <m:sSubSupPr>
+                        <m:ctrlPr>
+                          <w:rPr>
+                            <w:rFonts w:ascii="Cambria Math" w:hAnsi="Cambria Math"/>
+                            <w:b w:val="0"/>
+                            <w:bCs w:val="0"/>
+                            <w:i w:val="0"/>
+                            <w:iCs w:val="0"/>
+                            <w:sz w:val="20"/>
+                            <w:szCs w:val="20"/>
+                            <w:lang w:val="en-US"/>
+                          </w:rPr>
+                        </m:ctrlPr>
+                      </m:sSubSupPr>
+                      <m:e>
+                        <m:r>
+                          <m:rPr>
+                            <m:sty m:val="p"/>
+                          </m:rPr>
+                          <w:rPr>
+                            <w:rFonts w:ascii="Cambria Math" w:hAnsi="Cambria Math"/>
+                            <w:sz w:val="20"/>
+                            <w:szCs w:val="20"/>
+                            <w:lang w:val="en-US"/>
+                          </w:rPr>
+                          <m:t>X</m:t>
+                        </m:r>
+                      </m:e>
+                      <m:sub>
+                        <m:r>
+                          <m:rPr>
+                            <m:sty m:val="p"/>
+                          </m:rPr>
+                          <w:rPr>
+                            <w:rFonts w:ascii="Cambria Math" w:hAnsi="Cambria Math"/>
+                            <w:sz w:val="20"/>
+                            <w:szCs w:val="20"/>
+                            <w:lang w:val="en-US"/>
+                          </w:rPr>
+                          <m:t>β</m:t>
+                        </m:r>
+                      </m:sub>
+                      <m:sup>
+                        <m:r>
+                          <m:rPr>
+                            <m:sty m:val="p"/>
+                          </m:rPr>
+                          <w:rPr>
+                            <w:rFonts w:ascii="Cambria Math" w:hAnsi="Cambria Math"/>
+                            <w:sz w:val="20"/>
+                            <w:szCs w:val="20"/>
+                            <w:lang w:val="en-US"/>
+                          </w:rPr>
+                          <m:t>^</m:t>
+                        </m:r>
+                      </m:sup>
+                    </m:sSubSup>
+                  </m:num>
+                  <m:den>
+                    <m:r>
+                      <m:rPr>
+                        <m:sty m:val="p"/>
+                      </m:rPr>
+                      <w:rPr>
+                        <w:rFonts w:ascii="Cambria Math" w:hAnsi="Cambria Math"/>
+                        <w:sz w:val="20"/>
+                        <w:szCs w:val="20"/>
+                        <w:lang w:val="en-US"/>
+                      </w:rPr>
+                      <m:t>S</m:t>
+                    </m:r>
+                  </m:den>
+                </m:f>
+              </m:oMath>
+            </m:oMathPara>
+          </w:p>
+        </w:tc>
+        <w:tc>
+          <w:tcPr>
+            <w:tcW w:w="2127" w:type="dxa"/>
+          </w:tcPr>
+          <w:p>
+            <w:pPr>
+              <w:pStyle w:val="23"/>
+              <w:rPr>
+                <w:b w:val="0"/>
+                <w:bCs w:val="0"/>
+                <w:i w:val="0"/>
+                <w:iCs w:val="0"/>
+                <w:sz w:val="20"/>
+                <w:szCs w:val="20"/>
+              </w:rPr>
+            </w:pPr>
+            <m:oMathPara>
+              <m:oMath>
+                <m:sSub>
+                  <m:sSubPr>
+                    <m:ctrlPr>
+                      <w:rPr>
+                        <w:rFonts w:ascii="Cambria Math" w:hAnsi="Cambria Math"/>
+                        <w:b w:val="0"/>
+                        <w:bCs w:val="0"/>
+                        <w:i w:val="0"/>
+                        <w:iCs w:val="0"/>
+                        <w:sz w:val="20"/>
+                        <w:szCs w:val="20"/>
+                      </w:rPr>
+                    </m:ctrlPr>
+                  </m:sSubPr>
+                  <m:e>
+                    <m:r>
+                      <m:rPr>
+                        <m:sty m:val="p"/>
+                      </m:rPr>
+                      <w:rPr>
+                        <w:rFonts w:ascii="Cambria Math" w:hAnsi="Cambria Math"/>
+                        <w:sz w:val="20"/>
+                        <w:szCs w:val="20"/>
+                      </w:rPr>
+                      <m:t>F</m:t>
+                    </m:r>
+                  </m:e>
+                  <m:sub>
+                    <m:r>
+                      <m:rPr>
+                        <m:sty m:val="p"/>
+                      </m:rPr>
+                      <w:rPr>
+                        <w:rFonts w:ascii="Cambria Math" w:hAnsi="Cambria Math"/>
+                        <w:sz w:val="20"/>
+                        <w:szCs w:val="20"/>
+                      </w:rPr>
+                      <m:t>T</m:t>
+                    </m:r>
+                  </m:sub>
+                </m:sSub>
+                <m:d>
+                  <m:dPr>
+                    <m:ctrlPr>
+                      <w:rPr>
+                        <w:rFonts w:ascii="Cambria Math" w:hAnsi="Cambria Math"/>
+                        <w:b w:val="0"/>
+                        <w:bCs w:val="0"/>
+                        <w:i w:val="0"/>
+                        <w:iCs w:val="0"/>
+                        <w:sz w:val="20"/>
+                        <w:szCs w:val="20"/>
+                      </w:rPr>
+                    </m:ctrlPr>
+                  </m:dPr>
+                  <m:e>
+                    <m:sSub>
+                      <m:sSubPr>
+                        <m:ctrlPr>
+                          <w:rPr>
+                            <w:rFonts w:ascii="Cambria Math" w:hAnsi="Cambria Math"/>
+                            <w:b w:val="0"/>
+                            <w:bCs w:val="0"/>
+                            <w:i w:val="0"/>
+                            <w:iCs w:val="0"/>
+                            <w:sz w:val="20"/>
+                            <w:szCs w:val="20"/>
+                          </w:rPr>
+                        </m:ctrlPr>
+                      </m:sSubPr>
+                      <m:e>
+                        <m:r>
+                          <m:rPr>
+                            <m:sty m:val="p"/>
+                          </m:rPr>
+                          <w:rPr>
+                            <w:rFonts w:ascii="Cambria Math" w:hAnsi="Cambria Math"/>
+                            <w:sz w:val="20"/>
+                            <w:szCs w:val="20"/>
+                          </w:rPr>
+                          <m:t>u</m:t>
+                        </m:r>
+                      </m:e>
+                      <m:sub>
+                        <m:r>
+                          <m:rPr>
+                            <m:sty m:val="p"/>
+                          </m:rPr>
+                          <w:rPr>
+                            <w:rFonts w:ascii="Cambria Math" w:hAnsi="Cambria Math"/>
+                            <w:sz w:val="20"/>
+                            <w:szCs w:val="20"/>
+                          </w:rPr>
+                          <m:t>i</m:t>
+                        </m:r>
+                      </m:sub>
+                    </m:sSub>
+                  </m:e>
+                </m:d>
+                <m:r>
+                  <m:rPr>
+                    <m:sty m:val="p"/>
+                  </m:rPr>
+                  <w:rPr>
+                    <w:rFonts w:ascii="Cambria Math" w:hAnsi="Cambria Math"/>
+                    <w:sz w:val="20"/>
+                    <w:szCs w:val="20"/>
+                  </w:rPr>
+                  <m:t>=</m:t>
+                </m:r>
+                <m:r>
+                  <m:rPr>
+                    <m:sty m:val="p"/>
+                  </m:rPr>
+                  <w:rPr>
+                    <w:rFonts w:ascii="Cambria Math" w:hAnsi="Cambria Math"/>
+                    <w:sz w:val="20"/>
+                    <w:szCs w:val="20"/>
+                    <w:lang w:val="en-US"/>
+                  </w:rPr>
+                  <m:t xml:space="preserve"> </m:t>
+                </m:r>
+                <m:f>
+                  <m:fPr>
+                    <m:ctrlPr>
+                      <w:rPr>
+                        <w:rFonts w:ascii="Cambria Math" w:hAnsi="Cambria Math"/>
+                        <w:b w:val="0"/>
+                        <w:bCs w:val="0"/>
+                        <w:i w:val="0"/>
+                        <w:iCs w:val="0"/>
+                        <w:sz w:val="20"/>
+                        <w:szCs w:val="20"/>
+                        <w:lang w:val="en-US"/>
+                      </w:rPr>
+                    </m:ctrlPr>
+                  </m:fPr>
+                  <m:num>
+                    <m:r>
+                      <m:rPr>
+                        <m:sty m:val="p"/>
+                      </m:rPr>
+                      <w:rPr>
+                        <w:rFonts w:ascii="Cambria Math" w:hAnsi="Cambria Math"/>
+                        <w:sz w:val="20"/>
+                        <w:szCs w:val="20"/>
+                        <w:lang w:val="en-US"/>
+                      </w:rPr>
+                      <m:t>1</m:t>
+                    </m:r>
+                  </m:num>
+                  <m:den>
+                    <m:r>
+                      <m:rPr>
+                        <m:sty m:val="p"/>
+                      </m:rPr>
+                      <w:rPr>
+                        <w:rFonts w:ascii="Cambria Math" w:hAnsi="Cambria Math"/>
+                        <w:sz w:val="20"/>
+                        <w:szCs w:val="20"/>
+                        <w:lang w:val="en-US"/>
+                      </w:rPr>
+                      <m:t>2</m:t>
+                    </m:r>
+                  </m:den>
+                </m:f>
+                <m:r>
+                  <m:rPr>
+                    <m:sty m:val="p"/>
+                  </m:rPr>
+                  <w:rPr>
+                    <w:rFonts w:ascii="Cambria Math" w:hAnsi="Cambria Math"/>
+                    <w:sz w:val="20"/>
+                    <w:szCs w:val="20"/>
+                    <w:lang w:val="en-US"/>
+                  </w:rPr>
+                  <m:t xml:space="preserve">+ </m:t>
+                </m:r>
+                <m:r>
+                  <m:rPr>
+                    <m:sty m:val="p"/>
+                  </m:rPr>
+                  <w:rPr>
+                    <w:rFonts w:ascii="Cambria Math" w:hAnsi="Cambria Math"/>
+                    <w:sz w:val="20"/>
+                    <w:szCs w:val="20"/>
+                  </w:rPr>
+                  <m:t>Ф(</m:t>
+                </m:r>
+                <m:sSub>
+                  <m:sSubPr>
+                    <m:ctrlPr>
+                      <w:rPr>
+                        <w:rFonts w:ascii="Cambria Math" w:hAnsi="Cambria Math"/>
+                        <w:b w:val="0"/>
+                        <w:bCs w:val="0"/>
+                        <w:i w:val="0"/>
+                        <w:iCs w:val="0"/>
+                        <w:sz w:val="20"/>
+                        <w:szCs w:val="20"/>
+                        <w:lang w:val="en-US"/>
+                      </w:rPr>
+                    </m:ctrlPr>
+                  </m:sSubPr>
+                  <m:e>
+                    <m:r>
+                      <m:rPr>
+                        <m:sty m:val="p"/>
+                      </m:rPr>
+                      <w:rPr>
+                        <w:rFonts w:ascii="Cambria Math" w:hAnsi="Cambria Math"/>
+                        <w:sz w:val="20"/>
+                        <w:szCs w:val="20"/>
+                        <w:lang w:val="en-US"/>
+                      </w:rPr>
+                      <m:t>u</m:t>
+                    </m:r>
+                  </m:e>
+                  <m:sub>
+                    <m:r>
+                      <m:rPr>
+                        <m:sty m:val="p"/>
+                      </m:rPr>
+                      <w:rPr>
+                        <w:rFonts w:ascii="Cambria Math" w:hAnsi="Cambria Math"/>
+                        <w:sz w:val="20"/>
+                        <w:szCs w:val="20"/>
+                        <w:lang w:val="en-US"/>
+                      </w:rPr>
+                      <m:t>i</m:t>
+                    </m:r>
+                  </m:sub>
+                </m:sSub>
+                <m:r>
+                  <m:rPr>
+                    <m:sty m:val="p"/>
+                  </m:rPr>
+                  <w:rPr>
+                    <w:rFonts w:ascii="Cambria Math" w:hAnsi="Cambria Math"/>
+                    <w:sz w:val="20"/>
+                    <w:szCs w:val="20"/>
+                    <w:lang w:val="en-US"/>
+                  </w:rPr>
+                  <m:t>)</m:t>
+                </m:r>
+              </m:oMath>
+            </m:oMathPara>
+          </w:p>
+        </w:tc>
+        <w:tc>
+          <w:tcPr>
+            <w:tcW w:w="2409" w:type="dxa"/>
+          </w:tcPr>
+          <w:p>
+            <w:pPr>
+              <w:pStyle w:val="23"/>
+              <w:rPr>
+                <w:b w:val="0"/>
+                <w:bCs w:val="0"/>
+                <w:i w:val="0"/>
+                <w:iCs w:val="0"/>
+                <w:sz w:val="20"/>
+                <w:szCs w:val="20"/>
+                <w:lang w:val="en-US"/>
+              </w:rPr>
+            </w:pPr>
+            <m:oMathPara>
+              <m:oMath>
+                <m:sSub>
+                  <m:sSubPr>
+                    <m:ctrlPr>
+                      <w:rPr>
+                        <w:rFonts w:ascii="Cambria Math" w:hAnsi="Cambria Math"/>
+                        <w:b w:val="0"/>
+                        <w:bCs w:val="0"/>
+                        <w:i w:val="0"/>
+                        <w:iCs w:val="0"/>
+                        <w:sz w:val="20"/>
+                        <w:szCs w:val="20"/>
+                      </w:rPr>
+                    </m:ctrlPr>
+                  </m:sSubPr>
+                  <m:e>
+                    <m:r>
+                      <m:rPr>
+                        <m:sty m:val="p"/>
+                      </m:rPr>
+                      <w:rPr>
+                        <w:rFonts w:ascii="Cambria Math" w:hAnsi="Cambria Math"/>
+                        <w:sz w:val="20"/>
+                        <w:szCs w:val="20"/>
+                      </w:rPr>
+                      <m:t>∆</m:t>
+                    </m:r>
+                  </m:e>
+                  <m:sub>
+                    <m:r>
+                      <m:rPr>
+                        <m:sty m:val="p"/>
+                      </m:rPr>
+                      <w:rPr>
+                        <w:rFonts w:ascii="Cambria Math" w:hAnsi="Cambria Math"/>
+                        <w:sz w:val="20"/>
+                        <w:szCs w:val="20"/>
+                      </w:rPr>
+                      <m:t>x</m:t>
+                    </m:r>
+                  </m:sub>
+                </m:sSub>
+                <m:r>
+                  <m:rPr>
+                    <m:sty m:val="p"/>
+                  </m:rPr>
+                  <w:rPr>
+                    <w:rFonts w:ascii="Cambria Math" w:hAnsi="Cambria Math"/>
+                    <w:sz w:val="20"/>
+                    <w:szCs w:val="20"/>
+                    <w:lang w:val="en-US"/>
+                  </w:rPr>
+                  <m:t xml:space="preserve">=| </m:t>
+                </m:r>
+                <m:sSubSup>
+                  <m:sSubSupPr>
+                    <m:ctrlPr>
+                      <w:rPr>
+                        <w:rFonts w:ascii="Cambria Math" w:hAnsi="Cambria Math"/>
+                        <w:b w:val="0"/>
+                        <w:bCs w:val="0"/>
+                        <w:i w:val="0"/>
+                        <w:iCs w:val="0"/>
+                        <w:sz w:val="20"/>
+                        <w:szCs w:val="20"/>
+                        <w:lang w:val="en-US"/>
+                      </w:rPr>
+                    </m:ctrlPr>
+                  </m:sSubSupPr>
+                  <m:e>
+                    <m:r>
+                      <m:rPr>
+                        <m:sty m:val="p"/>
+                      </m:rPr>
+                      <w:rPr>
+                        <w:rFonts w:ascii="Cambria Math" w:hAnsi="Cambria Math"/>
+                        <w:sz w:val="20"/>
+                        <w:szCs w:val="20"/>
+                        <w:lang w:val="en-US"/>
+                      </w:rPr>
+                      <m:t>F</m:t>
+                    </m:r>
+                  </m:e>
+                  <m:sub>
+                    <m:r>
+                      <m:rPr>
+                        <m:sty m:val="p"/>
+                      </m:rPr>
+                      <w:rPr>
+                        <w:rFonts w:ascii="Cambria Math" w:hAnsi="Cambria Math"/>
+                        <w:sz w:val="20"/>
+                        <w:szCs w:val="20"/>
+                        <w:lang w:val="en-US"/>
+                      </w:rPr>
+                      <m:t>n</m:t>
+                    </m:r>
+                  </m:sub>
+                  <m:sup>
+                    <m:r>
+                      <m:rPr>
+                        <m:sty m:val="p"/>
+                      </m:rPr>
+                      <w:rPr>
+                        <w:rFonts w:ascii="Cambria Math" w:hAnsi="Cambria Math"/>
+                        <w:sz w:val="20"/>
+                        <w:szCs w:val="20"/>
+                        <w:lang w:val="en-US"/>
+                      </w:rPr>
+                      <m:t>*</m:t>
+                    </m:r>
+                  </m:sup>
+                </m:sSubSup>
+                <m:d>
+                  <m:dPr>
+                    <m:ctrlPr>
+                      <w:rPr>
+                        <w:rFonts w:ascii="Cambria Math" w:hAnsi="Cambria Math"/>
+                        <w:b w:val="0"/>
+                        <w:bCs w:val="0"/>
+                        <w:i w:val="0"/>
+                        <w:iCs w:val="0"/>
+                        <w:sz w:val="20"/>
+                        <w:szCs w:val="20"/>
+                        <w:lang w:val="en-US"/>
+                      </w:rPr>
+                    </m:ctrlPr>
+                  </m:dPr>
+                  <m:e>
+                    <m:sSubSup>
+                      <m:sSubSupPr>
+                        <m:ctrlPr>
+                          <w:rPr>
+                            <w:rFonts w:ascii="Cambria Math" w:hAnsi="Cambria Math"/>
+                            <w:b w:val="0"/>
+                            <w:bCs w:val="0"/>
+                            <w:i w:val="0"/>
+                            <w:iCs w:val="0"/>
+                            <w:sz w:val="24"/>
+                            <w:szCs w:val="24"/>
+                          </w:rPr>
+                        </m:ctrlPr>
+                      </m:sSubSupPr>
+                      <m:e>
+                        <m:r>
+                          <m:rPr>
+                            <m:sty m:val="p"/>
+                          </m:rPr>
+                          <w:rPr>
+                            <w:rFonts w:ascii="Cambria Math" w:hAnsi="Cambria Math"/>
+                            <w:sz w:val="24"/>
+                            <w:szCs w:val="24"/>
+                          </w:rPr>
+                          <m:t>x</m:t>
+                        </m:r>
+                      </m:e>
+                      <m:sub>
+                        <m:r>
+                          <m:rPr>
+                            <m:sty m:val="p"/>
+                          </m:rPr>
+                          <w:rPr>
+                            <w:rFonts w:ascii="Cambria Math" w:hAnsi="Cambria Math"/>
+                            <w:sz w:val="24"/>
+                            <w:szCs w:val="24"/>
+                          </w:rPr>
+                          <m:t>i</m:t>
+                        </m:r>
+                      </m:sub>
+                      <m:sup>
+                        <m:r>
+                          <m:rPr>
+                            <m:sty m:val="p"/>
+                          </m:rPr>
+                          <w:rPr>
+                            <w:rFonts w:ascii="Cambria Math" w:hAnsi="Cambria Math"/>
+                            <w:sz w:val="24"/>
+                            <w:szCs w:val="24"/>
+                          </w:rPr>
+                          <m:t>^</m:t>
+                        </m:r>
+                      </m:sup>
+                    </m:sSubSup>
+                    <m:ctrlPr>
+                      <w:rPr>
+                        <w:rFonts w:ascii="Cambria Math" w:hAnsi="Cambria Math"/>
+                        <w:b w:val="0"/>
+                        <w:bCs w:val="0"/>
+                        <w:i w:val="0"/>
+                        <w:iCs w:val="0"/>
+                        <w:sz w:val="24"/>
+                        <w:szCs w:val="24"/>
+                      </w:rPr>
+                    </m:ctrlPr>
+                  </m:e>
+                </m:d>
+                <m:r>
+                  <m:rPr>
+                    <m:sty m:val="p"/>
+                  </m:rPr>
+                  <w:rPr>
+                    <w:rFonts w:ascii="Cambria Math" w:hAnsi="Cambria Math"/>
+                    <w:sz w:val="24"/>
+                    <w:szCs w:val="24"/>
+                  </w:rPr>
+                  <m:t>-</m:t>
+                </m:r>
+                <m:r>
+                  <m:rPr>
+                    <m:sty m:val="p"/>
+                  </m:rPr>
+                  <w:rPr>
+                    <w:rFonts w:ascii="Cambria Math" w:hAnsi="Cambria Math"/>
+                    <w:sz w:val="24"/>
+                    <w:szCs w:val="24"/>
+                    <w:lang w:val="en-US"/>
+                  </w:rPr>
+                  <m:t xml:space="preserve"> </m:t>
+                </m:r>
+                <m:sSub>
+                  <m:sSubPr>
+                    <m:ctrlPr>
+                      <w:rPr>
+                        <w:rFonts w:ascii="Cambria Math" w:hAnsi="Cambria Math"/>
+                        <w:b w:val="0"/>
+                        <w:bCs w:val="0"/>
+                        <w:i w:val="0"/>
+                        <w:iCs w:val="0"/>
+                        <w:sz w:val="20"/>
+                        <w:szCs w:val="20"/>
+                      </w:rPr>
+                    </m:ctrlPr>
+                  </m:sSubPr>
+                  <m:e>
+                    <m:r>
+                      <m:rPr>
+                        <m:sty m:val="p"/>
+                      </m:rPr>
+                      <w:rPr>
+                        <w:rFonts w:ascii="Cambria Math" w:hAnsi="Cambria Math"/>
+                        <w:sz w:val="20"/>
+                        <w:szCs w:val="20"/>
+                      </w:rPr>
+                      <m:t>F</m:t>
+                    </m:r>
+                  </m:e>
+                  <m:sub>
+                    <m:r>
+                      <m:rPr>
+                        <m:sty m:val="p"/>
+                      </m:rPr>
+                      <w:rPr>
+                        <w:rFonts w:ascii="Cambria Math" w:hAnsi="Cambria Math"/>
+                        <w:sz w:val="20"/>
+                        <w:szCs w:val="20"/>
+                      </w:rPr>
+                      <m:t>T</m:t>
+                    </m:r>
+                  </m:sub>
+                </m:sSub>
+                <m:d>
+                  <m:dPr>
+                    <m:ctrlPr>
+                      <w:rPr>
+                        <w:rFonts w:ascii="Cambria Math" w:hAnsi="Cambria Math"/>
+                        <w:b w:val="0"/>
+                        <w:bCs w:val="0"/>
+                        <w:i w:val="0"/>
+                        <w:iCs w:val="0"/>
+                        <w:sz w:val="20"/>
+                        <w:szCs w:val="20"/>
+                      </w:rPr>
+                    </m:ctrlPr>
+                  </m:dPr>
+                  <m:e>
+                    <m:sSub>
+                      <m:sSubPr>
+                        <m:ctrlPr>
+                          <w:rPr>
+                            <w:rFonts w:ascii="Cambria Math" w:hAnsi="Cambria Math"/>
+                            <w:b w:val="0"/>
+                            <w:bCs w:val="0"/>
+                            <w:i w:val="0"/>
+                            <w:iCs w:val="0"/>
+                            <w:sz w:val="20"/>
+                            <w:szCs w:val="20"/>
+                          </w:rPr>
+                        </m:ctrlPr>
+                      </m:sSubPr>
+                      <m:e>
+                        <m:r>
+                          <m:rPr>
+                            <m:sty m:val="p"/>
+                          </m:rPr>
+                          <w:rPr>
+                            <w:rFonts w:ascii="Cambria Math" w:hAnsi="Cambria Math"/>
+                            <w:sz w:val="20"/>
+                            <w:szCs w:val="20"/>
+                          </w:rPr>
+                          <m:t>u</m:t>
+                        </m:r>
+                      </m:e>
+                      <m:sub>
+                        <m:r>
+                          <m:rPr>
+                            <m:sty m:val="p"/>
+                          </m:rPr>
+                          <w:rPr>
+                            <w:rFonts w:ascii="Cambria Math" w:hAnsi="Cambria Math"/>
+                            <w:sz w:val="20"/>
+                            <w:szCs w:val="20"/>
+                          </w:rPr>
+                          <m:t>i</m:t>
+                        </m:r>
+                      </m:sub>
+                    </m:sSub>
+                  </m:e>
+                </m:d>
+                <m:r>
+                  <m:rPr>
+                    <m:sty m:val="p"/>
+                  </m:rPr>
+                  <w:rPr>
+                    <w:rFonts w:ascii="Cambria Math" w:hAnsi="Cambria Math"/>
+                    <w:sz w:val="20"/>
+                    <w:szCs w:val="20"/>
+                  </w:rPr>
+                  <m:t>|</m:t>
+                </m:r>
+              </m:oMath>
+            </m:oMathPara>
+          </w:p>
+        </w:tc>
+      </w:tr>
+      <w:tr>
+        <w:tc>
+          <w:tcPr>
+            <w:tcW w:w="426" w:type="dxa"/>
+          </w:tcPr>
+          <w:p>
+            <w:pPr>
+              <w:pStyle w:val="23"/>
+              <w:rPr>
+                <w:b w:val="0"/>
+                <w:bCs w:val="0"/>
+                <w:i w:val="0"/>
+                <w:iCs w:val="0"/>
+                <w:sz w:val="20"/>
+                <w:szCs w:val="20"/>
+              </w:rPr>
+            </w:pPr>
+            <w:r>
+              <w:rPr>
+                <w:b w:val="0"/>
+                <w:bCs w:val="0"/>
+                <w:i w:val="0"/>
+                <w:iCs w:val="0"/>
+                <w:sz w:val="20"/>
+                <w:szCs w:val="20"/>
+              </w:rPr>
+              <w:t>1</w:t>
+            </w:r>
+          </w:p>
+        </w:tc>
+        <w:tc>
+          <w:tcPr>
+            <w:tcW w:w="1134" w:type="dxa"/>
+          </w:tcPr>
+          <w:p>
+            <w:pPr>
+              <w:pStyle w:val="23"/>
+              <w:rPr>
+                <w:b w:val="0"/>
+                <w:bCs w:val="0"/>
+                <w:i w:val="0"/>
+                <w:iCs w:val="0"/>
+                <w:sz w:val="20"/>
+                <w:szCs w:val="20"/>
+              </w:rPr>
+            </w:pPr>
+            <w:r>
+              <w:rPr>
+                <w:b w:val="0"/>
+                <w:bCs w:val="0"/>
+                <w:i w:val="0"/>
+                <w:iCs w:val="0"/>
+                <w:sz w:val="20"/>
+                <w:szCs w:val="20"/>
+              </w:rPr>
+              <w:t>-4.615</w:t>
+            </w:r>
+          </w:p>
+        </w:tc>
+        <w:tc>
+          <w:tcPr>
+            <w:tcW w:w="709" w:type="dxa"/>
+          </w:tcPr>
+          <w:p>
+            <w:pPr>
+              <w:pStyle w:val="23"/>
+              <w:rPr>
+                <w:b w:val="0"/>
+                <w:bCs w:val="0"/>
+                <w:i w:val="0"/>
+                <w:iCs w:val="0"/>
+                <w:sz w:val="20"/>
+                <w:szCs w:val="20"/>
+              </w:rPr>
+            </w:pPr>
+            <w:r>
+              <w:rPr>
+                <w:b w:val="0"/>
+                <w:bCs w:val="0"/>
+                <w:i w:val="0"/>
+                <w:iCs w:val="0"/>
+                <w:sz w:val="20"/>
+                <w:szCs w:val="20"/>
+              </w:rPr>
+              <w:t>5</w:t>
+            </w:r>
+          </w:p>
+        </w:tc>
+        <w:tc>
+          <w:tcPr>
+            <w:tcW w:w="992" w:type="dxa"/>
+          </w:tcPr>
+          <w:p>
+            <w:pPr>
+              <w:pStyle w:val="23"/>
+              <w:rPr>
+                <w:b w:val="0"/>
+                <w:bCs w:val="0"/>
+                <w:i w:val="0"/>
+                <w:iCs w:val="0"/>
+                <w:sz w:val="20"/>
+                <w:szCs w:val="20"/>
+              </w:rPr>
+            </w:pPr>
+            <w:r>
+              <w:rPr>
+                <w:b w:val="0"/>
+                <w:bCs w:val="0"/>
+                <w:i w:val="0"/>
+                <w:iCs w:val="0"/>
+                <w:sz w:val="20"/>
+                <w:szCs w:val="20"/>
+              </w:rPr>
+              <w:t>0.10</w:t>
+            </w:r>
+          </w:p>
+        </w:tc>
+        <w:tc>
+          <w:tcPr>
+            <w:tcW w:w="1134" w:type="dxa"/>
+          </w:tcPr>
+          <w:p>
+            <w:pPr>
+              <w:pStyle w:val="23"/>
+              <w:rPr>
+                <w:b w:val="0"/>
+                <w:bCs w:val="0"/>
+                <w:i w:val="0"/>
+                <w:iCs w:val="0"/>
+                <w:sz w:val="20"/>
+                <w:szCs w:val="20"/>
+              </w:rPr>
+            </w:pPr>
+            <w:r>
+              <w:rPr>
+                <w:b w:val="0"/>
+                <w:bCs w:val="0"/>
+                <w:i w:val="0"/>
+                <w:iCs w:val="0"/>
+                <w:sz w:val="20"/>
+                <w:szCs w:val="20"/>
+              </w:rPr>
+              <w:t>0.10</w:t>
+            </w:r>
+          </w:p>
+        </w:tc>
+        <w:tc>
+          <w:tcPr>
+            <w:tcW w:w="1559" w:type="dxa"/>
+          </w:tcPr>
+          <w:p>
+            <w:pPr>
+              <w:pStyle w:val="23"/>
+              <w:rPr>
+                <w:b w:val="0"/>
+                <w:bCs w:val="0"/>
+                <w:i w:val="0"/>
+                <w:iCs w:val="0"/>
+                <w:sz w:val="20"/>
+                <w:szCs w:val="20"/>
+              </w:rPr>
+            </w:pPr>
+            <w:r>
+              <w:rPr>
+                <w:b w:val="0"/>
+                <w:bCs w:val="0"/>
+                <w:i w:val="0"/>
+                <w:iCs w:val="0"/>
+                <w:sz w:val="20"/>
+                <w:szCs w:val="20"/>
+              </w:rPr>
+              <w:t>-1.723788</w:t>
+            </w:r>
+          </w:p>
+        </w:tc>
+        <w:tc>
+          <w:tcPr>
+            <w:tcW w:w="2127" w:type="dxa"/>
+          </w:tcPr>
+          <w:p>
+            <w:pPr>
+              <w:pStyle w:val="23"/>
+              <w:rPr>
+                <w:b w:val="0"/>
+                <w:bCs w:val="0"/>
+                <w:i w:val="0"/>
+                <w:iCs w:val="0"/>
+                <w:sz w:val="20"/>
+                <w:szCs w:val="20"/>
+              </w:rPr>
+            </w:pPr>
+            <w:r>
+              <w:rPr>
+                <w:b w:val="0"/>
+                <w:bCs w:val="0"/>
+                <w:i w:val="0"/>
+                <w:iCs w:val="0"/>
+                <w:sz w:val="20"/>
+                <w:szCs w:val="20"/>
+              </w:rPr>
+              <w:t>0.042373</w:t>
+            </w:r>
+          </w:p>
+        </w:tc>
+        <w:tc>
+          <w:tcPr>
+            <w:tcW w:w="2409" w:type="dxa"/>
+          </w:tcPr>
+          <w:p>
+            <w:pPr>
+              <w:pStyle w:val="23"/>
+              <w:rPr>
+                <w:b w:val="0"/>
+                <w:bCs w:val="0"/>
+                <w:i w:val="0"/>
+                <w:iCs w:val="0"/>
+                <w:sz w:val="20"/>
+                <w:szCs w:val="20"/>
+              </w:rPr>
+            </w:pPr>
+            <w:r>
+              <w:rPr>
+                <w:b w:val="0"/>
+                <w:bCs w:val="0"/>
+                <w:i w:val="0"/>
+                <w:iCs w:val="0"/>
+                <w:sz w:val="20"/>
+                <w:szCs w:val="20"/>
+              </w:rPr>
+              <w:t>0.057627</w:t>
+            </w:r>
+          </w:p>
+        </w:tc>
+      </w:tr>
+      <w:tr>
+        <w:tc>
+          <w:tcPr>
+            <w:tcW w:w="426" w:type="dxa"/>
+          </w:tcPr>
+          <w:p>
+            <w:pPr>
+              <w:pStyle w:val="23"/>
+              <w:rPr>
+                <w:b w:val="0"/>
+                <w:bCs w:val="0"/>
+                <w:i w:val="0"/>
+                <w:iCs w:val="0"/>
+                <w:sz w:val="20"/>
+                <w:szCs w:val="20"/>
+              </w:rPr>
+            </w:pPr>
+            <w:r>
+              <w:rPr>
+                <w:b w:val="0"/>
+                <w:bCs w:val="0"/>
+                <w:i w:val="0"/>
+                <w:iCs w:val="0"/>
+                <w:sz w:val="20"/>
+                <w:szCs w:val="20"/>
+              </w:rPr>
+              <w:t>2</w:t>
+            </w:r>
+          </w:p>
+        </w:tc>
+        <w:tc>
+          <w:tcPr>
+            <w:tcW w:w="1134" w:type="dxa"/>
+          </w:tcPr>
+          <w:p>
+            <w:pPr>
+              <w:pStyle w:val="23"/>
+              <w:rPr>
+                <w:b w:val="0"/>
+                <w:bCs w:val="0"/>
+                <w:i w:val="0"/>
+                <w:iCs w:val="0"/>
+                <w:sz w:val="20"/>
+                <w:szCs w:val="20"/>
+              </w:rPr>
+            </w:pPr>
+            <w:r>
+              <w:rPr>
+                <w:b w:val="0"/>
+                <w:bCs w:val="0"/>
+                <w:i w:val="0"/>
+                <w:iCs w:val="0"/>
+                <w:sz w:val="20"/>
+                <w:szCs w:val="20"/>
+              </w:rPr>
+              <w:t>-4.265</w:t>
+            </w:r>
+          </w:p>
+        </w:tc>
+        <w:tc>
+          <w:tcPr>
+            <w:tcW w:w="709" w:type="dxa"/>
+          </w:tcPr>
+          <w:p>
+            <w:pPr>
+              <w:pStyle w:val="23"/>
+              <w:rPr>
+                <w:b w:val="0"/>
+                <w:bCs w:val="0"/>
+                <w:i w:val="0"/>
+                <w:iCs w:val="0"/>
+                <w:sz w:val="20"/>
+                <w:szCs w:val="20"/>
+              </w:rPr>
+            </w:pPr>
+            <w:r>
+              <w:rPr>
+                <w:b w:val="0"/>
+                <w:bCs w:val="0"/>
+                <w:i w:val="0"/>
+                <w:iCs w:val="0"/>
+                <w:sz w:val="20"/>
+                <w:szCs w:val="20"/>
+              </w:rPr>
+              <w:t>5</w:t>
+            </w:r>
+          </w:p>
+        </w:tc>
+        <w:tc>
+          <w:tcPr>
+            <w:tcW w:w="992" w:type="dxa"/>
+          </w:tcPr>
+          <w:p>
+            <w:pPr>
+              <w:pStyle w:val="23"/>
+              <w:rPr>
+                <w:b w:val="0"/>
+                <w:bCs w:val="0"/>
+                <w:i w:val="0"/>
+                <w:iCs w:val="0"/>
+                <w:sz w:val="20"/>
+                <w:szCs w:val="20"/>
+              </w:rPr>
+            </w:pPr>
+            <w:r>
+              <w:rPr>
+                <w:b w:val="0"/>
+                <w:bCs w:val="0"/>
+                <w:i w:val="0"/>
+                <w:iCs w:val="0"/>
+                <w:sz w:val="20"/>
+                <w:szCs w:val="20"/>
+              </w:rPr>
+              <w:t>0.10</w:t>
+            </w:r>
+          </w:p>
+        </w:tc>
+        <w:tc>
+          <w:tcPr>
+            <w:tcW w:w="1134" w:type="dxa"/>
+          </w:tcPr>
+          <w:p>
+            <w:pPr>
+              <w:pStyle w:val="23"/>
+              <w:rPr>
+                <w:b w:val="0"/>
+                <w:bCs w:val="0"/>
+                <w:i w:val="0"/>
+                <w:iCs w:val="0"/>
+                <w:sz w:val="20"/>
+                <w:szCs w:val="20"/>
+              </w:rPr>
+            </w:pPr>
+            <w:r>
+              <w:rPr>
+                <w:b w:val="0"/>
+                <w:bCs w:val="0"/>
+                <w:i w:val="0"/>
+                <w:iCs w:val="0"/>
+                <w:sz w:val="20"/>
+                <w:szCs w:val="20"/>
+              </w:rPr>
+              <w:t>0.20</w:t>
+            </w:r>
+          </w:p>
+        </w:tc>
+        <w:tc>
+          <w:tcPr>
+            <w:tcW w:w="1559" w:type="dxa"/>
+          </w:tcPr>
+          <w:p>
+            <w:pPr>
+              <w:pStyle w:val="23"/>
+              <w:rPr>
+                <w:b w:val="0"/>
+                <w:bCs w:val="0"/>
+                <w:i w:val="0"/>
+                <w:iCs w:val="0"/>
+                <w:sz w:val="20"/>
+                <w:szCs w:val="20"/>
+              </w:rPr>
+            </w:pPr>
+            <w:r>
+              <w:rPr>
+                <w:b w:val="0"/>
+                <w:bCs w:val="0"/>
+                <w:i w:val="0"/>
+                <w:iCs w:val="0"/>
+                <w:sz w:val="20"/>
+                <w:szCs w:val="20"/>
+              </w:rPr>
+              <w:t>-1.150393</w:t>
+            </w:r>
+          </w:p>
+        </w:tc>
+        <w:tc>
+          <w:tcPr>
+            <w:tcW w:w="2127" w:type="dxa"/>
+          </w:tcPr>
+          <w:p>
+            <w:pPr>
+              <w:pStyle w:val="23"/>
+              <w:rPr>
+                <w:b w:val="0"/>
+                <w:bCs w:val="0"/>
+                <w:i w:val="0"/>
+                <w:iCs w:val="0"/>
+                <w:sz w:val="20"/>
+                <w:szCs w:val="20"/>
+              </w:rPr>
+            </w:pPr>
+            <w:r>
+              <w:rPr>
+                <w:b w:val="0"/>
+                <w:bCs w:val="0"/>
+                <w:i w:val="0"/>
+                <w:iCs w:val="0"/>
+                <w:sz w:val="20"/>
+                <w:szCs w:val="20"/>
+              </w:rPr>
+              <w:t>0.124991</w:t>
+            </w:r>
+          </w:p>
+        </w:tc>
+        <w:tc>
+          <w:tcPr>
+            <w:tcW w:w="2409" w:type="dxa"/>
+          </w:tcPr>
+          <w:p>
+            <w:pPr>
+              <w:pStyle w:val="23"/>
+              <w:rPr>
+                <w:b w:val="0"/>
+                <w:bCs w:val="0"/>
+                <w:i w:val="0"/>
+                <w:iCs w:val="0"/>
+                <w:sz w:val="20"/>
+                <w:szCs w:val="20"/>
+              </w:rPr>
+            </w:pPr>
+            <w:r>
+              <w:rPr>
+                <w:b w:val="0"/>
+                <w:bCs w:val="0"/>
+                <w:i w:val="0"/>
+                <w:iCs w:val="0"/>
+                <w:sz w:val="20"/>
+                <w:szCs w:val="20"/>
+              </w:rPr>
+              <w:t>0.075009</w:t>
+            </w:r>
+          </w:p>
+        </w:tc>
+      </w:tr>
+      <w:tr>
+        <w:tc>
+          <w:tcPr>
+            <w:tcW w:w="426" w:type="dxa"/>
+          </w:tcPr>
+          <w:p>
+            <w:pPr>
+              <w:pStyle w:val="23"/>
+              <w:rPr>
+                <w:b w:val="0"/>
+                <w:bCs w:val="0"/>
+                <w:i w:val="0"/>
+                <w:iCs w:val="0"/>
+                <w:sz w:val="20"/>
+                <w:szCs w:val="20"/>
+              </w:rPr>
+            </w:pPr>
+            <w:r>
+              <w:rPr>
+                <w:b w:val="0"/>
+                <w:bCs w:val="0"/>
+                <w:i w:val="0"/>
+                <w:iCs w:val="0"/>
+                <w:sz w:val="20"/>
+                <w:szCs w:val="20"/>
+              </w:rPr>
+              <w:t>3</w:t>
+            </w:r>
+          </w:p>
+        </w:tc>
+        <w:tc>
+          <w:tcPr>
+            <w:tcW w:w="1134" w:type="dxa"/>
+          </w:tcPr>
+          <w:p>
+            <w:pPr>
+              <w:pStyle w:val="23"/>
+              <w:rPr>
+                <w:b w:val="0"/>
+                <w:bCs w:val="0"/>
+                <w:i w:val="0"/>
+                <w:iCs w:val="0"/>
+                <w:sz w:val="20"/>
+                <w:szCs w:val="20"/>
+              </w:rPr>
+            </w:pPr>
+            <w:r>
+              <w:rPr>
+                <w:b w:val="0"/>
+                <w:bCs w:val="0"/>
+                <w:i w:val="0"/>
+                <w:iCs w:val="0"/>
+                <w:sz w:val="20"/>
+                <w:szCs w:val="20"/>
+              </w:rPr>
+              <w:t>-3.915</w:t>
+            </w:r>
+          </w:p>
+        </w:tc>
+        <w:tc>
+          <w:tcPr>
+            <w:tcW w:w="709" w:type="dxa"/>
+          </w:tcPr>
+          <w:p>
+            <w:pPr>
+              <w:pStyle w:val="23"/>
+              <w:rPr>
+                <w:b w:val="0"/>
+                <w:bCs w:val="0"/>
+                <w:i w:val="0"/>
+                <w:iCs w:val="0"/>
+                <w:sz w:val="20"/>
+                <w:szCs w:val="20"/>
+              </w:rPr>
+            </w:pPr>
+            <w:r>
+              <w:rPr>
+                <w:b w:val="0"/>
+                <w:bCs w:val="0"/>
+                <w:i w:val="0"/>
+                <w:iCs w:val="0"/>
+                <w:sz w:val="20"/>
+                <w:szCs w:val="20"/>
+              </w:rPr>
+              <w:t>11</w:t>
+            </w:r>
+          </w:p>
+        </w:tc>
+        <w:tc>
+          <w:tcPr>
+            <w:tcW w:w="992" w:type="dxa"/>
+          </w:tcPr>
+          <w:p>
+            <w:pPr>
+              <w:pStyle w:val="23"/>
+              <w:rPr>
+                <w:b w:val="0"/>
+                <w:bCs w:val="0"/>
+                <w:i w:val="0"/>
+                <w:iCs w:val="0"/>
+                <w:sz w:val="20"/>
+                <w:szCs w:val="20"/>
+              </w:rPr>
+            </w:pPr>
+            <w:r>
+              <w:rPr>
+                <w:b w:val="0"/>
+                <w:bCs w:val="0"/>
+                <w:i w:val="0"/>
+                <w:iCs w:val="0"/>
+                <w:sz w:val="20"/>
+                <w:szCs w:val="20"/>
+              </w:rPr>
+              <w:t>0.22</w:t>
+            </w:r>
+          </w:p>
+        </w:tc>
+        <w:tc>
+          <w:tcPr>
+            <w:tcW w:w="1134" w:type="dxa"/>
+          </w:tcPr>
+          <w:p>
+            <w:pPr>
+              <w:pStyle w:val="23"/>
+              <w:rPr>
+                <w:b w:val="0"/>
+                <w:bCs w:val="0"/>
+                <w:i w:val="0"/>
+                <w:iCs w:val="0"/>
+                <w:sz w:val="20"/>
+                <w:szCs w:val="20"/>
+              </w:rPr>
+            </w:pPr>
+            <w:r>
+              <w:rPr>
+                <w:b w:val="0"/>
+                <w:bCs w:val="0"/>
+                <w:i w:val="0"/>
+                <w:iCs w:val="0"/>
+                <w:sz w:val="20"/>
+                <w:szCs w:val="20"/>
+              </w:rPr>
+              <w:t>0.42</w:t>
+            </w:r>
+          </w:p>
+        </w:tc>
+        <w:tc>
+          <w:tcPr>
+            <w:tcW w:w="1559" w:type="dxa"/>
+          </w:tcPr>
+          <w:p>
+            <w:pPr>
+              <w:pStyle w:val="23"/>
+              <w:rPr>
+                <w:b w:val="0"/>
+                <w:bCs w:val="0"/>
+                <w:i w:val="0"/>
+                <w:iCs w:val="0"/>
+                <w:sz w:val="20"/>
+                <w:szCs w:val="20"/>
+              </w:rPr>
+            </w:pPr>
+            <w:r>
+              <w:rPr>
+                <w:b w:val="0"/>
+                <w:bCs w:val="0"/>
+                <w:i w:val="0"/>
+                <w:iCs w:val="0"/>
+                <w:sz w:val="20"/>
+                <w:szCs w:val="20"/>
+              </w:rPr>
+              <w:t>-0.576999</w:t>
+            </w:r>
+          </w:p>
+        </w:tc>
+        <w:tc>
+          <w:tcPr>
+            <w:tcW w:w="2127" w:type="dxa"/>
+          </w:tcPr>
+          <w:p>
+            <w:pPr>
+              <w:pStyle w:val="23"/>
+              <w:rPr>
+                <w:b w:val="0"/>
+                <w:bCs w:val="0"/>
+                <w:i w:val="0"/>
+                <w:iCs w:val="0"/>
+                <w:sz w:val="20"/>
+                <w:szCs w:val="20"/>
+              </w:rPr>
+            </w:pPr>
+            <w:r>
+              <w:rPr>
+                <w:b w:val="0"/>
+                <w:bCs w:val="0"/>
+                <w:i w:val="0"/>
+                <w:iCs w:val="0"/>
+                <w:sz w:val="20"/>
+                <w:szCs w:val="20"/>
+              </w:rPr>
+              <w:t>0.281970</w:t>
+            </w:r>
+          </w:p>
+        </w:tc>
+        <w:tc>
+          <w:tcPr>
+            <w:tcW w:w="2409" w:type="dxa"/>
+          </w:tcPr>
+          <w:p>
+            <w:pPr>
+              <w:pStyle w:val="23"/>
+              <w:rPr>
+                <w:b w:val="0"/>
+                <w:bCs w:val="0"/>
+                <w:i w:val="0"/>
+                <w:iCs w:val="0"/>
+                <w:sz w:val="20"/>
+                <w:szCs w:val="20"/>
+              </w:rPr>
+            </w:pPr>
+            <w:r>
+              <w:rPr>
+                <w:b w:val="0"/>
+                <w:bCs w:val="0"/>
+                <w:i w:val="0"/>
+                <w:iCs w:val="0"/>
+                <w:sz w:val="20"/>
+                <w:szCs w:val="20"/>
+              </w:rPr>
+              <w:t>0.138030</w:t>
+            </w:r>
+          </w:p>
+        </w:tc>
+      </w:tr>
+      <w:tr>
+        <w:tc>
+          <w:tcPr>
+            <w:tcW w:w="426" w:type="dxa"/>
+          </w:tcPr>
+          <w:p>
+            <w:pPr>
+              <w:pStyle w:val="23"/>
+              <w:rPr>
+                <w:b w:val="0"/>
+                <w:bCs w:val="0"/>
+                <w:i w:val="0"/>
+                <w:iCs w:val="0"/>
+                <w:sz w:val="20"/>
+                <w:szCs w:val="20"/>
+              </w:rPr>
+            </w:pPr>
+            <w:r>
+              <w:rPr>
+                <w:b w:val="0"/>
+                <w:bCs w:val="0"/>
+                <w:i w:val="0"/>
+                <w:iCs w:val="0"/>
+                <w:sz w:val="20"/>
+                <w:szCs w:val="20"/>
+              </w:rPr>
+              <w:t>4</w:t>
+            </w:r>
+          </w:p>
+        </w:tc>
+        <w:tc>
+          <w:tcPr>
+            <w:tcW w:w="1134" w:type="dxa"/>
+          </w:tcPr>
+          <w:p>
+            <w:pPr>
+              <w:pStyle w:val="23"/>
+              <w:rPr>
+                <w:b w:val="0"/>
+                <w:bCs w:val="0"/>
+                <w:i w:val="0"/>
+                <w:iCs w:val="0"/>
+                <w:sz w:val="20"/>
+                <w:szCs w:val="20"/>
+              </w:rPr>
+            </w:pPr>
+            <w:r>
+              <w:rPr>
+                <w:b w:val="0"/>
+                <w:bCs w:val="0"/>
+                <w:i w:val="0"/>
+                <w:iCs w:val="0"/>
+                <w:sz w:val="20"/>
+                <w:szCs w:val="20"/>
+              </w:rPr>
+              <w:t>-3.565</w:t>
+            </w:r>
+          </w:p>
+        </w:tc>
+        <w:tc>
+          <w:tcPr>
+            <w:tcW w:w="709" w:type="dxa"/>
+          </w:tcPr>
+          <w:p>
+            <w:pPr>
+              <w:pStyle w:val="23"/>
+              <w:rPr>
+                <w:b w:val="0"/>
+                <w:bCs w:val="0"/>
+                <w:i w:val="0"/>
+                <w:iCs w:val="0"/>
+                <w:sz w:val="20"/>
+                <w:szCs w:val="20"/>
+              </w:rPr>
+            </w:pPr>
+            <w:r>
+              <w:rPr>
+                <w:b w:val="0"/>
+                <w:bCs w:val="0"/>
+                <w:i w:val="0"/>
+                <w:iCs w:val="0"/>
+                <w:sz w:val="20"/>
+                <w:szCs w:val="20"/>
+              </w:rPr>
+              <w:t>8</w:t>
+            </w:r>
+          </w:p>
+        </w:tc>
+        <w:tc>
+          <w:tcPr>
+            <w:tcW w:w="992" w:type="dxa"/>
+          </w:tcPr>
+          <w:p>
+            <w:pPr>
+              <w:pStyle w:val="23"/>
+              <w:rPr>
+                <w:b w:val="0"/>
+                <w:bCs w:val="0"/>
+                <w:i w:val="0"/>
+                <w:iCs w:val="0"/>
+                <w:sz w:val="20"/>
+                <w:szCs w:val="20"/>
+              </w:rPr>
+            </w:pPr>
+            <w:r>
+              <w:rPr>
+                <w:b w:val="0"/>
+                <w:bCs w:val="0"/>
+                <w:i w:val="0"/>
+                <w:iCs w:val="0"/>
+                <w:sz w:val="20"/>
+                <w:szCs w:val="20"/>
+              </w:rPr>
+              <w:t>0.16</w:t>
+            </w:r>
+          </w:p>
+        </w:tc>
+        <w:tc>
+          <w:tcPr>
+            <w:tcW w:w="1134" w:type="dxa"/>
+          </w:tcPr>
+          <w:p>
+            <w:pPr>
+              <w:pStyle w:val="23"/>
+              <w:rPr>
+                <w:b w:val="0"/>
+                <w:bCs w:val="0"/>
+                <w:i w:val="0"/>
+                <w:iCs w:val="0"/>
+                <w:sz w:val="20"/>
+                <w:szCs w:val="20"/>
+              </w:rPr>
+            </w:pPr>
+            <w:r>
+              <w:rPr>
+                <w:b w:val="0"/>
+                <w:bCs w:val="0"/>
+                <w:i w:val="0"/>
+                <w:iCs w:val="0"/>
+                <w:sz w:val="20"/>
+                <w:szCs w:val="20"/>
+              </w:rPr>
+              <w:t>0.58</w:t>
+            </w:r>
+          </w:p>
+        </w:tc>
+        <w:tc>
+          <w:tcPr>
+            <w:tcW w:w="1559" w:type="dxa"/>
+          </w:tcPr>
+          <w:p>
+            <w:pPr>
+              <w:pStyle w:val="23"/>
+              <w:rPr>
+                <w:b w:val="0"/>
+                <w:bCs w:val="0"/>
+                <w:i w:val="0"/>
+                <w:iCs w:val="0"/>
+                <w:sz w:val="20"/>
+                <w:szCs w:val="20"/>
+              </w:rPr>
+            </w:pPr>
+            <w:r>
+              <w:rPr>
+                <w:b w:val="0"/>
+                <w:bCs w:val="0"/>
+                <w:i w:val="0"/>
+                <w:iCs w:val="0"/>
+                <w:sz w:val="20"/>
+                <w:szCs w:val="20"/>
+              </w:rPr>
+              <w:t>-0.003604</w:t>
+            </w:r>
+          </w:p>
+        </w:tc>
+        <w:tc>
+          <w:tcPr>
+            <w:tcW w:w="2127" w:type="dxa"/>
+          </w:tcPr>
+          <w:p>
+            <w:pPr>
+              <w:pStyle w:val="23"/>
+              <w:rPr>
+                <w:b w:val="0"/>
+                <w:bCs w:val="0"/>
+                <w:i w:val="0"/>
+                <w:iCs w:val="0"/>
+                <w:sz w:val="20"/>
+                <w:szCs w:val="20"/>
+              </w:rPr>
+            </w:pPr>
+            <w:r>
+              <w:rPr>
+                <w:b w:val="0"/>
+                <w:bCs w:val="0"/>
+                <w:i w:val="0"/>
+                <w:iCs w:val="0"/>
+                <w:sz w:val="20"/>
+                <w:szCs w:val="20"/>
+              </w:rPr>
+              <w:t>0.498562</w:t>
+            </w:r>
+          </w:p>
+        </w:tc>
+        <w:tc>
+          <w:tcPr>
+            <w:tcW w:w="2409" w:type="dxa"/>
+          </w:tcPr>
+          <w:p>
+            <w:pPr>
+              <w:pStyle w:val="23"/>
+              <w:rPr>
+                <w:b w:val="0"/>
+                <w:bCs w:val="0"/>
+                <w:i w:val="0"/>
+                <w:iCs w:val="0"/>
+                <w:sz w:val="20"/>
+                <w:szCs w:val="20"/>
+              </w:rPr>
+            </w:pPr>
+            <w:r>
+              <w:rPr>
+                <w:b w:val="0"/>
+                <w:bCs w:val="0"/>
+                <w:i w:val="0"/>
+                <w:iCs w:val="0"/>
+                <w:sz w:val="20"/>
+                <w:szCs w:val="20"/>
+              </w:rPr>
+              <w:t>0.081438</w:t>
+            </w:r>
+          </w:p>
+        </w:tc>
+      </w:tr>
+      <w:tr>
+        <w:tc>
+          <w:tcPr>
+            <w:tcW w:w="426" w:type="dxa"/>
+          </w:tcPr>
+          <w:p>
+            <w:pPr>
+              <w:pStyle w:val="23"/>
+              <w:rPr>
+                <w:b w:val="0"/>
+                <w:bCs w:val="0"/>
+                <w:i w:val="0"/>
+                <w:iCs w:val="0"/>
+                <w:sz w:val="20"/>
+                <w:szCs w:val="20"/>
+              </w:rPr>
+            </w:pPr>
+            <w:r>
+              <w:rPr>
+                <w:b w:val="0"/>
+                <w:bCs w:val="0"/>
+                <w:i w:val="0"/>
+                <w:iCs w:val="0"/>
+                <w:sz w:val="20"/>
+                <w:szCs w:val="20"/>
+              </w:rPr>
+              <w:t>5</w:t>
+            </w:r>
+          </w:p>
+        </w:tc>
+        <w:tc>
+          <w:tcPr>
+            <w:tcW w:w="1134" w:type="dxa"/>
+          </w:tcPr>
+          <w:p>
+            <w:pPr>
+              <w:pStyle w:val="23"/>
+              <w:rPr>
+                <w:b w:val="0"/>
+                <w:bCs w:val="0"/>
+                <w:i w:val="0"/>
+                <w:iCs w:val="0"/>
+                <w:sz w:val="20"/>
+                <w:szCs w:val="20"/>
+              </w:rPr>
+            </w:pPr>
+            <w:r>
+              <w:rPr>
+                <w:b w:val="0"/>
+                <w:bCs w:val="0"/>
+                <w:i w:val="0"/>
+                <w:iCs w:val="0"/>
+                <w:sz w:val="20"/>
+                <w:szCs w:val="20"/>
+              </w:rPr>
+              <w:t>-3.215</w:t>
+            </w:r>
+          </w:p>
+        </w:tc>
+        <w:tc>
+          <w:tcPr>
+            <w:tcW w:w="709" w:type="dxa"/>
+          </w:tcPr>
+          <w:p>
+            <w:pPr>
+              <w:pStyle w:val="23"/>
+              <w:rPr>
+                <w:b w:val="0"/>
+                <w:bCs w:val="0"/>
+                <w:i w:val="0"/>
+                <w:iCs w:val="0"/>
+                <w:sz w:val="20"/>
+                <w:szCs w:val="20"/>
+              </w:rPr>
+            </w:pPr>
+            <w:r>
+              <w:rPr>
+                <w:b w:val="0"/>
+                <w:bCs w:val="0"/>
+                <w:i w:val="0"/>
+                <w:iCs w:val="0"/>
+                <w:sz w:val="20"/>
+                <w:szCs w:val="20"/>
+              </w:rPr>
+              <w:t>9</w:t>
+            </w:r>
+          </w:p>
+        </w:tc>
+        <w:tc>
+          <w:tcPr>
+            <w:tcW w:w="992" w:type="dxa"/>
+          </w:tcPr>
+          <w:p>
+            <w:pPr>
+              <w:pStyle w:val="23"/>
+              <w:rPr>
+                <w:b w:val="0"/>
+                <w:bCs w:val="0"/>
+                <w:i w:val="0"/>
+                <w:iCs w:val="0"/>
+                <w:sz w:val="20"/>
+                <w:szCs w:val="20"/>
+              </w:rPr>
+            </w:pPr>
+            <w:r>
+              <w:rPr>
+                <w:b w:val="0"/>
+                <w:bCs w:val="0"/>
+                <w:i w:val="0"/>
+                <w:iCs w:val="0"/>
+                <w:sz w:val="20"/>
+                <w:szCs w:val="20"/>
+              </w:rPr>
+              <w:t>0.18</w:t>
+            </w:r>
+          </w:p>
+        </w:tc>
+        <w:tc>
+          <w:tcPr>
+            <w:tcW w:w="1134" w:type="dxa"/>
+          </w:tcPr>
+          <w:p>
+            <w:pPr>
+              <w:pStyle w:val="23"/>
+              <w:rPr>
+                <w:b w:val="0"/>
+                <w:bCs w:val="0"/>
+                <w:i w:val="0"/>
+                <w:iCs w:val="0"/>
+                <w:sz w:val="20"/>
+                <w:szCs w:val="20"/>
+              </w:rPr>
+            </w:pPr>
+            <w:r>
+              <w:rPr>
+                <w:b w:val="0"/>
+                <w:bCs w:val="0"/>
+                <w:i w:val="0"/>
+                <w:iCs w:val="0"/>
+                <w:sz w:val="20"/>
+                <w:szCs w:val="20"/>
+              </w:rPr>
+              <w:t>0.76</w:t>
+            </w:r>
+          </w:p>
+        </w:tc>
+        <w:tc>
+          <w:tcPr>
+            <w:tcW w:w="1559" w:type="dxa"/>
+          </w:tcPr>
+          <w:p>
+            <w:pPr>
+              <w:pStyle w:val="23"/>
+              <w:rPr>
+                <w:b w:val="0"/>
+                <w:bCs w:val="0"/>
+                <w:i w:val="0"/>
+                <w:iCs w:val="0"/>
+                <w:sz w:val="20"/>
+                <w:szCs w:val="20"/>
+              </w:rPr>
+            </w:pPr>
+            <w:r>
+              <w:rPr>
+                <w:b w:val="0"/>
+                <w:bCs w:val="0"/>
+                <w:i w:val="0"/>
+                <w:iCs w:val="0"/>
+                <w:sz w:val="20"/>
+                <w:szCs w:val="20"/>
+              </w:rPr>
+              <w:t>0.569790</w:t>
+            </w:r>
+          </w:p>
+        </w:tc>
+        <w:tc>
+          <w:tcPr>
+            <w:tcW w:w="2127" w:type="dxa"/>
+          </w:tcPr>
+          <w:p>
+            <w:pPr>
+              <w:pStyle w:val="23"/>
+              <w:rPr>
+                <w:b w:val="0"/>
+                <w:bCs w:val="0"/>
+                <w:i w:val="0"/>
+                <w:iCs w:val="0"/>
+                <w:sz w:val="20"/>
+                <w:szCs w:val="20"/>
+              </w:rPr>
+            </w:pPr>
+            <w:r>
+              <w:rPr>
+                <w:b w:val="0"/>
+                <w:bCs w:val="0"/>
+                <w:i w:val="0"/>
+                <w:iCs w:val="0"/>
+                <w:sz w:val="20"/>
+                <w:szCs w:val="20"/>
+              </w:rPr>
+              <w:t>0.715590</w:t>
+            </w:r>
+          </w:p>
+        </w:tc>
+        <w:tc>
+          <w:tcPr>
+            <w:tcW w:w="2409" w:type="dxa"/>
+          </w:tcPr>
+          <w:p>
+            <w:pPr>
+              <w:pStyle w:val="23"/>
+              <w:rPr>
+                <w:b w:val="0"/>
+                <w:bCs w:val="0"/>
+                <w:i w:val="0"/>
+                <w:iCs w:val="0"/>
+                <w:sz w:val="20"/>
+                <w:szCs w:val="20"/>
+              </w:rPr>
+            </w:pPr>
+            <w:r>
+              <w:rPr>
+                <w:b w:val="0"/>
+                <w:bCs w:val="0"/>
+                <w:i w:val="0"/>
+                <w:iCs w:val="0"/>
+                <w:sz w:val="20"/>
+                <w:szCs w:val="20"/>
+              </w:rPr>
+              <w:t>0.044410</w:t>
+            </w:r>
+          </w:p>
+        </w:tc>
+      </w:tr>
+      <w:tr>
+        <w:tc>
+          <w:tcPr>
+            <w:tcW w:w="426" w:type="dxa"/>
+          </w:tcPr>
+          <w:p>
+            <w:pPr>
+              <w:pStyle w:val="23"/>
+              <w:rPr>
+                <w:b w:val="0"/>
+                <w:bCs w:val="0"/>
+                <w:i w:val="0"/>
+                <w:iCs w:val="0"/>
+                <w:sz w:val="20"/>
+                <w:szCs w:val="20"/>
+              </w:rPr>
+            </w:pPr>
+            <w:r>
+              <w:rPr>
+                <w:b w:val="0"/>
+                <w:bCs w:val="0"/>
+                <w:i w:val="0"/>
+                <w:iCs w:val="0"/>
+                <w:sz w:val="20"/>
+                <w:szCs w:val="20"/>
+              </w:rPr>
+              <w:t>6</w:t>
+            </w:r>
+          </w:p>
+        </w:tc>
+        <w:tc>
+          <w:tcPr>
+            <w:tcW w:w="1134" w:type="dxa"/>
+          </w:tcPr>
+          <w:p>
+            <w:pPr>
+              <w:pStyle w:val="23"/>
+              <w:rPr>
+                <w:b w:val="0"/>
+                <w:bCs w:val="0"/>
+                <w:i w:val="0"/>
+                <w:iCs w:val="0"/>
+                <w:sz w:val="20"/>
+                <w:szCs w:val="20"/>
+              </w:rPr>
+            </w:pPr>
+            <w:r>
+              <w:rPr>
+                <w:b w:val="0"/>
+                <w:bCs w:val="0"/>
+                <w:i w:val="0"/>
+                <w:iCs w:val="0"/>
+                <w:sz w:val="20"/>
+                <w:szCs w:val="20"/>
+              </w:rPr>
+              <w:t>-2.865</w:t>
+            </w:r>
+          </w:p>
+        </w:tc>
+        <w:tc>
+          <w:tcPr>
+            <w:tcW w:w="709" w:type="dxa"/>
+          </w:tcPr>
+          <w:p>
+            <w:pPr>
+              <w:pStyle w:val="23"/>
+              <w:rPr>
+                <w:b w:val="0"/>
+                <w:bCs w:val="0"/>
+                <w:i w:val="0"/>
+                <w:iCs w:val="0"/>
+                <w:sz w:val="20"/>
+                <w:szCs w:val="20"/>
+              </w:rPr>
+            </w:pPr>
+            <w:r>
+              <w:rPr>
+                <w:b w:val="0"/>
+                <w:bCs w:val="0"/>
+                <w:i w:val="0"/>
+                <w:iCs w:val="0"/>
+                <w:sz w:val="20"/>
+                <w:szCs w:val="20"/>
+              </w:rPr>
+              <w:t>8</w:t>
+            </w:r>
+          </w:p>
+        </w:tc>
+        <w:tc>
+          <w:tcPr>
+            <w:tcW w:w="992" w:type="dxa"/>
+          </w:tcPr>
+          <w:p>
+            <w:pPr>
+              <w:pStyle w:val="23"/>
+              <w:rPr>
+                <w:b w:val="0"/>
+                <w:bCs w:val="0"/>
+                <w:i w:val="0"/>
+                <w:iCs w:val="0"/>
+                <w:sz w:val="20"/>
+                <w:szCs w:val="20"/>
+              </w:rPr>
+            </w:pPr>
+            <w:r>
+              <w:rPr>
+                <w:b w:val="0"/>
+                <w:bCs w:val="0"/>
+                <w:i w:val="0"/>
+                <w:iCs w:val="0"/>
+                <w:sz w:val="20"/>
+                <w:szCs w:val="20"/>
+              </w:rPr>
+              <w:t>0.16</w:t>
+            </w:r>
+          </w:p>
+        </w:tc>
+        <w:tc>
+          <w:tcPr>
+            <w:tcW w:w="1134" w:type="dxa"/>
+          </w:tcPr>
+          <w:p>
+            <w:pPr>
+              <w:pStyle w:val="23"/>
+              <w:rPr>
+                <w:b w:val="0"/>
+                <w:bCs w:val="0"/>
+                <w:i w:val="0"/>
+                <w:iCs w:val="0"/>
+                <w:sz w:val="20"/>
+                <w:szCs w:val="20"/>
+              </w:rPr>
+            </w:pPr>
+            <w:r>
+              <w:rPr>
+                <w:b w:val="0"/>
+                <w:bCs w:val="0"/>
+                <w:i w:val="0"/>
+                <w:iCs w:val="0"/>
+                <w:sz w:val="20"/>
+                <w:szCs w:val="20"/>
+              </w:rPr>
+              <w:t>0.92</w:t>
+            </w:r>
+          </w:p>
+        </w:tc>
+        <w:tc>
+          <w:tcPr>
+            <w:tcW w:w="1559" w:type="dxa"/>
+          </w:tcPr>
+          <w:p>
+            <w:pPr>
+              <w:pStyle w:val="23"/>
+              <w:rPr>
+                <w:b w:val="0"/>
+                <w:bCs w:val="0"/>
+                <w:i w:val="0"/>
+                <w:iCs w:val="0"/>
+                <w:sz w:val="20"/>
+                <w:szCs w:val="20"/>
+              </w:rPr>
+            </w:pPr>
+            <w:r>
+              <w:rPr>
+                <w:b w:val="0"/>
+                <w:bCs w:val="0"/>
+                <w:i w:val="0"/>
+                <w:iCs w:val="0"/>
+                <w:sz w:val="20"/>
+                <w:szCs w:val="20"/>
+              </w:rPr>
+              <w:t>1.143185</w:t>
+            </w:r>
+          </w:p>
+        </w:tc>
+        <w:tc>
+          <w:tcPr>
+            <w:tcW w:w="2127" w:type="dxa"/>
+          </w:tcPr>
+          <w:p>
+            <w:pPr>
+              <w:pStyle w:val="23"/>
+              <w:rPr>
+                <w:b w:val="0"/>
+                <w:bCs w:val="0"/>
+                <w:i w:val="0"/>
+                <w:iCs w:val="0"/>
+                <w:sz w:val="20"/>
+                <w:szCs w:val="20"/>
+              </w:rPr>
+            </w:pPr>
+            <w:r>
+              <w:rPr>
+                <w:b w:val="0"/>
+                <w:bCs w:val="0"/>
+                <w:i w:val="0"/>
+                <w:iCs w:val="0"/>
+                <w:sz w:val="20"/>
+                <w:szCs w:val="20"/>
+              </w:rPr>
+              <w:t>0.873519</w:t>
+            </w:r>
+          </w:p>
+        </w:tc>
+        <w:tc>
+          <w:tcPr>
+            <w:tcW w:w="2409" w:type="dxa"/>
+          </w:tcPr>
+          <w:p>
+            <w:pPr>
+              <w:pStyle w:val="23"/>
+              <w:rPr>
+                <w:b w:val="0"/>
+                <w:bCs w:val="0"/>
+                <w:i w:val="0"/>
+                <w:iCs w:val="0"/>
+                <w:sz w:val="20"/>
+                <w:szCs w:val="20"/>
+              </w:rPr>
+            </w:pPr>
+            <w:r>
+              <w:rPr>
+                <w:b w:val="0"/>
+                <w:bCs w:val="0"/>
+                <w:i w:val="0"/>
+                <w:iCs w:val="0"/>
+                <w:sz w:val="20"/>
+                <w:szCs w:val="20"/>
+              </w:rPr>
+              <w:t>0.046481</w:t>
+            </w:r>
+          </w:p>
+        </w:tc>
+      </w:tr>
+      <w:tr>
+        <w:tc>
+          <w:tcPr>
+            <w:tcW w:w="426" w:type="dxa"/>
+          </w:tcPr>
+          <w:p>
+            <w:pPr>
+              <w:pStyle w:val="23"/>
+              <w:rPr>
+                <w:b w:val="0"/>
+                <w:bCs w:val="0"/>
+                <w:i w:val="0"/>
+                <w:iCs w:val="0"/>
+                <w:sz w:val="20"/>
+                <w:szCs w:val="20"/>
+              </w:rPr>
+            </w:pPr>
+            <w:r>
+              <w:rPr>
+                <w:b w:val="0"/>
+                <w:bCs w:val="0"/>
+                <w:i w:val="0"/>
+                <w:iCs w:val="0"/>
+                <w:sz w:val="20"/>
+                <w:szCs w:val="20"/>
+              </w:rPr>
+              <w:t>7</w:t>
+            </w:r>
+          </w:p>
+        </w:tc>
+        <w:tc>
+          <w:tcPr>
+            <w:tcW w:w="1134" w:type="dxa"/>
+          </w:tcPr>
+          <w:p>
+            <w:pPr>
+              <w:pStyle w:val="23"/>
+              <w:rPr>
+                <w:b w:val="0"/>
+                <w:bCs w:val="0"/>
+                <w:i w:val="0"/>
+                <w:iCs w:val="0"/>
+                <w:sz w:val="20"/>
+                <w:szCs w:val="20"/>
+              </w:rPr>
+            </w:pPr>
+            <w:r>
+              <w:rPr>
+                <w:b w:val="0"/>
+                <w:bCs w:val="0"/>
+                <w:i w:val="0"/>
+                <w:iCs w:val="0"/>
+                <w:sz w:val="20"/>
+                <w:szCs w:val="20"/>
+              </w:rPr>
+              <w:t>-2.575</w:t>
+            </w:r>
+          </w:p>
+        </w:tc>
+        <w:tc>
+          <w:tcPr>
+            <w:tcW w:w="709" w:type="dxa"/>
+          </w:tcPr>
+          <w:p>
+            <w:pPr>
+              <w:pStyle w:val="23"/>
+              <w:rPr>
+                <w:b w:val="0"/>
+                <w:bCs w:val="0"/>
+                <w:i w:val="0"/>
+                <w:iCs w:val="0"/>
+                <w:sz w:val="20"/>
+                <w:szCs w:val="20"/>
+              </w:rPr>
+            </w:pPr>
+            <w:r>
+              <w:rPr>
+                <w:b w:val="0"/>
+                <w:bCs w:val="0"/>
+                <w:i w:val="0"/>
+                <w:iCs w:val="0"/>
+                <w:sz w:val="20"/>
+                <w:szCs w:val="20"/>
+              </w:rPr>
+              <w:t>4</w:t>
+            </w:r>
+          </w:p>
+        </w:tc>
+        <w:tc>
+          <w:tcPr>
+            <w:tcW w:w="992" w:type="dxa"/>
+          </w:tcPr>
+          <w:p>
+            <w:pPr>
+              <w:pStyle w:val="23"/>
+              <w:rPr>
+                <w:b w:val="0"/>
+                <w:bCs w:val="0"/>
+                <w:i w:val="0"/>
+                <w:iCs w:val="0"/>
+                <w:sz w:val="20"/>
+                <w:szCs w:val="20"/>
+              </w:rPr>
+            </w:pPr>
+            <w:r>
+              <w:rPr>
+                <w:b w:val="0"/>
+                <w:bCs w:val="0"/>
+                <w:i w:val="0"/>
+                <w:iCs w:val="0"/>
+                <w:sz w:val="20"/>
+                <w:szCs w:val="20"/>
+              </w:rPr>
+              <w:t>0.08</w:t>
+            </w:r>
+          </w:p>
+        </w:tc>
+        <w:tc>
+          <w:tcPr>
+            <w:tcW w:w="1134" w:type="dxa"/>
+          </w:tcPr>
+          <w:p>
+            <w:pPr>
+              <w:pStyle w:val="23"/>
+              <w:rPr>
+                <w:b w:val="0"/>
+                <w:bCs w:val="0"/>
+                <w:i w:val="0"/>
+                <w:iCs w:val="0"/>
+                <w:sz w:val="20"/>
+                <w:szCs w:val="20"/>
+              </w:rPr>
+            </w:pPr>
+            <w:r>
+              <w:rPr>
+                <w:b w:val="0"/>
+                <w:bCs w:val="0"/>
+                <w:i w:val="0"/>
+                <w:iCs w:val="0"/>
+                <w:sz w:val="20"/>
+                <w:szCs w:val="20"/>
+              </w:rPr>
+              <w:t>1.00</w:t>
+            </w:r>
+          </w:p>
+        </w:tc>
+        <w:tc>
+          <w:tcPr>
+            <w:tcW w:w="1559" w:type="dxa"/>
+          </w:tcPr>
+          <w:p>
+            <w:pPr>
+              <w:pStyle w:val="23"/>
+              <w:rPr>
+                <w:b w:val="0"/>
+                <w:bCs w:val="0"/>
+                <w:i w:val="0"/>
+                <w:iCs w:val="0"/>
+                <w:sz w:val="20"/>
+                <w:szCs w:val="20"/>
+              </w:rPr>
+            </w:pPr>
+            <w:r>
+              <w:rPr>
+                <w:b w:val="0"/>
+                <w:bCs w:val="0"/>
+                <w:i w:val="0"/>
+                <w:iCs w:val="0"/>
+                <w:sz w:val="20"/>
+                <w:szCs w:val="20"/>
+              </w:rPr>
+              <w:t>1.618283</w:t>
+            </w:r>
+          </w:p>
+        </w:tc>
+        <w:tc>
+          <w:tcPr>
+            <w:tcW w:w="2127" w:type="dxa"/>
+          </w:tcPr>
+          <w:p>
+            <w:pPr>
+              <w:pStyle w:val="23"/>
+              <w:rPr>
+                <w:b w:val="0"/>
+                <w:bCs w:val="0"/>
+                <w:i w:val="0"/>
+                <w:iCs w:val="0"/>
+                <w:sz w:val="20"/>
+                <w:szCs w:val="20"/>
+              </w:rPr>
+            </w:pPr>
+            <w:r>
+              <w:rPr>
+                <w:b w:val="0"/>
+                <w:bCs w:val="0"/>
+                <w:i w:val="0"/>
+                <w:iCs w:val="0"/>
+                <w:sz w:val="20"/>
+                <w:szCs w:val="20"/>
+              </w:rPr>
+              <w:t>0.947199</w:t>
+            </w:r>
+          </w:p>
+        </w:tc>
+        <w:tc>
+          <w:tcPr>
+            <w:tcW w:w="2409" w:type="dxa"/>
+          </w:tcPr>
+          <w:p>
+            <w:pPr>
+              <w:pStyle w:val="23"/>
+              <w:rPr>
+                <w:b w:val="0"/>
+                <w:bCs w:val="0"/>
+                <w:i w:val="0"/>
+                <w:iCs w:val="0"/>
+                <w:sz w:val="20"/>
+                <w:szCs w:val="20"/>
+              </w:rPr>
+            </w:pPr>
+            <w:r>
+              <w:rPr>
+                <w:b w:val="0"/>
+                <w:bCs w:val="0"/>
+                <w:i w:val="0"/>
+                <w:iCs w:val="0"/>
+                <w:sz w:val="20"/>
+                <w:szCs w:val="20"/>
+              </w:rPr>
+              <w:t>0.052801</w:t>
+            </w:r>
+          </w:p>
+        </w:tc>
+      </w:tr>
+    </w:tbl>
+    <w:p>
+      <w:pPr>
+        <w:pStyle w:val="23"/>
+        <w:rPr>
+          <w:lang w:val="en-US"/>
+        </w:rPr>
+      </w:pPr>
+    </w:p>
+    <w:tbl>
+      <w:tblPr>
+        <w:tblStyle w:val="af3"/>
+        <w:tblW w:w="0" w:type="auto"/>
+        <w:jc w:val="center"/>
+        <w:tblBorders>
+          <w:top w:val="none" w:sz="0" w:space="0" w:color="auto"/>
+          <w:left w:val="none" w:sz="0" w:space="0" w:color="auto"/>
+          <w:bottom w:val="none" w:sz="0" w:space="0" w:color="auto"/>
+          <w:right w:val="none" w:sz="0" w:space="0" w:color="auto"/>
+          <w:insideH w:val="none" w:sz="0" w:space="0" w:color="auto"/>
+          <w:insideV w:val="none" w:sz="0" w:space="0" w:color="auto"/>
+        </w:tblBorders>
+        <w:tblLook w:val="04A0" w:firstRow="1" w:lastRow="0" w:firstColumn="1" w:lastColumn="0" w:noHBand="0" w:noVBand="1"/>
+      </w:tblPr>
+      <w:tblGrid>
+        <w:gridCol w:w="3823"/>
+        <w:gridCol w:w="5913"/>
+      </w:tblGrid>
+      <w:tr>
+        <w:trPr>
+          <w:jc w:val="center"/>
+        </w:trPr>
+        <w:tc>
+          <w:tcPr>
+            <w:tcW w:w="3823" w:type="dxa"/>
+          </w:tcPr>
+          <w:p>
+            <w:pPr>
+              <w:rPr>
+                <w:rFonts w:ascii="Times New Roman" w:hAnsi="Times New Roman" w:cs="Times New Roman"/>
+                <w:b/>
+                <w:bCs/>
+                <w:sz w:val="24"/>
+                <w:szCs w:val="24"/>
+              </w:rPr>
+            </w:pPr>
+            <w:r>
+              <w:rPr>
+                <w:rFonts w:ascii="Times New Roman" w:hAnsi="Times New Roman" w:cs="Times New Roman"/>
+                <w:b/>
+                <w:bCs/>
+                <w:sz w:val="24"/>
+                <w:szCs w:val="24"/>
+              </w:rPr>
+              <w:t>Основная гипотеза:</w:t>
+            </w:r>
+          </w:p>
+        </w:tc>
+        <w:tc>
+          <w:tcPr>
+            <w:tcW w:w="5913" w:type="dxa"/>
+          </w:tcPr>
+          <w:p>
+            <w:pPr>
+              <w:jc w:val="center"/>
+              <w:rPr>
+                <w:rFonts w:ascii="Cambria Math" w:hAnsi="Cambria Math"/>
+                <w:sz w:val="24"/>
+                <w:szCs w:val="24"/>
+                <w:lang w:val="en-US"/>
+              </w:rPr>
+            </w:pPr>
+            <m:oMath>
+              <m:sSub>
+                <m:sSubPr>
+                  <m:ctrlPr>
+                    <w:rPr>
+                      <w:rFonts w:ascii="Cambria Math" w:hAnsi="Cambria Math"/>
+                      <w:sz w:val="24"/>
+                      <w:szCs w:val="24"/>
+                    </w:rPr>
+                  </m:ctrlPr>
+                </m:sSubPr>
+                <m:e>
+                  <m:r>
+                    <m:rPr>
+                      <m:sty m:val="p"/>
+                    </m:rPr>
+                    <w:rPr>
+                      <w:rFonts w:ascii="Cambria Math" w:hAnsi="Cambria Math"/>
+                      <w:sz w:val="24"/>
+                      <w:szCs w:val="24"/>
+                    </w:rPr>
+                    <m:t>H</m:t>
+                  </m:r>
+                </m:e>
+                <m:sub>
+                  <m:r>
+                    <m:rPr>
+                      <m:sty m:val="p"/>
+                    </m:rPr>
+                    <w:rPr>
+                      <w:rFonts w:ascii="Cambria Math" w:hAnsi="Cambria Math"/>
+                      <w:sz w:val="24"/>
+                      <w:szCs w:val="24"/>
+                    </w:rPr>
+                    <m:t>0</m:t>
+                  </m:r>
+                </m:sub>
+              </m:sSub>
+              <m:r>
+                <m:rPr>
+                  <m:sty m:val="p"/>
+                </m:rPr>
+                <w:rPr>
+                  <w:rFonts w:ascii="Cambria Math" w:hAnsi="Cambria Math"/>
+                  <w:sz w:val="24"/>
+                  <w:szCs w:val="24"/>
+                </w:rPr>
+                <m:t>:</m:t>
+              </m:r>
+            </m:oMath>
+            <w:r>
+              <w:rPr>
+                <w:rFonts w:ascii="Cambria Math" w:eastAsiaTheme="minorEastAsia" w:hAnsi="Cambria Math"/>
+                <w:sz w:val="24"/>
+                <w:szCs w:val="24"/>
+              </w:rPr>
+              <w:t xml:space="preserve"> </w:t>
+            </w:r>
+            <w:r>
+              <w:rPr>
+                <w:rFonts w:ascii="Times New Roman" w:hAnsi="Times New Roman" w:cs="Times New Roman"/>
+                <w:sz w:val="24"/>
+                <w:szCs w:val="24"/>
+              </w:rPr>
+              <w:t>распределение является нормальным</w:t>
+            </w:r>
+          </w:p>
+        </w:tc>
+      </w:tr>
+      <w:tr>
+        <w:trPr>
+          <w:jc w:val="center"/>
+        </w:trPr>
+        <w:tc>
+          <w:tcPr>
+            <w:tcW w:w="3823" w:type="dxa"/>
+          </w:tcPr>
+          <w:p>
+            <w:pPr>
+              <w:rPr>
+                <w:rFonts w:ascii="Times New Roman" w:hAnsi="Times New Roman" w:cs="Times New Roman"/>
+                <w:b/>
+                <w:bCs/>
+                <w:sz w:val="24"/>
+                <w:szCs w:val="24"/>
+              </w:rPr>
+            </w:pPr>
+            <w:r>
+              <w:rPr>
+                <w:rFonts w:ascii="Times New Roman" w:hAnsi="Times New Roman" w:cs="Times New Roman"/>
+                <w:b/>
+                <w:bCs/>
+                <w:sz w:val="24"/>
+                <w:szCs w:val="24"/>
+              </w:rPr>
+              <w:t>Максимальное отклонение</w:t>
+            </w:r>
+            <w:r>
+              <w:rPr>
+                <w:rFonts w:ascii="Times New Roman" w:hAnsi="Times New Roman" w:cs="Times New Roman"/>
+                <w:b/>
+                <w:bCs/>
+                <w:sz w:val="24"/>
+                <w:szCs w:val="24"/>
+              </w:rPr>
+              <w:t>:</w:t>
+            </w:r>
+          </w:p>
+        </w:tc>
+        <w:tc>
+          <w:tcPr>
+            <w:tcW w:w="5913" w:type="dxa"/>
+          </w:tcPr>
+          <w:p>
+            <w:pPr>
+              <w:rPr>
+                <w:rFonts w:ascii="Times New Roman" w:eastAsia="Aptos" w:hAnsi="Times New Roman" w:cs="Times New Roman"/>
+                <w:sz w:val="24"/>
+                <w:szCs w:val="24"/>
+              </w:rPr>
+            </w:pPr>
+            <m:oMathPara>
+              <m:oMath>
+                <m:r>
+                  <m:rPr>
+                    <m:sty m:val="p"/>
+                  </m:rPr>
+                  <w:rPr>
+                    <w:rFonts w:ascii="Cambria Math" w:hAnsi="Cambria Math"/>
+                    <w:sz w:val="24"/>
+                    <w:szCs w:val="24"/>
+                    <w:lang w:val="en-US"/>
+                  </w:rPr>
+                  <m:t>sup</m:t>
+                </m:r>
+                <m:sSub>
+                  <m:sSubPr>
+                    <m:ctrlPr>
+                      <w:rPr>
+                        <w:rFonts w:ascii="Cambria Math" w:hAnsi="Cambria Math"/>
+                        <w:sz w:val="24"/>
+                        <w:szCs w:val="24"/>
+                        <w:lang w:val="en-US"/>
+                      </w:rPr>
+                    </m:ctrlPr>
+                  </m:sSubPr>
+                  <m:e>
+                    <m:r>
+                      <m:rPr>
+                        <m:sty m:val="p"/>
+                      </m:rPr>
+                      <w:rPr>
+                        <w:rFonts w:ascii="Cambria Math" w:hAnsi="Cambria Math"/>
+                        <w:sz w:val="24"/>
+                        <w:szCs w:val="24"/>
+                        <w:lang w:val="en-US"/>
+                      </w:rPr>
+                      <m:t>∆</m:t>
+                    </m:r>
+                  </m:e>
+                  <m:sub>
+                    <m:r>
+                      <m:rPr>
+                        <m:sty m:val="p"/>
+                      </m:rPr>
+                      <w:rPr>
+                        <w:rFonts w:ascii="Cambria Math" w:hAnsi="Cambria Math"/>
+                        <w:sz w:val="24"/>
+                        <w:szCs w:val="24"/>
+                        <w:lang w:val="en-US"/>
+                      </w:rPr>
+                      <m:t>x</m:t>
+                    </m:r>
+                  </m:sub>
+                </m:sSub>
+                <m:r>
+                  <m:rPr>
+                    <m:sty m:val="p"/>
+                  </m:rPr>
+                  <w:rPr>
+                    <w:rFonts w:ascii="Cambria Math" w:hAnsi="Cambria Math"/>
+                    <w:sz w:val="24"/>
+                    <w:szCs w:val="24"/>
+                    <w:lang w:val="en-US"/>
+                  </w:rPr>
+                  <m:t xml:space="preserve"> </m:t>
+                </m:r>
+                <m:r>
+                  <m:rPr>
+                    <m:sty m:val="p"/>
+                  </m:rPr>
+                  <w:rPr>
+                    <w:rFonts w:ascii="Cambria Math" w:hAnsi="Cambria Math"/>
+                    <w:sz w:val="24"/>
+                    <w:szCs w:val="24"/>
+                    <w:lang w:val="en-US"/>
+                  </w:rPr>
+                  <m:t>= 0.</m:t>
+                </m:r>
+                <m:r>
+                  <m:rPr>
+                    <m:sty m:val="p"/>
+                  </m:rPr>
+                  <w:rPr>
+                    <w:rFonts w:ascii="Cambria Math" w:hAnsi="Cambria Math"/>
+                    <w:sz w:val="24"/>
+                    <w:szCs w:val="24"/>
+                  </w:rPr>
+                  <m:t>138</m:t>
+                </m:r>
+                <m:r>
+                  <m:rPr>
+                    <m:sty m:val="p"/>
+                  </m:rPr>
+                  <w:rPr>
+                    <w:rFonts w:ascii="Cambria Math" w:hAnsi="Cambria Math"/>
+                    <w:sz w:val="24"/>
+                    <w:szCs w:val="24"/>
+                    <w:lang w:val="en-US"/>
+                  </w:rPr>
+                  <m:t xml:space="preserve"> </m:t>
+                </m:r>
+              </m:oMath>
+            </m:oMathPara>
+          </w:p>
+        </w:tc>
+      </w:tr>
+      <w:tr>
+        <w:trPr>
+          <w:jc w:val="center"/>
+        </w:trPr>
+        <w:tc>
+          <w:tcPr>
+            <w:tcW w:w="3823" w:type="dxa"/>
+          </w:tcPr>
+          <w:p>
+            <w:pPr>
+              <w:rPr>
+                <w:rFonts w:ascii="Times New Roman" w:hAnsi="Times New Roman" w:cs="Times New Roman"/>
+                <w:b/>
+                <w:bCs/>
+                <w:sz w:val="24"/>
+                <w:szCs w:val="24"/>
+              </w:rPr>
+            </w:pPr>
+            <w:r>
+              <w:rPr>
+                <w:rFonts w:ascii="Times New Roman" w:hAnsi="Times New Roman" w:cs="Times New Roman"/>
+                <w:b/>
+                <w:bCs/>
+                <w:sz w:val="24"/>
+                <w:szCs w:val="24"/>
+              </w:rPr>
+              <w:t>Значение статистики критерия:</w:t>
+            </w:r>
+          </w:p>
+        </w:tc>
+        <w:tc>
+          <w:tcPr>
+            <w:tcW w:w="5913" w:type="dxa"/>
+          </w:tcPr>
+          <w:p>
+            <w:pPr>
+              <w:rPr>
+                <w:rFonts w:ascii="Cambria Math" w:hAnsi="Cambria Math"/>
+                <w:sz w:val="24"/>
+                <w:szCs w:val="24"/>
+              </w:rPr>
+            </w:pPr>
+            <m:oMathPara>
+              <m:oMath>
+                <m:sSub>
+                  <m:sSubPr>
+                    <m:ctrlPr>
+                      <w:rPr>
+                        <w:rFonts w:ascii="Cambria Math" w:hAnsi="Cambria Math"/>
+                        <w:sz w:val="24"/>
+                        <w:szCs w:val="24"/>
+                      </w:rPr>
+                    </m:ctrlPr>
+                  </m:sSubPr>
+                  <m:e>
+                    <m:r>
+                      <m:rPr>
+                        <m:sty m:val="p"/>
+                      </m:rPr>
+                      <w:rPr>
+                        <w:rFonts w:ascii="Cambria Math" w:hAnsi="Cambria Math"/>
+                        <w:sz w:val="24"/>
+                        <w:szCs w:val="24"/>
+                      </w:rPr>
+                      <m:t>λ</m:t>
+                    </m:r>
+                  </m:e>
+                  <m:sub>
+                    <m:r>
+                      <m:rPr>
+                        <m:sty m:val="p"/>
+                      </m:rPr>
+                      <w:rPr>
+                        <w:rFonts w:ascii="Cambria Math" w:hAnsi="Cambria Math"/>
+                        <w:sz w:val="24"/>
+                        <w:szCs w:val="24"/>
+                      </w:rPr>
+                      <m:t>набл.</m:t>
+                    </m:r>
+                  </m:sub>
+                </m:sSub>
+                <m:r>
+                  <m:rPr>
+                    <m:sty m:val="p"/>
+                  </m:rPr>
+                  <w:rPr>
+                    <w:rFonts w:ascii="Cambria Math" w:hAnsi="Cambria Math"/>
+                    <w:sz w:val="24"/>
+                    <w:szCs w:val="24"/>
+                  </w:rPr>
+                  <m:t xml:space="preserve">= </m:t>
+                </m:r>
+                <m:rad>
+                  <m:radPr>
+                    <m:degHide m:val="1"/>
+                    <m:ctrlPr>
+                      <w:rPr>
+                        <w:rFonts w:ascii="Cambria Math" w:hAnsi="Cambria Math"/>
+                        <w:sz w:val="24"/>
+                        <w:szCs w:val="24"/>
+                        <w:lang w:val="en-US"/>
+                      </w:rPr>
+                    </m:ctrlPr>
+                  </m:radPr>
+                  <m:deg/>
+                  <m:e>
+                    <m:r>
+                      <m:rPr>
+                        <m:sty m:val="p"/>
+                      </m:rPr>
+                      <w:rPr>
+                        <w:rFonts w:ascii="Cambria Math" w:hAnsi="Cambria Math"/>
+                        <w:sz w:val="24"/>
+                        <w:szCs w:val="24"/>
+                        <w:lang w:val="en-US"/>
+                      </w:rPr>
+                      <m:t>n</m:t>
+                    </m:r>
+                  </m:e>
+                </m:rad>
+                <m:r>
+                  <m:rPr>
+                    <m:sty m:val="p"/>
+                  </m:rPr>
+                  <w:rPr>
+                    <w:rFonts w:ascii="Cambria Math" w:hAnsi="Cambria Math"/>
+                    <w:sz w:val="24"/>
+                    <w:szCs w:val="24"/>
+                    <w:lang w:val="en-US"/>
+                  </w:rPr>
+                  <m:t>*sup</m:t>
+                </m:r>
+                <m:sSub>
+                  <m:sSubPr>
+                    <m:ctrlPr>
+                      <w:rPr>
+                        <w:rFonts w:ascii="Cambria Math" w:hAnsi="Cambria Math"/>
+                        <w:sz w:val="24"/>
+                        <w:szCs w:val="24"/>
+                        <w:lang w:val="en-US"/>
+                      </w:rPr>
+                    </m:ctrlPr>
+                  </m:sSubPr>
+                  <m:e>
+                    <m:r>
+                      <m:rPr>
+                        <m:sty m:val="p"/>
+                      </m:rPr>
+                      <w:rPr>
+                        <w:rFonts w:ascii="Cambria Math" w:hAnsi="Cambria Math"/>
+                        <w:sz w:val="24"/>
+                        <w:szCs w:val="24"/>
+                        <w:lang w:val="en-US"/>
+                      </w:rPr>
+                      <m:t>∆</m:t>
+                    </m:r>
+                  </m:e>
+                  <m:sub>
+                    <m:r>
+                      <m:rPr>
+                        <m:sty m:val="p"/>
+                      </m:rPr>
+                      <w:rPr>
+                        <w:rFonts w:ascii="Cambria Math" w:hAnsi="Cambria Math"/>
+                        <w:sz w:val="24"/>
+                        <w:szCs w:val="24"/>
+                        <w:lang w:val="en-US"/>
+                      </w:rPr>
+                      <m:t>x</m:t>
+                    </m:r>
+                  </m:sub>
+                </m:sSub>
+                <m:r>
+                  <m:rPr>
+                    <m:sty m:val="p"/>
+                  </m:rPr>
+                  <w:rPr>
+                    <w:rFonts w:ascii="Cambria Math" w:hAnsi="Cambria Math"/>
+                    <w:sz w:val="24"/>
+                    <w:szCs w:val="24"/>
+                  </w:rPr>
+                  <m:t xml:space="preserve"> </m:t>
+                </m:r>
+                <m:r>
+                  <m:rPr>
+                    <m:sty m:val="p"/>
+                  </m:rPr>
+                  <w:rPr>
+                    <w:rFonts w:ascii="Cambria Math" w:hAnsi="Cambria Math"/>
+                    <w:sz w:val="24"/>
+                    <w:szCs w:val="24"/>
+                  </w:rPr>
+                  <m:t xml:space="preserve">= 0.976 </m:t>
+                </m:r>
+              </m:oMath>
+            </m:oMathPara>
+          </w:p>
+        </w:tc>
+      </w:tr>
+      <w:tr>
+        <w:trPr>
+          <w:jc w:val="center"/>
+        </w:trPr>
+        <w:tc>
+          <w:tcPr>
+            <w:tcW w:w="3823" w:type="dxa"/>
+          </w:tcPr>
+          <w:p>
+            <w:pPr>
+              <w:rPr>
+                <w:rFonts w:ascii="Times New Roman" w:hAnsi="Times New Roman" w:cs="Times New Roman"/>
+                <w:b/>
+                <w:bCs/>
+                <w:sz w:val="24"/>
+                <w:szCs w:val="24"/>
+              </w:rPr>
+            </w:pPr>
+            <w:r>
+              <w:rPr>
+                <w:rFonts w:ascii="Times New Roman" w:hAnsi="Times New Roman" w:cs="Times New Roman"/>
+                <w:b/>
+                <w:bCs/>
+                <w:sz w:val="24"/>
+                <w:szCs w:val="24"/>
+              </w:rPr>
+              <w:t>Уровень значимости:</w:t>
+            </w:r>
+          </w:p>
+        </w:tc>
+        <w:tc>
+          <w:tcPr>
+            <w:tcW w:w="5913" w:type="dxa"/>
+          </w:tcPr>
+          <w:p>
+            <w:pPr>
+              <w:rPr>
+                <w:rFonts w:ascii="Cambria Math" w:hAnsi="Cambria Math"/>
+                <w:sz w:val="24"/>
+                <w:szCs w:val="24"/>
+              </w:rPr>
+            </w:pPr>
+            <m:oMathPara>
+              <m:oMath>
+                <m:r>
+                  <m:rPr>
+                    <m:sty m:val="p"/>
+                  </m:rPr>
+                  <w:rPr>
+                    <w:rFonts w:ascii="Cambria Math" w:hAnsi="Cambria Math"/>
+                    <w:sz w:val="24"/>
+                    <w:szCs w:val="24"/>
+                  </w:rPr>
+                  <m:t xml:space="preserve">α=0.02 </m:t>
+                </m:r>
+              </m:oMath>
+            </m:oMathPara>
+          </w:p>
+        </w:tc>
+      </w:tr>
+      <w:tr>
+        <w:trPr>
+          <w:jc w:val="center"/>
+        </w:trPr>
+        <w:tc>
+          <w:tcPr>
+            <w:tcW w:w="3823" w:type="dxa"/>
+          </w:tcPr>
+          <w:p>
+            <w:pPr>
+              <w:rPr>
+                <w:rFonts w:ascii="Times New Roman" w:hAnsi="Times New Roman" w:cs="Times New Roman"/>
+                <w:b/>
+                <w:bCs/>
+                <w:sz w:val="24"/>
+                <w:szCs w:val="24"/>
+              </w:rPr>
+            </w:pPr>
+            <w:r>
+              <w:rPr>
+                <w:rFonts w:ascii="Times New Roman" w:hAnsi="Times New Roman" w:cs="Times New Roman"/>
+                <w:b/>
+                <w:bCs/>
+                <w:sz w:val="24"/>
+                <w:szCs w:val="24"/>
+              </w:rPr>
+              <w:t>Критическое значение (квантиль):</w:t>
+            </w:r>
+          </w:p>
+        </w:tc>
+        <w:tc>
+          <w:tcPr>
+            <w:tcW w:w="5913" w:type="dxa"/>
+          </w:tcPr>
+          <w:p>
+            <w:pPr>
+              <w:rPr>
+                <w:rFonts w:ascii="Cambria Math" w:hAnsi="Cambria Math"/>
+                <w:sz w:val="24"/>
+                <w:szCs w:val="24"/>
+              </w:rPr>
+            </w:pPr>
+            <m:oMathPara>
+              <m:oMath>
+                <m:sSub>
+                  <m:sSubPr>
+                    <m:ctrlPr>
+                      <w:rPr>
+                        <w:rFonts w:ascii="Cambria Math" w:hAnsi="Cambria Math"/>
+                        <w:sz w:val="24"/>
+                        <w:szCs w:val="24"/>
+                      </w:rPr>
+                    </m:ctrlPr>
+                  </m:sSubPr>
+                  <m:e>
+                    <m:r>
+                      <m:rPr>
+                        <m:sty m:val="p"/>
+                      </m:rPr>
+                      <w:rPr>
+                        <w:rFonts w:ascii="Cambria Math" w:hAnsi="Cambria Math"/>
+                        <w:sz w:val="24"/>
+                        <w:szCs w:val="24"/>
+                      </w:rPr>
+                      <m:t>λ</m:t>
+                    </m:r>
+                  </m:e>
+                  <m:sub>
+                    <m:r>
+                      <m:rPr>
+                        <m:sty m:val="p"/>
+                      </m:rPr>
+                      <w:rPr>
+                        <w:rFonts w:ascii="Cambria Math" w:hAnsi="Cambria Math"/>
+                        <w:sz w:val="24"/>
+                        <w:szCs w:val="24"/>
+                      </w:rPr>
+                      <m:t>кр.</m:t>
+                    </m:r>
+                  </m:sub>
+                </m:sSub>
+                <m:r>
+                  <m:rPr>
+                    <m:sty m:val="p"/>
+                  </m:rPr>
+                  <w:rPr>
+                    <w:rFonts w:ascii="Cambria Math" w:hAnsi="Cambria Math"/>
+                    <w:sz w:val="24"/>
+                    <w:szCs w:val="24"/>
+                  </w:rPr>
+                  <m:t xml:space="preserve">=1.5174 </m:t>
+                </m:r>
+              </m:oMath>
+            </m:oMathPara>
+          </w:p>
+        </w:tc>
+      </w:tr>
+      <w:tr>
+        <w:trPr>
+          <w:jc w:val="center"/>
+        </w:trPr>
+        <w:tc>
+          <w:tcPr>
+            <w:tcW w:w="3823" w:type="dxa"/>
+          </w:tcPr>
+          <w:p>
+            <w:pPr>
+              <w:rPr>
+                <w:rFonts w:ascii="Times New Roman" w:hAnsi="Times New Roman" w:cs="Times New Roman"/>
+                <w:b/>
+                <w:bCs/>
+                <w:sz w:val="24"/>
+                <w:szCs w:val="24"/>
+              </w:rPr>
+            </w:pPr>
+            <w:r>
+              <w:rPr>
+                <w:rFonts w:ascii="Times New Roman" w:hAnsi="Times New Roman" w:cs="Times New Roman"/>
+                <w:b/>
+                <w:bCs/>
+                <w:sz w:val="24"/>
+                <w:szCs w:val="24"/>
+              </w:rPr>
+              <w:t>Вывод:</w:t>
+            </w:r>
+          </w:p>
+        </w:tc>
+        <w:tc>
+          <w:tcPr>
+            <w:tcW w:w="5913" w:type="dxa"/>
+          </w:tcPr>
+          <w:p>
+            <w:pPr>
+              <w:jc w:val="center"/>
+              <w:rPr>
+                <w:rFonts w:ascii="Cambria Math" w:hAnsi="Cambria Math"/>
+                <w:sz w:val="24"/>
+                <w:szCs w:val="24"/>
+              </w:rPr>
+            </w:pPr>
+            <w:r>
+              <w:rPr>
+                <w:rFonts w:ascii="Times New Roman" w:hAnsi="Times New Roman" w:cs="Times New Roman"/>
+                <w:sz w:val="24"/>
+                <w:szCs w:val="24"/>
+              </w:rPr>
+              <w:t>Гипотеза</w:t>
+            </w:r>
+            <w:r>
+              <w:rPr>
+                <w:rFonts w:ascii="Times New Roman" w:hAnsi="Times New Roman" w:cs="Times New Roman"/>
+                <w:sz w:val="24"/>
+                <w:szCs w:val="24"/>
+                <w:lang w:val="en-US"/>
+              </w:rPr>
+              <w:t xml:space="preserve"> </w:t>
+            </w:r>
+            <w:r>
+              <w:rPr>
+                <w:rFonts w:ascii="Times New Roman" w:hAnsi="Times New Roman" w:cs="Times New Roman"/>
+                <w:sz w:val="24"/>
+                <w:szCs w:val="24"/>
+              </w:rPr>
+              <w:t>принимается</w:t>
             </w:r>
           </w:p>
         </w:tc>

</xml_diff>

<commit_message>
edit graphs theoretical & empirical distribution function
</commit_message>
<xml_diff>
--- a/report.docx
+++ b/report.docx
@@ -323,10 +323,8 @@
         <w:pStyle w:val="23"/>
         <w:jc w:val="both"/>
         <w:rPr>
-          <w:b w:val="0"/>
-          <w:bCs w:val="0"/>
+          <w:rFonts w:eastAsiaTheme="minorEastAsia"/>
           <w:i w:val="0"/>
-          <w:iCs w:val="0"/>
           <w:sz w:val="24"/>
           <w:szCs w:val="24"/>
         </w:rPr>
@@ -603,6 +601,20 @@
         <w:pStyle w:val="23"/>
         <w:jc w:val="both"/>
         <w:rPr>
+          <w:b w:val="0"/>
+          <w:bCs w:val="0"/>
+          <w:i w:val="0"/>
+          <w:iCs w:val="0"/>
+          <w:sz w:val="24"/>
+          <w:szCs w:val="24"/>
+        </w:rPr>
+      </w:pPr>
+    </w:p>
+    <w:p>
+      <w:pPr>
+        <w:pStyle w:val="23"/>
+        <w:jc w:val="both"/>
+        <w:rPr>
           <w:sz w:val="26"/>
           <w:szCs w:val="26"/>
         </w:rPr>
@@ -707,7 +719,7 @@
             <m:oMath>
               <m:r>
                 <m:rPr>
-                  <m:sty m:val="p"/>
+                  <m:sty m:val="bi"/>
                 </m:rPr>
                 <w:rPr>
                   <w:rFonts w:ascii="Cambria Math" w:hAnsi="Cambria Math"/>
@@ -718,7 +730,7 @@
               </m:r>
               <m:r>
                 <m:rPr>
-                  <m:sty m:val="p"/>
+                  <m:sty m:val="bi"/>
                 </m:rPr>
                 <w:rPr>
                   <w:rFonts w:ascii="Cambria Math" w:hAnsi="Cambria Math"/>
@@ -730,7 +742,7 @@
               </m:r>
               <m:r>
                 <m:rPr>
-                  <m:sty m:val="p"/>
+                  <m:sty m:val="bi"/>
                 </m:rPr>
                 <w:rPr>
                   <w:rFonts w:ascii="Cambria Math" w:hAnsi="Cambria Math"/>
@@ -741,7 +753,7 @@
               </m:r>
               <m:r>
                 <m:rPr>
-                  <m:sty m:val="p"/>
+                  <m:sty m:val="bi"/>
                 </m:rPr>
                 <w:rPr>
                   <w:rFonts w:ascii="Cambria Math" w:hAnsi="Cambria Math"/>
@@ -752,7 +764,7 @@
               </m:r>
               <m:r>
                 <m:rPr>
-                  <m:sty m:val="p"/>
+                  <m:sty m:val="bi"/>
                 </m:rPr>
                 <w:rPr>
                   <w:rFonts w:ascii="Cambria Math" w:hAnsi="Cambria Math"/>
@@ -764,7 +776,7 @@
               </m:r>
               <m:r>
                 <m:rPr>
-                  <m:sty m:val="p"/>
+                  <m:sty m:val="bi"/>
                 </m:rPr>
                 <w:rPr>
                   <w:rFonts w:ascii="Cambria Math" w:hAnsi="Cambria Math"/>
@@ -775,7 +787,7 @@
               </m:r>
               <m:r>
                 <m:rPr>
-                  <m:sty m:val="p"/>
+                  <m:sty m:val="bi"/>
                 </m:rPr>
                 <w:rPr>
                   <w:rFonts w:ascii="Cambria Math" w:hAnsi="Cambria Math"/>
@@ -860,7 +872,7 @@
                   <m:e>
                     <m:r>
                       <m:rPr>
-                        <m:sty m:val="p"/>
+                        <m:sty m:val="bi"/>
                       </m:rPr>
                       <w:rPr>
                         <w:rFonts w:ascii="Cambria Math" w:hAnsi="Cambria Math"/>
@@ -873,7 +885,7 @@
                   <m:sub>
                     <m:r>
                       <m:rPr>
-                        <m:sty m:val="p"/>
+                        <m:sty m:val="bi"/>
                       </m:rPr>
                       <w:rPr>
                         <w:rFonts w:ascii="Cambria Math" w:hAnsi="Cambria Math"/>
@@ -886,7 +898,7 @@
                   <m:sup>
                     <m:r>
                       <m:rPr>
-                        <m:sty m:val="p"/>
+                        <m:sty m:val="bi"/>
                       </m:rPr>
                       <w:rPr>
                         <w:rFonts w:ascii="Cambria Math" w:hAnsi="Cambria Math"/>
@@ -899,7 +911,7 @@
                 </m:sSubSup>
                 <m:r>
                   <m:rPr>
-                    <m:sty m:val="p"/>
+                    <m:sty m:val="bi"/>
                   </m:rPr>
                   <w:rPr>
                     <w:rFonts w:ascii="Cambria Math" w:hAnsi="Cambria Math"/>
@@ -910,7 +922,7 @@
                 </m:r>
                 <m:r>
                   <m:rPr>
-                    <m:sty m:val="p"/>
+                    <m:sty m:val="bi"/>
                   </m:rPr>
                   <w:rPr>
                     <w:rFonts w:ascii="Cambria Math" w:hAnsi="Cambria Math"/>
@@ -938,7 +950,7 @@
                   <m:num>
                     <m:r>
                       <m:rPr>
-                        <m:sty m:val="p"/>
+                        <m:sty m:val="bi"/>
                       </m:rPr>
                       <w:rPr>
                         <w:rFonts w:ascii="Cambria Math" w:hAnsi="Cambria Math"/>
@@ -950,7 +962,7 @@
                     </m:r>
                     <m:r>
                       <m:rPr>
-                        <m:sty m:val="p"/>
+                        <m:sty m:val="bi"/>
                       </m:rPr>
                       <w:rPr>
                         <w:rFonts w:ascii="Cambria Math" w:hAnsi="Cambria Math"/>
@@ -961,7 +973,7 @@
                     </m:r>
                     <m:r>
                       <m:rPr>
-                        <m:sty m:val="p"/>
+                        <m:sty m:val="bi"/>
                       </m:rPr>
                       <w:rPr>
                         <w:rFonts w:ascii="Cambria Math" w:hAnsi="Cambria Math"/>
@@ -973,7 +985,7 @@
                     </m:r>
                     <m:r>
                       <m:rPr>
-                        <m:sty m:val="p"/>
+                        <m:sty m:val="bi"/>
                       </m:rPr>
                       <w:rPr>
                         <w:rFonts w:ascii="Cambria Math" w:hAnsi="Cambria Math"/>
@@ -986,7 +998,7 @@
                   <m:den>
                     <m:r>
                       <m:rPr>
-                        <m:sty m:val="p"/>
+                        <m:sty m:val="bi"/>
                       </m:rPr>
                       <w:rPr>
                         <w:rFonts w:ascii="Cambria Math" w:hAnsi="Cambria Math"/>
@@ -1048,7 +1060,7 @@
               <m:oMath>
                 <m:r>
                   <m:rPr>
-                    <m:sty m:val="p"/>
+                    <m:sty m:val="bi"/>
                   </m:rPr>
                   <w:rPr>
                     <w:rFonts w:ascii="Cambria Math" w:hAnsi="Cambria Math"/>
@@ -1060,7 +1072,7 @@
                 </m:r>
                 <m:r>
                   <m:rPr>
-                    <m:sty m:val="p"/>
+                    <m:sty m:val="bi"/>
                   </m:rPr>
                   <w:rPr>
                     <w:rFonts w:ascii="Cambria Math" w:hAnsi="Cambria Math"/>
@@ -1116,7 +1128,7 @@
             <m:oMath>
               <m:r>
                 <m:rPr>
-                  <m:sty m:val="p"/>
+                  <m:sty m:val="bi"/>
                 </m:rPr>
                 <w:rPr>
                   <w:rFonts w:ascii="Cambria Math" w:hAnsi="Cambria Math"/>
@@ -1128,7 +1140,7 @@
               </m:r>
               <m:r>
                 <m:rPr>
-                  <m:sty m:val="p"/>
+                  <m:sty m:val="bi"/>
                 </m:rPr>
                 <w:rPr>
                   <w:rFonts w:ascii="Cambria Math" w:hAnsi="Cambria Math"/>
@@ -1154,7 +1166,7 @@
             <m:oMath>
               <m:r>
                 <m:rPr>
-                  <m:sty m:val="p"/>
+                  <m:sty m:val="bi"/>
                 </m:rPr>
                 <w:rPr>
                   <w:rFonts w:ascii="Cambria Math" w:hAnsi="Cambria Math"/>
@@ -1181,7 +1193,7 @@
                 <m:num>
                   <m:r>
                     <m:rPr>
-                      <m:sty m:val="p"/>
+                      <m:sty m:val="bi"/>
                     </m:rPr>
                     <w:rPr>
                       <w:rFonts w:ascii="Cambria Math" w:hAnsi="Cambria Math"/>
@@ -1193,7 +1205,7 @@
                   </m:r>
                   <m:r>
                     <m:rPr>
-                      <m:sty m:val="p"/>
+                      <m:sty m:val="bi"/>
                     </m:rPr>
                     <w:rPr>
                       <w:rFonts w:ascii="Cambria Math" w:hAnsi="Cambria Math"/>
@@ -1206,7 +1218,7 @@
                 <m:den>
                   <m:r>
                     <m:rPr>
-                      <m:sty m:val="p"/>
+                      <m:sty m:val="bi"/>
                     </m:rPr>
                     <w:rPr>
                       <w:rFonts w:ascii="Cambria Math" w:hAnsi="Cambria Math"/>
@@ -1281,7 +1293,7 @@
                   <m:e>
                     <m:r>
                       <m:rPr>
-                        <m:sty m:val="p"/>
+                        <m:sty m:val="bi"/>
                       </m:rPr>
                       <w:rPr>
                         <w:rFonts w:ascii="Cambria Math" w:hAnsi="Cambria Math"/>
@@ -1295,7 +1307,7 @@
                   <m:sub>
                     <m:r>
                       <m:rPr>
-                        <m:sty m:val="p"/>
+                        <m:sty m:val="bi"/>
                       </m:rPr>
                       <w:rPr>
                         <w:rFonts w:ascii="Cambria Math" w:hAnsi="Cambria Math"/>
@@ -1309,7 +1321,7 @@
                   <m:sup>
                     <m:r>
                       <m:rPr>
-                        <m:sty m:val="p"/>
+                        <m:sty m:val="bi"/>
                       </m:rPr>
                       <w:rPr>
                         <w:rFonts w:ascii="Cambria Math" w:hAnsi="Cambria Math"/>
@@ -1338,31 +1350,20 @@
                   <m:e>
                     <m:r>
                       <m:rPr>
-                        <m:sty m:val="p"/>
+                        <m:sty m:val="bi"/>
                       </m:rPr>
                       <w:rPr>
                         <w:rFonts w:ascii="Cambria Math" w:hAnsi="Cambria Math"/>
                         <w:sz w:val="24"/>
                         <w:szCs w:val="24"/>
                       </w:rPr>
-                      <m:t>(</m:t>
-                    </m:r>
-                    <m:r>
-                      <m:rPr>
-                        <m:sty m:val="p"/>
-                      </m:rPr>
-                      <w:rPr>
-                        <w:rFonts w:ascii="Cambria Math" w:hAnsi="Cambria Math"/>
-                        <w:sz w:val="24"/>
-                        <w:szCs w:val="24"/>
-                      </w:rPr>
-                      <m:t>x</m:t>
+                      <m:t>(x</m:t>
                     </m:r>
                   </m:e>
                   <m:sub>
                     <m:r>
                       <m:rPr>
-                        <m:sty m:val="p"/>
+                        <m:sty m:val="bi"/>
                       </m:rPr>
                       <w:rPr>
                         <w:rFonts w:ascii="Cambria Math" w:hAnsi="Cambria Math"/>
@@ -1375,7 +1376,7 @@
                   <m:sup>
                     <m:r>
                       <m:rPr>
-                        <m:sty m:val="p"/>
+                        <m:sty m:val="bi"/>
                       </m:rPr>
                       <w:rPr>
                         <w:rFonts w:ascii="Cambria Math" w:hAnsi="Cambria Math"/>
@@ -1388,7 +1389,7 @@
                 </m:sSubSup>
                 <m:r>
                   <m:rPr>
-                    <m:sty m:val="p"/>
+                    <m:sty m:val="bi"/>
                   </m:rPr>
                   <w:rPr>
                     <w:rFonts w:ascii="Cambria Math" w:hAnsi="Cambria Math"/>
@@ -1444,7 +1445,7 @@
             <m:oMath>
               <m:r>
                 <m:rPr>
-                  <m:sty m:val="p"/>
+                  <m:sty m:val="bi"/>
                 </m:rPr>
                 <w:rPr>
                   <w:rFonts w:ascii="Cambria Math" w:hAnsi="Cambria Math"/>
@@ -1455,7 +1456,7 @@
               </m:r>
               <m:r>
                 <m:rPr>
-                  <m:sty m:val="p"/>
+                  <m:sty m:val="bi"/>
                 </m:rPr>
                 <w:rPr>
                   <w:rFonts w:ascii="Cambria Math" w:hAnsi="Cambria Math"/>
@@ -1481,7 +1482,7 @@
             <m:oMath>
               <m:r>
                 <m:rPr>
-                  <m:sty m:val="p"/>
+                  <m:sty m:val="bi"/>
                 </m:rPr>
                 <w:rPr>
                   <w:rFonts w:ascii="Cambria Math" w:hAnsi="Cambria Math"/>
@@ -1508,7 +1509,7 @@
                 <m:num>
                   <m:r>
                     <m:rPr>
-                      <m:sty m:val="p"/>
+                      <m:sty m:val="bi"/>
                     </m:rPr>
                     <w:rPr>
                       <w:rFonts w:ascii="Cambria Math" w:hAnsi="Cambria Math"/>
@@ -1520,7 +1521,7 @@
                   </m:r>
                   <m:r>
                     <m:rPr>
-                      <m:sty m:val="p"/>
+                      <m:sty m:val="bi"/>
                     </m:rPr>
                     <w:rPr>
                       <w:rFonts w:ascii="Cambria Math" w:hAnsi="Cambria Math"/>
@@ -1531,7 +1532,7 @@
                   </m:r>
                   <m:r>
                     <m:rPr>
-                      <m:sty m:val="p"/>
+                      <m:sty m:val="bi"/>
                     </m:rPr>
                     <w:rPr>
                       <w:rFonts w:ascii="Cambria Math" w:hAnsi="Cambria Math"/>
@@ -1545,7 +1546,7 @@
                 <m:den>
                   <m:r>
                     <m:rPr>
-                      <m:sty m:val="p"/>
+                      <m:sty m:val="bi"/>
                     </m:rPr>
                     <w:rPr>
                       <w:rFonts w:ascii="Cambria Math" w:hAnsi="Cambria Math"/>
@@ -1558,7 +1559,7 @@
               </m:f>
               <m:r>
                 <m:rPr>
-                  <m:sty m:val="p"/>
+                  <m:sty m:val="bi"/>
                 </m:rPr>
                 <w:rPr>
                   <w:rFonts w:ascii="Cambria Math" w:hAnsi="Cambria Math"/>
@@ -3144,10 +3145,10 @@
           <w:lang w:val="en-US"/>
         </w:rPr>
         <w:drawing>
-          <wp:inline distT="0" distB="0" distL="0" distR="0" wp14:anchorId="33DBC870" wp14:editId="48AB959F">
-            <wp:extent cx="4777740" cy="3583305"/>
-            <wp:effectExtent l="0" t="0" r="3810" b="0"/>
-            <wp:docPr id="49735004" name="Рисунок 1" descr="Изображение выглядит как диаграмма, линия, График, текст&#10;&#10;Содержимое, созданное искусственным интеллектом, может быть неверным."/>
+          <wp:inline distT="0" distB="0" distL="0" distR="0" wp14:anchorId="4446309A" wp14:editId="068BD88E">
+            <wp:extent cx="5161358" cy="3869478"/>
+            <wp:effectExtent l="0" t="0" r="1270" b="0"/>
+            <wp:docPr id="1304626543" name="Рисунок 1"/>
             <wp:cNvGraphicFramePr>
               <a:graphicFrameLocks xmlns:a="http://schemas.openxmlformats.org/drawingml/2006/main" noChangeAspect="1"/>
             </wp:cNvGraphicFramePr>
@@ -3155,29 +3156,36 @@
               <a:graphicData uri="http://schemas.openxmlformats.org/drawingml/2006/picture">
                 <pic:pic xmlns:pic="http://schemas.openxmlformats.org/drawingml/2006/picture">
                   <pic:nvPicPr>
-                    <pic:cNvPr id="49735004" name="Рисунок 1" descr="Изображение выглядит как диаграмма, линия, График, текст&#10;&#10;Содержимое, созданное искусственным интеллектом, может быть неверным."/>
-                    <pic:cNvPicPr/>
+                    <pic:cNvPr id="0" name="Picture 1"/>
+                    <pic:cNvPicPr>
+                      <a:picLocks noChangeAspect="1" noChangeArrowheads="1"/>
+                    </pic:cNvPicPr>
                   </pic:nvPicPr>
                   <pic:blipFill>
-                    <a:blip r:embed="rId4">
+                    <a:blip r:embed="rId5">
                       <a:extLst>
                         <a:ext uri="{28A0092B-C50C-407E-A947-70E740481C1C}">
                           <a14:useLocalDpi xmlns:a14="http://schemas.microsoft.com/office/drawing/2010/main" val="0"/>
                         </a:ext>
                       </a:extLst>
                     </a:blip>
+                    <a:srcRect/>
                     <a:stretch>
                       <a:fillRect/>
                     </a:stretch>
                   </pic:blipFill>
-                  <pic:spPr>
+                  <pic:spPr bwMode="auto">
                     <a:xfrm>
                       <a:off x="0" y="0"/>
-                      <a:ext cx="4777752" cy="3583314"/>
+                      <a:ext cx="5172760" cy="3878026"/>
                     </a:xfrm>
                     <a:prstGeom prst="rect">
                       <a:avLst/>
                     </a:prstGeom>
+                    <a:noFill/>
+                    <a:ln>
+                      <a:noFill/>
+                    </a:ln>
                   </pic:spPr>
                 </pic:pic>
               </a:graphicData>
@@ -3245,12 +3253,11 @@
           <w:szCs w:val="24"/>
           <w:lang w:val="en-US"/>
         </w:rPr>
-        <w:lastRenderedPageBreak/>
         <w:drawing>
-          <wp:inline distT="0" distB="0" distL="0" distR="0" wp14:anchorId="43B3ADFA" wp14:editId="47038F54">
-            <wp:extent cx="4776000" cy="3582000"/>
-            <wp:effectExtent l="0" t="0" r="5715" b="0"/>
-            <wp:docPr id="1482541008" name="Рисунок 2" descr="Изображение выглядит как текст, диаграмма, линия, График&#10;&#10;Содержимое, созданное искусственным интеллектом, может быть неверным."/>
+          <wp:inline distT="0" distB="0" distL="0" distR="0" wp14:anchorId="05249C1E" wp14:editId="0FAFAF98">
+            <wp:extent cx="5162054" cy="3870000"/>
+            <wp:effectExtent l="0" t="0" r="635" b="0"/>
+            <wp:docPr id="900766211" name="Рисунок 2"/>
             <wp:cNvGraphicFramePr>
               <a:graphicFrameLocks xmlns:a="http://schemas.openxmlformats.org/drawingml/2006/main" noChangeAspect="1"/>
             </wp:cNvGraphicFramePr>
@@ -3258,29 +3265,36 @@
               <a:graphicData uri="http://schemas.openxmlformats.org/drawingml/2006/picture">
                 <pic:pic xmlns:pic="http://schemas.openxmlformats.org/drawingml/2006/picture">
                   <pic:nvPicPr>
-                    <pic:cNvPr id="1482541008" name="Рисунок 2" descr="Изображение выглядит как текст, диаграмма, линия, График&#10;&#10;Содержимое, созданное искусственным интеллектом, может быть неверным."/>
-                    <pic:cNvPicPr/>
+                    <pic:cNvPr id="0" name="Picture 2"/>
+                    <pic:cNvPicPr>
+                      <a:picLocks noChangeAspect="1" noChangeArrowheads="1"/>
+                    </pic:cNvPicPr>
                   </pic:nvPicPr>
                   <pic:blipFill>
-                    <a:blip r:embed="rId5">
+                    <a:blip r:embed="rId6">
                       <a:extLst>
                         <a:ext uri="{28A0092B-C50C-407E-A947-70E740481C1C}">
                           <a14:useLocalDpi xmlns:a14="http://schemas.microsoft.com/office/drawing/2010/main" val="0"/>
                         </a:ext>
                       </a:extLst>
                     </a:blip>
+                    <a:srcRect/>
                     <a:stretch>
                       <a:fillRect/>
                     </a:stretch>
                   </pic:blipFill>
-                  <pic:spPr>
+                  <pic:spPr bwMode="auto">
                     <a:xfrm>
                       <a:off x="0" y="0"/>
-                      <a:ext cx="4776000" cy="3582000"/>
+                      <a:ext cx="5162054" cy="3870000"/>
                     </a:xfrm>
                     <a:prstGeom prst="rect">
                       <a:avLst/>
                     </a:prstGeom>
+                    <a:noFill/>
+                    <a:ln>
+                      <a:noFill/>
+                    </a:ln>
                   </pic:spPr>
                 </pic:pic>
               </a:graphicData>
@@ -3349,10 +3363,10 @@
           <w:lang w:val="en-US"/>
         </w:rPr>
         <w:drawing>
-          <wp:inline distT="0" distB="0" distL="0" distR="0" wp14:anchorId="2E9E0810" wp14:editId="61F69102">
-            <wp:extent cx="4776000" cy="3582000"/>
-            <wp:effectExtent l="0" t="0" r="5715" b="0"/>
-            <wp:docPr id="1044501086" name="Рисунок 3" descr="Изображение выглядит как текст, снимок экрана, диаграмма, линия&#10;&#10;Содержимое, созданное искусственным интеллектом, может быть неверным."/>
+          <wp:inline distT="0" distB="0" distL="0" distR="0" wp14:anchorId="44EEF7C0" wp14:editId="45B8AA49">
+            <wp:extent cx="5162054" cy="3870000"/>
+            <wp:effectExtent l="0" t="0" r="635" b="0"/>
+            <wp:docPr id="1831840494" name="Рисунок 3"/>
             <wp:cNvGraphicFramePr>
               <a:graphicFrameLocks xmlns:a="http://schemas.openxmlformats.org/drawingml/2006/main" noChangeAspect="1"/>
             </wp:cNvGraphicFramePr>
@@ -3360,29 +3374,36 @@
               <a:graphicData uri="http://schemas.openxmlformats.org/drawingml/2006/picture">
                 <pic:pic xmlns:pic="http://schemas.openxmlformats.org/drawingml/2006/picture">
                   <pic:nvPicPr>
-                    <pic:cNvPr id="1044501086" name="Рисунок 3" descr="Изображение выглядит как текст, снимок экрана, диаграмма, линия&#10;&#10;Содержимое, созданное искусственным интеллектом, может быть неверным."/>
-                    <pic:cNvPicPr/>
+                    <pic:cNvPr id="0" name="Picture 3"/>
+                    <pic:cNvPicPr>
+                      <a:picLocks noChangeAspect="1" noChangeArrowheads="1"/>
+                    </pic:cNvPicPr>
                   </pic:nvPicPr>
                   <pic:blipFill>
-                    <a:blip r:embed="rId6">
+                    <a:blip r:embed="rId7">
                       <a:extLst>
                         <a:ext uri="{28A0092B-C50C-407E-A947-70E740481C1C}">
                           <a14:useLocalDpi xmlns:a14="http://schemas.microsoft.com/office/drawing/2010/main" val="0"/>
                         </a:ext>
                       </a:extLst>
                     </a:blip>
+                    <a:srcRect/>
                     <a:stretch>
                       <a:fillRect/>
                     </a:stretch>
                   </pic:blipFill>
-                  <pic:spPr>
+                  <pic:spPr bwMode="auto">
                     <a:xfrm>
                       <a:off x="0" y="0"/>
-                      <a:ext cx="4776000" cy="3582000"/>
+                      <a:ext cx="5162054" cy="3870000"/>
                     </a:xfrm>
                     <a:prstGeom prst="rect">
                       <a:avLst/>
                     </a:prstGeom>
+                    <a:noFill/>
+                    <a:ln>
+                      <a:noFill/>
+                    </a:ln>
                   </pic:spPr>
                 </pic:pic>
               </a:graphicData>
@@ -3452,10 +3473,10 @@
         </w:rPr>
         <w:lastRenderedPageBreak/>
         <w:drawing>
-          <wp:inline distT="0" distB="0" distL="0" distR="0" wp14:anchorId="0D3784CC" wp14:editId="017D2E8F">
-            <wp:extent cx="4776000" cy="3582000"/>
-            <wp:effectExtent l="0" t="0" r="5715" b="0"/>
-            <wp:docPr id="224470217" name="Рисунок 4" descr="Изображение выглядит как текст, линия, График, диаграмма&#10;&#10;Содержимое, созданное искусственным интеллектом, может быть неверным."/>
+          <wp:inline distT="0" distB="0" distL="0" distR="0" wp14:anchorId="5DED19C3" wp14:editId="50C59A30">
+            <wp:extent cx="5162054" cy="3870000"/>
+            <wp:effectExtent l="0" t="0" r="635" b="0"/>
+            <wp:docPr id="595197764" name="Рисунок 4"/>
             <wp:cNvGraphicFramePr>
               <a:graphicFrameLocks xmlns:a="http://schemas.openxmlformats.org/drawingml/2006/main" noChangeAspect="1"/>
             </wp:cNvGraphicFramePr>
@@ -3463,29 +3484,36 @@
               <a:graphicData uri="http://schemas.openxmlformats.org/drawingml/2006/picture">
                 <pic:pic xmlns:pic="http://schemas.openxmlformats.org/drawingml/2006/picture">
                   <pic:nvPicPr>
-                    <pic:cNvPr id="224470217" name="Рисунок 4" descr="Изображение выглядит как текст, линия, График, диаграмма&#10;&#10;Содержимое, созданное искусственным интеллектом, может быть неверным."/>
-                    <pic:cNvPicPr/>
+                    <pic:cNvPr id="0" name="Picture 4"/>
+                    <pic:cNvPicPr>
+                      <a:picLocks noChangeAspect="1" noChangeArrowheads="1"/>
+                    </pic:cNvPicPr>
                   </pic:nvPicPr>
                   <pic:blipFill>
-                    <a:blip r:embed="rId7">
+                    <a:blip r:embed="rId8">
                       <a:extLst>
                         <a:ext uri="{28A0092B-C50C-407E-A947-70E740481C1C}">
                           <a14:useLocalDpi xmlns:a14="http://schemas.microsoft.com/office/drawing/2010/main" val="0"/>
                         </a:ext>
                       </a:extLst>
                     </a:blip>
+                    <a:srcRect/>
                     <a:stretch>
                       <a:fillRect/>
                     </a:stretch>
                   </pic:blipFill>
-                  <pic:spPr>
+                  <pic:spPr bwMode="auto">
                     <a:xfrm>
                       <a:off x="0" y="0"/>
-                      <a:ext cx="4776000" cy="3582000"/>
+                      <a:ext cx="5162054" cy="3870000"/>
                     </a:xfrm>
                     <a:prstGeom prst="rect">
                       <a:avLst/>
                     </a:prstGeom>
+                    <a:noFill/>
+                    <a:ln>
+                      <a:noFill/>
+                    </a:ln>
                   </pic:spPr>
                 </pic:pic>
               </a:graphicData>
@@ -3498,14 +3526,6 @@
       <w:pPr>
         <w:pStyle w:val="af4"/>
         <w:jc w:val="center"/>
-        <w:rPr>
-          <w:b/>
-          <w:bCs/>
-          <w:i w:val="0"/>
-          <w:iCs w:val="0"/>
-          <w:sz w:val="24"/>
-          <w:szCs w:val="24"/>
-        </w:rPr>
       </w:pPr>
       <w:r>
         <w:t xml:space="preserve">Рисунок </w:t>
@@ -3519,142 +3539,13 @@
         </w:r>
       </w:fldSimple>
       <w:r>
-        <w:t>. Эмпирическая функция распределения</w:t>
+        <w:t xml:space="preserve">. </w:t>
+      </w:r>
+      <w:r>
+        <w:t>Сравнение функций распределения</w:t>
       </w:r>
     </w:p>
-    <w:p>
-      <w:pPr>
-        <w:pStyle w:val="23"/>
-        <w:keepNext/>
-      </w:pPr>
-      <w:r>
-        <w:rPr>
-          <w:b w:val="0"/>
-          <w:bCs w:val="0"/>
-          <w:i w:val="0"/>
-          <w:iCs w:val="0"/>
-          <w:noProof/>
-          <w:sz w:val="24"/>
-          <w:szCs w:val="24"/>
-        </w:rPr>
-        <w:drawing>
-          <wp:inline distT="0" distB="0" distL="0" distR="0" wp14:anchorId="74358679" wp14:editId="5E556045">
-            <wp:extent cx="4937760" cy="3703320"/>
-            <wp:effectExtent l="0" t="0" r="0" b="0"/>
-            <wp:docPr id="826064790" name="Рисунок 1" descr="Изображение выглядит как текст, линия, График, диаграмма&#10;&#10;Содержимое, созданное искусственным интеллектом, может быть неверным."/>
-            <wp:cNvGraphicFramePr>
-              <a:graphicFrameLocks xmlns:a="http://schemas.openxmlformats.org/drawingml/2006/main" noChangeAspect="1"/>
-            </wp:cNvGraphicFramePr>
-            <a:graphic xmlns:a="http://schemas.openxmlformats.org/drawingml/2006/main">
-              <a:graphicData uri="http://schemas.openxmlformats.org/drawingml/2006/picture">
-                <pic:pic xmlns:pic="http://schemas.openxmlformats.org/drawingml/2006/picture">
-                  <pic:nvPicPr>
-                    <pic:cNvPr id="826064790" name="Рисунок 1" descr="Изображение выглядит как текст, линия, График, диаграмма&#10;&#10;Содержимое, созданное искусственным интеллектом, может быть неверным."/>
-                    <pic:cNvPicPr/>
-                  </pic:nvPicPr>
-                  <pic:blipFill>
-                    <a:blip r:embed="rId8">
-                      <a:extLst>
-                        <a:ext uri="{28A0092B-C50C-407E-A947-70E740481C1C}">
-                          <a14:useLocalDpi xmlns:a14="http://schemas.microsoft.com/office/drawing/2010/main" val="0"/>
-                        </a:ext>
-                      </a:extLst>
-                    </a:blip>
-                    <a:stretch>
-                      <a:fillRect/>
-                    </a:stretch>
-                  </pic:blipFill>
-                  <pic:spPr>
-                    <a:xfrm>
-                      <a:off x="0" y="0"/>
-                      <a:ext cx="4955559" cy="3716669"/>
-                    </a:xfrm>
-                    <a:prstGeom prst="rect">
-                      <a:avLst/>
-                    </a:prstGeom>
-                  </pic:spPr>
-                </pic:pic>
-              </a:graphicData>
-            </a:graphic>
-          </wp:inline>
-        </w:drawing>
-      </w:r>
-    </w:p>
-    <w:p>
-      <w:pPr>
-        <w:pStyle w:val="af4"/>
-        <w:jc w:val="center"/>
-        <w:rPr>
-          <w:b/>
-          <w:bCs/>
-          <w:i w:val="0"/>
-          <w:iCs w:val="0"/>
-          <w:sz w:val="24"/>
-          <w:szCs w:val="24"/>
-        </w:rPr>
-      </w:pPr>
-      <w:r>
-        <w:t xml:space="preserve">Рисунок </w:t>
-      </w:r>
-      <w:fldSimple w:instr=" SEQ Рисунок \* ARABIC ">
-        <w:r>
-          <w:rPr>
-            <w:noProof/>
-          </w:rPr>
-          <w:t>5</w:t>
-        </w:r>
-      </w:fldSimple>
-      <w:r>
-        <w:t>. Теоретическая функция распределения</w:t>
-      </w:r>
-    </w:p>
-    <w:p>
-      <w:pPr>
-        <w:pStyle w:val="23"/>
-        <w:jc w:val="both"/>
-        <w:rPr>
-          <w:b w:val="0"/>
-          <w:bCs w:val="0"/>
-          <w:i w:val="0"/>
-          <w:iCs w:val="0"/>
-          <w:sz w:val="24"/>
-          <w:szCs w:val="24"/>
-        </w:rPr>
-      </w:pPr>
-      <w:r>
-        <w:rPr>
-          <w:b w:val="0"/>
-          <w:bCs w:val="0"/>
-          <w:i w:val="0"/>
-          <w:iCs w:val="0"/>
-          <w:sz w:val="24"/>
-          <w:szCs w:val="24"/>
-        </w:rPr>
-        <w:br w:type="page"/>
-      </w:r>
-    </w:p>
-    <w:p>
-      <w:pPr>
-        <w:pStyle w:val="23"/>
-        <w:jc w:val="both"/>
-        <w:rPr>
-          <w:b w:val="0"/>
-          <w:bCs w:val="0"/>
-          <w:i w:val="0"/>
-          <w:iCs w:val="0"/>
-          <w:sz w:val="24"/>
-          <w:szCs w:val="24"/>
-        </w:rPr>
-      </w:pPr>
-    </w:p>
-    <w:p>
-      <w:pPr>
-        <w:pStyle w:val="23"/>
-      </w:pPr>
-      <w:r>
-        <w:t>Часть 2. Точечные и интервальные оценки параметров распределения</w:t>
-      </w:r>
-    </w:p>
+    <w:p/>
     <w:p>
       <w:pPr>
         <w:pStyle w:val="af5"/>
@@ -3734,7 +3625,6 @@
                 <w:b w:val="0"/>
                 <w:bCs w:val="0"/>
                 <w:i w:val="0"/>
-                <w:iCs w:val="0"/>
                 <w:sz w:val="24"/>
                 <w:szCs w:val="24"/>
                 <w:u w:val="single"/>
@@ -3750,7 +3640,6 @@
                       <w:b w:val="0"/>
                       <w:bCs w:val="0"/>
                       <w:i w:val="0"/>
-                      <w:iCs w:val="0"/>
                       <w:sz w:val="24"/>
                       <w:szCs w:val="24"/>
                     </w:rPr>
@@ -3766,7 +3655,6 @@
                           <w:b w:val="0"/>
                           <w:bCs w:val="0"/>
                           <w:i w:val="0"/>
-                          <w:iCs w:val="0"/>
                           <w:sz w:val="24"/>
                           <w:szCs w:val="24"/>
                         </w:rPr>
@@ -3774,6 +3662,9 @@
                     </m:accPr>
                     <m:e>
                       <m:r>
+                        <m:rPr>
+                          <m:sty m:val="p"/>
+                        </m:rPr>
                         <w:rPr>
                           <w:rFonts w:ascii="Cambria Math" w:hAnsi="Cambria Math"/>
                           <w:sz w:val="24"/>
@@ -3786,6 +3677,9 @@
                 </m:e>
                 <m:sub>
                   <m:r>
+                    <m:rPr>
+                      <m:sty m:val="p"/>
+                    </m:rPr>
                     <w:rPr>
                       <w:rFonts w:ascii="Cambria Math" w:hAnsi="Cambria Math"/>
                       <w:sz w:val="24"/>
@@ -3796,6 +3690,9 @@
                 </m:sub>
               </m:sSub>
               <m:r>
+                <m:rPr>
+                  <m:sty m:val="p"/>
+                </m:rPr>
                 <w:rPr>
                   <w:rFonts w:ascii="Cambria Math" w:hAnsi="Cambria Math"/>
                   <w:sz w:val="24"/>
@@ -3804,6 +3701,9 @@
                 <m:t xml:space="preserve">  = </m:t>
               </m:r>
               <m:r>
+                <m:rPr>
+                  <m:sty m:val="p"/>
+                </m:rPr>
                 <w:rPr>
                   <w:rFonts w:ascii="Cambria Math" w:eastAsiaTheme="minorEastAsia" w:hAnsi="Cambria Math"/>
                   <w:sz w:val="24"/>
@@ -3819,7 +3719,6 @@
                 <w:b w:val="0"/>
                 <w:bCs w:val="0"/>
                 <w:i w:val="0"/>
-                <w:iCs w:val="0"/>
                 <w:sz w:val="24"/>
                 <w:szCs w:val="24"/>
                 <w:lang w:val="en-US"/>
@@ -3868,7 +3767,6 @@
                 <w:b w:val="0"/>
                 <w:bCs w:val="0"/>
                 <w:i w:val="0"/>
-                <w:iCs w:val="0"/>
                 <w:sz w:val="24"/>
                 <w:szCs w:val="24"/>
               </w:rPr>
@@ -3882,7 +3780,6 @@
                       <w:b w:val="0"/>
                       <w:bCs w:val="0"/>
                       <w:i w:val="0"/>
-                      <w:iCs w:val="0"/>
                       <w:sz w:val="24"/>
                       <w:szCs w:val="24"/>
                     </w:rPr>
@@ -3890,6 +3787,9 @@
                 </m:sSubPr>
                 <m:e>
                   <m:r>
+                    <m:rPr>
+                      <m:sty m:val="p"/>
+                    </m:rPr>
                     <w:rPr>
                       <w:rFonts w:ascii="Cambria Math" w:hAnsi="Cambria Math"/>
                       <w:sz w:val="24"/>
@@ -3900,6 +3800,9 @@
                 </m:e>
                 <m:sub>
                   <m:r>
+                    <m:rPr>
+                      <m:sty m:val="p"/>
+                    </m:rPr>
                     <w:rPr>
                       <w:rFonts w:ascii="Cambria Math" w:hAnsi="Cambria Math"/>
                       <w:sz w:val="24"/>
@@ -3910,6 +3813,9 @@
                 </m:sub>
               </m:sSub>
               <m:r>
+                <m:rPr>
+                  <m:sty m:val="p"/>
+                </m:rPr>
                 <w:rPr>
                   <w:rFonts w:ascii="Cambria Math" w:hAnsi="Cambria Math"/>
                   <w:sz w:val="24"/>
@@ -3918,6 +3824,9 @@
                 <m:t xml:space="preserve"> </m:t>
               </m:r>
               <m:r>
+                <m:rPr>
+                  <m:sty m:val="p"/>
+                </m:rPr>
                 <w:rPr>
                   <w:rFonts w:ascii="Cambria Math" w:hAnsi="Cambria Math"/>
                   <w:sz w:val="24"/>
@@ -3927,6 +3836,9 @@
                 <m:t xml:space="preserve">= </m:t>
               </m:r>
               <m:r>
+                <m:rPr>
+                  <m:sty m:val="p"/>
+                </m:rPr>
                 <w:rPr>
                   <w:rFonts w:ascii="Cambria Math" w:eastAsiaTheme="minorEastAsia" w:hAnsi="Cambria Math"/>
                   <w:sz w:val="24"/>
@@ -3942,7 +3854,6 @@
                 <w:b w:val="0"/>
                 <w:bCs w:val="0"/>
                 <w:i w:val="0"/>
-                <w:iCs w:val="0"/>
                 <w:sz w:val="24"/>
                 <w:szCs w:val="24"/>
                 <w:lang w:val="en-US"/>
@@ -3991,7 +3902,6 @@
                 <w:b w:val="0"/>
                 <w:bCs w:val="0"/>
                 <w:i w:val="0"/>
-                <w:iCs w:val="0"/>
                 <w:sz w:val="24"/>
                 <w:szCs w:val="24"/>
                 <w:lang w:val="en-US"/>
@@ -4006,7 +3916,6 @@
                       <w:b w:val="0"/>
                       <w:bCs w:val="0"/>
                       <w:i w:val="0"/>
-                      <w:iCs w:val="0"/>
                       <w:sz w:val="24"/>
                       <w:szCs w:val="24"/>
                     </w:rPr>
@@ -4014,6 +3923,9 @@
                 </m:sSubPr>
                 <m:e>
                   <m:r>
+                    <m:rPr>
+                      <m:sty m:val="p"/>
+                    </m:rPr>
                     <w:rPr>
                       <w:rFonts w:ascii="Cambria Math" w:hAnsi="Cambria Math"/>
                       <w:sz w:val="24"/>
@@ -4024,6 +3936,9 @@
                 </m:e>
                 <m:sub>
                   <m:r>
+                    <m:rPr>
+                      <m:sty m:val="p"/>
+                    </m:rPr>
                     <w:rPr>
                       <w:rFonts w:ascii="Cambria Math" w:hAnsi="Cambria Math"/>
                       <w:sz w:val="24"/>
@@ -4034,6 +3949,9 @@
                 </m:sub>
               </m:sSub>
               <m:r>
+                <m:rPr>
+                  <m:sty m:val="p"/>
+                </m:rPr>
                 <w:rPr>
                   <w:rFonts w:ascii="Cambria Math" w:hAnsi="Cambria Math"/>
                   <w:sz w:val="24"/>
@@ -4042,6 +3960,9 @@
                 <m:t xml:space="preserve">= </m:t>
               </m:r>
               <m:r>
+                <m:rPr>
+                  <m:sty m:val="p"/>
+                </m:rPr>
                 <w:rPr>
                   <w:rFonts w:ascii="Cambria Math" w:eastAsiaTheme="minorEastAsia" w:hAnsi="Cambria Math"/>
                   <w:sz w:val="24"/>
@@ -4057,7 +3978,6 @@
                 <w:b w:val="0"/>
                 <w:bCs w:val="0"/>
                 <w:i w:val="0"/>
-                <w:iCs w:val="0"/>
                 <w:sz w:val="24"/>
                 <w:szCs w:val="24"/>
                 <w:lang w:val="en-US"/>
@@ -4106,7 +4026,6 @@
                 <w:b w:val="0"/>
                 <w:bCs w:val="0"/>
                 <w:i w:val="0"/>
-                <w:iCs w:val="0"/>
                 <w:sz w:val="24"/>
                 <w:szCs w:val="24"/>
                 <w:lang w:val="en-US"/>
@@ -4121,7 +4040,6 @@
                       <w:b w:val="0"/>
                       <w:bCs w:val="0"/>
                       <w:i w:val="0"/>
-                      <w:iCs w:val="0"/>
                       <w:sz w:val="24"/>
                       <w:szCs w:val="24"/>
                       <w:vertAlign w:val="superscript"/>
@@ -4131,6 +4049,9 @@
                 </m:sSupPr>
                 <m:e>
                   <m:r>
+                    <m:rPr>
+                      <m:sty m:val="p"/>
+                    </m:rPr>
                     <w:rPr>
                       <w:rFonts w:ascii="Cambria Math" w:hAnsi="Cambria Math"/>
                       <w:sz w:val="24"/>
@@ -4143,6 +4064,9 @@
                 </m:e>
                 <m:sup>
                   <m:r>
+                    <m:rPr>
+                      <m:sty m:val="p"/>
+                    </m:rPr>
                     <w:rPr>
                       <w:rFonts w:ascii="Cambria Math" w:hAnsi="Cambria Math"/>
                       <w:sz w:val="24"/>
@@ -4155,6 +4079,9 @@
                 </m:sup>
               </m:sSup>
               <m:r>
+                <m:rPr>
+                  <m:sty m:val="p"/>
+                </m:rPr>
                 <w:rPr>
                   <w:rFonts w:ascii="Cambria Math" w:hAnsi="Cambria Math"/>
                   <w:sz w:val="24"/>
@@ -4170,7 +4097,6 @@
                 <w:b w:val="0"/>
                 <w:bCs w:val="0"/>
                 <w:i w:val="0"/>
-                <w:iCs w:val="0"/>
                 <w:sz w:val="24"/>
                 <w:szCs w:val="24"/>
                 <w:lang w:val="en-US"/>
@@ -4219,7 +4145,6 @@
                 <w:b w:val="0"/>
                 <w:bCs w:val="0"/>
                 <w:i w:val="0"/>
-                <w:iCs w:val="0"/>
                 <w:sz w:val="24"/>
                 <w:szCs w:val="24"/>
                 <w:lang w:val="en-US"/>
@@ -4227,6 +4152,9 @@
             </w:pPr>
             <m:oMath>
               <m:r>
+                <m:rPr>
+                  <m:sty m:val="p"/>
+                </m:rPr>
                 <w:rPr>
                   <w:rFonts w:ascii="Cambria Math" w:hAnsi="Cambria Math"/>
                   <w:sz w:val="24"/>
@@ -4235,6 +4163,9 @@
                 <m:t>S</m:t>
               </m:r>
               <m:r>
+                <m:rPr>
+                  <m:sty m:val="p"/>
+                </m:rPr>
                 <w:rPr>
                   <w:rFonts w:ascii="Cambria Math" w:hAnsi="Cambria Math"/>
                   <w:sz w:val="24"/>
@@ -4244,6 +4175,9 @@
                 <m:t xml:space="preserve">= </m:t>
               </m:r>
               <m:r>
+                <m:rPr>
+                  <m:sty m:val="p"/>
+                </m:rPr>
                 <w:rPr>
                   <w:rFonts w:ascii="Cambria Math" w:eastAsiaTheme="minorEastAsia" w:hAnsi="Cambria Math"/>
                   <w:sz w:val="24"/>
@@ -4259,7 +4193,6 @@
                 <w:b w:val="0"/>
                 <w:bCs w:val="0"/>
                 <w:i w:val="0"/>
-                <w:iCs w:val="0"/>
                 <w:sz w:val="24"/>
                 <w:szCs w:val="24"/>
                 <w:lang w:val="en-US"/>
@@ -4308,7 +4241,6 @@
                 <w:b w:val="0"/>
                 <w:bCs w:val="0"/>
                 <w:i w:val="0"/>
-                <w:iCs w:val="0"/>
                 <w:sz w:val="24"/>
                 <w:szCs w:val="24"/>
                 <w:lang w:val="en-US"/>
@@ -4323,7 +4255,6 @@
                       <w:b w:val="0"/>
                       <w:bCs w:val="0"/>
                       <w:i w:val="0"/>
-                      <w:iCs w:val="0"/>
                       <w:sz w:val="24"/>
                       <w:szCs w:val="24"/>
                     </w:rPr>
@@ -4331,6 +4262,9 @@
                 </m:sSubPr>
                 <m:e>
                   <m:r>
+                    <m:rPr>
+                      <m:sty m:val="p"/>
+                    </m:rPr>
                     <w:rPr>
                       <w:rFonts w:ascii="Cambria Math" w:hAnsi="Cambria Math"/>
                       <w:sz w:val="24"/>
@@ -4341,6 +4275,9 @@
                 </m:e>
                 <m:sub>
                   <m:r>
+                    <m:rPr>
+                      <m:sty m:val="p"/>
+                    </m:rPr>
                     <w:rPr>
                       <w:rFonts w:ascii="Cambria Math" w:hAnsi="Cambria Math"/>
                       <w:sz w:val="24"/>
@@ -4351,6 +4288,9 @@
                 </m:sub>
               </m:sSub>
               <m:r>
+                <m:rPr>
+                  <m:sty m:val="p"/>
+                </m:rPr>
                 <w:rPr>
                   <w:rFonts w:ascii="Cambria Math" w:hAnsi="Cambria Math"/>
                   <w:sz w:val="24"/>
@@ -4359,6 +4299,9 @@
                 <m:t xml:space="preserve"> </m:t>
               </m:r>
               <m:r>
+                <m:rPr>
+                  <m:sty m:val="p"/>
+                </m:rPr>
                 <w:rPr>
                   <w:rFonts w:ascii="Cambria Math" w:hAnsi="Cambria Math"/>
                   <w:sz w:val="24"/>
@@ -4374,7 +4317,6 @@
                 <w:b w:val="0"/>
                 <w:bCs w:val="0"/>
                 <w:i w:val="0"/>
-                <w:iCs w:val="0"/>
                 <w:sz w:val="24"/>
                 <w:szCs w:val="24"/>
                 <w:lang w:val="en-US"/>
@@ -4423,7 +4365,6 @@
                 <w:b w:val="0"/>
                 <w:bCs w:val="0"/>
                 <w:i w:val="0"/>
-                <w:iCs w:val="0"/>
                 <w:sz w:val="24"/>
                 <w:szCs w:val="24"/>
               </w:rPr>
@@ -4437,7 +4378,6 @@
                       <w:b w:val="0"/>
                       <w:bCs w:val="0"/>
                       <w:i w:val="0"/>
-                      <w:iCs w:val="0"/>
                       <w:sz w:val="24"/>
                       <w:szCs w:val="24"/>
                     </w:rPr>
@@ -4445,6 +4385,9 @@
                 </m:sSubPr>
                 <m:e>
                   <m:r>
+                    <m:rPr>
+                      <m:sty m:val="p"/>
+                    </m:rPr>
                     <w:rPr>
                       <w:rFonts w:ascii="Cambria Math" w:hAnsi="Cambria Math"/>
                       <w:sz w:val="24"/>
@@ -4455,6 +4398,9 @@
                 </m:e>
                 <m:sub>
                   <m:r>
+                    <m:rPr>
+                      <m:sty m:val="p"/>
+                    </m:rPr>
                     <w:rPr>
                       <w:rFonts w:ascii="Cambria Math" w:hAnsi="Cambria Math"/>
                       <w:sz w:val="24"/>
@@ -4463,6 +4409,9 @@
                     <m:t>o</m:t>
                   </m:r>
                   <m:r>
+                    <m:rPr>
+                      <m:sty m:val="p"/>
+                    </m:rPr>
                     <w:rPr>
                       <w:rFonts w:ascii="Cambria Math" w:hAnsi="Cambria Math"/>
                       <w:sz w:val="24"/>
@@ -4474,6 +4423,9 @@
                 </m:sub>
               </m:sSub>
               <m:r>
+                <m:rPr>
+                  <m:sty m:val="p"/>
+                </m:rPr>
                 <w:rPr>
                   <w:rFonts w:ascii="Cambria Math" w:hAnsi="Cambria Math"/>
                   <w:sz w:val="24"/>
@@ -4482,6 +4434,9 @@
                 <m:t xml:space="preserve"> </m:t>
               </m:r>
               <m:r>
+                <m:rPr>
+                  <m:sty m:val="p"/>
+                </m:rPr>
                 <w:rPr>
                   <w:rFonts w:ascii="Cambria Math" w:hAnsi="Cambria Math"/>
                   <w:sz w:val="24"/>
@@ -4491,6 +4446,9 @@
                 <m:t xml:space="preserve">= </m:t>
               </m:r>
               <m:r>
+                <m:rPr>
+                  <m:sty m:val="p"/>
+                </m:rPr>
                 <w:rPr>
                   <w:rFonts w:ascii="Cambria Math" w:eastAsiaTheme="minorEastAsia" w:hAnsi="Cambria Math"/>
                   <w:sz w:val="24"/>
@@ -4506,7 +4464,6 @@
                 <w:b w:val="0"/>
                 <w:bCs w:val="0"/>
                 <w:i w:val="0"/>
-                <w:iCs w:val="0"/>
                 <w:sz w:val="24"/>
                 <w:szCs w:val="24"/>
                 <w:lang w:val="en-US"/>
@@ -4533,6 +4490,26 @@
     <w:p>
       <w:pPr>
         <w:pStyle w:val="23"/>
+      </w:pPr>
+      <w:r>
+        <w:t xml:space="preserve">Часть </w:t>
+      </w:r>
+      <w:r>
+        <w:t>2</w:t>
+      </w:r>
+      <w:r>
+        <w:t xml:space="preserve">. </w:t>
+      </w:r>
+      <w:r>
+        <w:t xml:space="preserve">Интервальные оценки. </w:t>
+      </w:r>
+      <w:r>
+        <w:t>Статистическая проверка статистических гипотез</w:t>
+      </w:r>
+    </w:p>
+    <w:p>
+      <w:pPr>
+        <w:pStyle w:val="23"/>
         <w:rPr>
           <w:b w:val="0"/>
           <w:bCs w:val="0"/>
@@ -4547,6 +4524,16 @@
         </w:rPr>
         <w:t>Интервальные оценки числовых характеристик</w:t>
       </w:r>
+    </w:p>
+    <w:p>
+      <w:pPr>
+        <w:pStyle w:val="23"/>
+        <w:rPr>
+          <w:b w:val="0"/>
+          <w:bCs w:val="0"/>
+          <w:u w:val="single"/>
+        </w:rPr>
+      </w:pPr>
     </w:p>
     <w:p>
       <w:pPr>
@@ -5107,10 +5094,23 @@
     </w:p>
     <w:p>
       <w:pPr>
+        <w:spacing w:after="0"/>
+        <w:rPr>
+          <w:rFonts w:ascii="Times New Roman" w:hAnsi="Times New Roman" w:cs="Times New Roman"/>
+          <w:b/>
+          <w:bCs/>
+          <w:sz w:val="24"/>
+          <w:szCs w:val="24"/>
+        </w:rPr>
+      </w:pPr>
+    </w:p>
+    <w:p>
+      <w:pPr>
         <w:pStyle w:val="af5"/>
         <w:jc w:val="both"/>
       </w:pPr>
       <w:r>
+        <w:lastRenderedPageBreak/>
         <w:t>Доверительный интервал для математического ожидания, в предположении, что дисперсия неизвес</w:t>
       </w:r>
       <w:r>
@@ -5614,23 +5614,6 @@
       <w:pPr>
         <w:pStyle w:val="23"/>
       </w:pPr>
-    </w:p>
-    <w:p>
-      <w:pPr>
-        <w:pStyle w:val="23"/>
-      </w:pPr>
-      <w:r>
-        <w:t xml:space="preserve">Часть </w:t>
-      </w:r>
-      <w:r>
-        <w:t>3</w:t>
-      </w:r>
-      <w:r>
-        <w:t xml:space="preserve">. </w:t>
-      </w:r>
-      <w:r>
-        <w:t>Статистическая проверка статистических гипотез</w:t>
-      </w:r>
     </w:p>
     <w:p>
       <w:pPr>
@@ -5743,7 +5726,7 @@
               <m:oMath>
                 <m:r>
                   <m:rPr>
-                    <m:sty m:val="bi"/>
+                    <m:sty m:val="p"/>
                   </m:rPr>
                   <w:rPr>
                     <w:rFonts w:ascii="Cambria Math" w:hAnsi="Cambria Math"/>
@@ -5770,7 +5753,7 @@
                   <m:e>
                     <m:r>
                       <m:rPr>
-                        <m:sty m:val="bi"/>
+                        <m:sty m:val="p"/>
                       </m:rPr>
                       <w:rPr>
                         <w:rFonts w:ascii="Cambria Math" w:hAnsi="Cambria Math"/>
@@ -5784,7 +5767,7 @@
                   <m:sub>
                     <m:r>
                       <m:rPr>
-                        <m:sty m:val="bi"/>
+                        <m:sty m:val="p"/>
                       </m:rPr>
                       <w:rPr>
                         <w:rFonts w:ascii="Cambria Math" w:hAnsi="Cambria Math"/>
@@ -5798,7 +5781,7 @@
                 </m:sSub>
                 <m:r>
                   <m:rPr>
-                    <m:sty m:val="bi"/>
+                    <m:sty m:val="p"/>
                   </m:rPr>
                   <w:rPr>
                     <w:rFonts w:ascii="Cambria Math" w:hAnsi="Cambria Math"/>
@@ -5826,7 +5809,7 @@
                   <m:e>
                     <m:r>
                       <m:rPr>
-                        <m:sty m:val="bi"/>
+                        <m:sty m:val="p"/>
                       </m:rPr>
                       <w:rPr>
                         <w:rFonts w:ascii="Cambria Math" w:hAnsi="Cambria Math"/>
@@ -5840,7 +5823,7 @@
                   <m:sub>
                     <m:r>
                       <m:rPr>
-                        <m:sty m:val="bi"/>
+                        <m:sty m:val="p"/>
                       </m:rPr>
                       <w:rPr>
                         <w:rFonts w:ascii="Cambria Math" w:hAnsi="Cambria Math"/>
@@ -5854,7 +5837,7 @@
                 </m:sSub>
                 <m:r>
                   <m:rPr>
-                    <m:sty m:val="bi"/>
+                    <m:sty m:val="p"/>
                   </m:rPr>
                   <w:rPr>
                     <w:rFonts w:ascii="Cambria Math" w:hAnsi="Cambria Math"/>
@@ -5903,7 +5886,7 @@
                   <m:e>
                     <m:r>
                       <m:rPr>
-                        <m:sty m:val="bi"/>
+                        <m:sty m:val="p"/>
                       </m:rPr>
                       <w:rPr>
                         <w:rFonts w:ascii="Cambria Math" w:hAnsi="Cambria Math"/>
@@ -5916,7 +5899,7 @@
                   <m:sub>
                     <m:r>
                       <m:rPr>
-                        <m:sty m:val="bi"/>
+                        <m:sty m:val="p"/>
                       </m:rPr>
                       <w:rPr>
                         <w:rFonts w:ascii="Cambria Math" w:hAnsi="Cambria Math"/>
@@ -5967,7 +5950,7 @@
                   <m:e>
                     <m:r>
                       <m:rPr>
-                        <m:sty m:val="bi"/>
+                        <m:sty m:val="p"/>
                       </m:rPr>
                       <w:rPr>
                         <w:rFonts w:ascii="Cambria Math" w:hAnsi="Cambria Math"/>
@@ -5980,7 +5963,7 @@
                   <m:sub>
                     <m:r>
                       <m:rPr>
-                        <m:sty m:val="bi"/>
+                        <m:sty m:val="p"/>
                       </m:rPr>
                       <w:rPr>
                         <w:rFonts w:ascii="Cambria Math" w:hAnsi="Cambria Math"/>
@@ -5993,7 +5976,7 @@
                 </m:sSub>
                 <m:r>
                   <m:rPr>
-                    <m:sty m:val="bi"/>
+                    <m:sty m:val="p"/>
                   </m:rPr>
                   <w:rPr>
                     <w:rFonts w:ascii="Cambria Math" w:hAnsi="Cambria Math"/>
@@ -6037,7 +6020,7 @@
                       <m:e>
                         <m:r>
                           <m:rPr>
-                            <m:sty m:val="bi"/>
+                            <m:sty m:val="p"/>
                           </m:rPr>
                           <w:rPr>
                             <w:rFonts w:ascii="Cambria Math" w:hAnsi="Cambria Math"/>
@@ -6051,7 +6034,7 @@
                       <m:sub>
                         <m:r>
                           <m:rPr>
-                            <m:sty m:val="bi"/>
+                            <m:sty m:val="p"/>
                           </m:rPr>
                           <w:rPr>
                             <w:rFonts w:ascii="Cambria Math" w:hAnsi="Cambria Math"/>
@@ -6065,7 +6048,7 @@
                     </m:sSub>
                     <m:r>
                       <m:rPr>
-                        <m:sty m:val="bi"/>
+                        <m:sty m:val="p"/>
                       </m:rPr>
                       <w:rPr>
                         <w:rFonts w:ascii="Cambria Math" w:hAnsi="Cambria Math"/>
@@ -6093,7 +6076,7 @@
                       <m:e>
                         <m:r>
                           <m:rPr>
-                            <m:sty m:val="bi"/>
+                            <m:sty m:val="p"/>
                           </m:rPr>
                           <w:rPr>
                             <w:rFonts w:ascii="Cambria Math" w:hAnsi="Cambria Math"/>
@@ -6107,7 +6090,7 @@
                       <m:sub>
                         <m:r>
                           <m:rPr>
-                            <m:sty m:val="bi"/>
+                            <m:sty m:val="p"/>
                           </m:rPr>
                           <w:rPr>
                             <w:rFonts w:ascii="Cambria Math" w:hAnsi="Cambria Math"/>
@@ -6123,7 +6106,7 @@
                   <m:den>
                     <m:r>
                       <m:rPr>
-                        <m:sty m:val="bi"/>
+                        <m:sty m:val="p"/>
                       </m:rPr>
                       <w:rPr>
                         <w:rFonts w:ascii="Cambria Math" w:hAnsi="Cambria Math"/>
@@ -6174,7 +6157,7 @@
                   <m:e>
                     <m:r>
                       <m:rPr>
-                        <m:sty m:val="bi"/>
+                        <m:sty m:val="p"/>
                       </m:rPr>
                       <w:rPr>
                         <w:rFonts w:ascii="Cambria Math" w:hAnsi="Cambria Math"/>
@@ -6187,7 +6170,7 @@
                   <m:sub>
                     <m:r>
                       <m:rPr>
-                        <m:sty m:val="bi"/>
+                        <m:sty m:val="p"/>
                       </m:rPr>
                       <w:rPr>
                         <w:rFonts w:ascii="Cambria Math" w:hAnsi="Cambria Math"/>
@@ -6200,7 +6183,7 @@
                 </m:sSub>
                 <m:r>
                   <m:rPr>
-                    <m:sty m:val="bi"/>
+                    <m:sty m:val="p"/>
                   </m:rPr>
                   <w:rPr>
                     <w:rFonts w:ascii="Cambria Math" w:hAnsi="Cambria Math"/>
@@ -6244,7 +6227,7 @@
                       <m:e>
                         <m:r>
                           <m:rPr>
-                            <m:sty m:val="bi"/>
+                            <m:sty m:val="p"/>
                           </m:rPr>
                           <w:rPr>
                             <w:rFonts w:ascii="Cambria Math" w:hAnsi="Cambria Math"/>
@@ -6258,7 +6241,7 @@
                       <m:sub>
                         <m:r>
                           <m:rPr>
-                            <m:sty m:val="bi"/>
+                            <m:sty m:val="p"/>
                           </m:rPr>
                           <w:rPr>
                             <w:rFonts w:ascii="Cambria Math" w:hAnsi="Cambria Math"/>
@@ -6272,7 +6255,7 @@
                     </m:sSub>
                     <m:r>
                       <m:rPr>
-                        <m:sty m:val="bi"/>
+                        <m:sty m:val="p"/>
                       </m:rPr>
                       <w:rPr>
                         <w:rFonts w:ascii="Cambria Math" w:hAnsi="Cambria Math"/>
@@ -6300,7 +6283,7 @@
                       <m:e>
                         <m:r>
                           <m:rPr>
-                            <m:sty m:val="bi"/>
+                            <m:sty m:val="p"/>
                           </m:rPr>
                           <w:rPr>
                             <w:rFonts w:ascii="Cambria Math" w:hAnsi="Cambria Math"/>
@@ -6314,7 +6297,7 @@
                       <m:sub>
                         <m:r>
                           <m:rPr>
-                            <m:sty m:val="bi"/>
+                            <m:sty m:val="p"/>
                           </m:rPr>
                           <w:rPr>
                             <w:rFonts w:ascii="Cambria Math" w:hAnsi="Cambria Math"/>
@@ -6330,7 +6313,7 @@
                   <m:den>
                     <m:r>
                       <m:rPr>
-                        <m:sty m:val="bi"/>
+                        <m:sty m:val="p"/>
                       </m:rPr>
                       <w:rPr>
                         <w:rFonts w:ascii="Cambria Math" w:hAnsi="Cambria Math"/>
@@ -6367,7 +6350,7 @@
               <m:oMath>
                 <m:r>
                   <m:rPr>
-                    <m:sty m:val="bi"/>
+                    <m:sty m:val="p"/>
                   </m:rPr>
                   <w:rPr>
                     <w:rFonts w:ascii="Cambria Math" w:hAnsi="Cambria Math"/>
@@ -6394,7 +6377,7 @@
                   <m:e>
                     <m:r>
                       <m:rPr>
-                        <m:sty m:val="bi"/>
+                        <m:sty m:val="p"/>
                       </m:rPr>
                       <w:rPr>
                         <w:rFonts w:ascii="Cambria Math" w:hAnsi="Cambria Math"/>
@@ -6408,7 +6391,7 @@
                   <m:sub>
                     <m:r>
                       <m:rPr>
-                        <m:sty m:val="bi"/>
+                        <m:sty m:val="p"/>
                       </m:rPr>
                       <w:rPr>
                         <w:rFonts w:ascii="Cambria Math" w:hAnsi="Cambria Math"/>
@@ -6422,7 +6405,7 @@
                 </m:sSub>
                 <m:r>
                   <m:rPr>
-                    <m:sty m:val="bi"/>
+                    <m:sty m:val="p"/>
                   </m:rPr>
                   <w:rPr>
                     <w:rFonts w:ascii="Cambria Math" w:hAnsi="Cambria Math"/>
@@ -6456,7 +6439,7 @@
               <m:oMath>
                 <m:r>
                   <m:rPr>
-                    <m:sty m:val="bi"/>
+                    <m:sty m:val="p"/>
                   </m:rPr>
                   <w:rPr>
                     <w:rFonts w:ascii="Cambria Math" w:hAnsi="Cambria Math"/>
@@ -6483,7 +6466,7 @@
                   <m:e>
                     <m:r>
                       <m:rPr>
-                        <m:sty m:val="bi"/>
+                        <m:sty m:val="p"/>
                       </m:rPr>
                       <w:rPr>
                         <w:rFonts w:ascii="Cambria Math" w:hAnsi="Cambria Math"/>
@@ -6497,7 +6480,7 @@
                   <m:sub>
                     <m:r>
                       <m:rPr>
-                        <m:sty m:val="bi"/>
+                        <m:sty m:val="p"/>
                       </m:rPr>
                       <w:rPr>
                         <w:rFonts w:ascii="Cambria Math" w:hAnsi="Cambria Math"/>
@@ -6511,7 +6494,7 @@
                 </m:sSub>
                 <m:r>
                   <m:rPr>
-                    <m:sty m:val="bi"/>
+                    <m:sty m:val="p"/>
                   </m:rPr>
                   <w:rPr>
                     <w:rFonts w:ascii="Cambria Math" w:hAnsi="Cambria Math"/>
@@ -6560,7 +6543,7 @@
                   <m:e>
                     <m:r>
                       <m:rPr>
-                        <m:sty m:val="bi"/>
+                        <m:sty m:val="p"/>
                       </m:rPr>
                       <w:rPr>
                         <w:rFonts w:ascii="Cambria Math" w:hAnsi="Cambria Math"/>
@@ -6573,7 +6556,7 @@
                   <m:sub>
                     <m:r>
                       <m:rPr>
-                        <m:sty m:val="bi"/>
+                        <m:sty m:val="p"/>
                       </m:rPr>
                       <w:rPr>
                         <w:rFonts w:ascii="Cambria Math" w:hAnsi="Cambria Math"/>
@@ -6586,7 +6569,7 @@
                   <m:sup>
                     <m:r>
                       <m:rPr>
-                        <m:sty m:val="bi"/>
+                        <m:sty m:val="p"/>
                       </m:rPr>
                       <w:rPr>
                         <w:rFonts w:ascii="Cambria Math" w:hAnsi="Cambria Math"/>
@@ -6609,6 +6592,8 @@
             <w:pPr>
               <w:pStyle w:val="23"/>
               <w:rPr>
+                <w:b w:val="0"/>
+                <w:bCs w:val="0"/>
                 <w:i w:val="0"/>
                 <w:iCs w:val="0"/>
                 <w:sz w:val="20"/>
@@ -6635,7 +6620,7 @@
                   <m:e>
                     <m:r>
                       <m:rPr>
-                        <m:sty m:val="bi"/>
+                        <m:sty m:val="p"/>
                       </m:rPr>
                       <w:rPr>
                         <w:rFonts w:ascii="Cambria Math" w:hAnsi="Cambria Math"/>
@@ -6648,7 +6633,7 @@
                   <m:sub>
                     <m:r>
                       <m:rPr>
-                        <m:sty m:val="bi"/>
+                        <m:sty m:val="p"/>
                       </m:rPr>
                       <w:rPr>
                         <w:rFonts w:ascii="Cambria Math" w:hAnsi="Cambria Math"/>
@@ -6661,7 +6646,7 @@
                   <m:sup>
                     <m:r>
                       <m:rPr>
-                        <m:sty m:val="bi"/>
+                        <m:sty m:val="p"/>
                       </m:rPr>
                       <w:rPr>
                         <w:rFonts w:ascii="Cambria Math" w:hAnsi="Cambria Math"/>
@@ -6674,7 +6659,7 @@
                 </m:sSubSup>
                 <m:r>
                   <m:rPr>
-                    <m:sty m:val="bi"/>
+                    <m:sty m:val="p"/>
                   </m:rPr>
                   <w:rPr>
                     <w:rFonts w:ascii="Cambria Math" w:hAnsi="Cambria Math"/>
@@ -6701,7 +6686,7 @@
                   <m:e>
                     <m:r>
                       <m:rPr>
-                        <m:sty m:val="bi"/>
+                        <m:sty m:val="p"/>
                       </m:rPr>
                       <w:rPr>
                         <w:rFonts w:ascii="Cambria Math" w:hAnsi="Cambria Math"/>
@@ -6714,7 +6699,7 @@
                   <m:sub>
                     <m:r>
                       <m:rPr>
-                        <m:sty m:val="bi"/>
+                        <m:sty m:val="p"/>
                       </m:rPr>
                       <w:rPr>
                         <w:rFonts w:ascii="Cambria Math" w:hAnsi="Cambria Math"/>
@@ -6727,7 +6712,7 @@
                   <m:sup>
                     <m:r>
                       <m:rPr>
-                        <m:sty m:val="bi"/>
+                        <m:sty m:val="p"/>
                       </m:rPr>
                       <w:rPr>
                         <w:rFonts w:ascii="Cambria Math" w:hAnsi="Cambria Math"/>
@@ -6792,7 +6777,7 @@
                       <m:e>
                         <m:r>
                           <m:rPr>
-                            <m:sty m:val="bi"/>
+                            <m:sty m:val="p"/>
                           </m:rPr>
                           <w:rPr>
                             <w:rFonts w:ascii="Cambria Math" w:hAnsi="Cambria Math"/>
@@ -6819,7 +6804,7 @@
                           <m:e>
                             <m:r>
                               <m:rPr>
-                                <m:sty m:val="bi"/>
+                                <m:sty m:val="p"/>
                               </m:rPr>
                               <w:rPr>
                                 <w:rFonts w:ascii="Cambria Math" w:hAnsi="Cambria Math"/>
@@ -6833,7 +6818,7 @@
                           <m:sub>
                             <m:r>
                               <m:rPr>
-                                <m:sty m:val="bi"/>
+                                <m:sty m:val="p"/>
                               </m:rPr>
                               <w:rPr>
                                 <w:rFonts w:ascii="Cambria Math" w:hAnsi="Cambria Math"/>
@@ -6847,7 +6832,7 @@
                         </m:sSub>
                         <m:r>
                           <m:rPr>
-                            <m:sty m:val="bi"/>
+                            <m:sty m:val="p"/>
                           </m:rPr>
                           <w:rPr>
                             <w:rFonts w:ascii="Cambria Math" w:hAnsi="Cambria Math"/>
@@ -6875,7 +6860,7 @@
                           <m:e>
                             <m:r>
                               <m:rPr>
-                                <m:sty m:val="bi"/>
+                                <m:sty m:val="p"/>
                               </m:rPr>
                               <w:rPr>
                                 <w:rFonts w:ascii="Cambria Math" w:hAnsi="Cambria Math"/>
@@ -6889,7 +6874,7 @@
                           <m:sub>
                             <m:r>
                               <m:rPr>
-                                <m:sty m:val="bi"/>
+                                <m:sty m:val="p"/>
                               </m:rPr>
                               <w:rPr>
                                 <w:rFonts w:ascii="Cambria Math" w:hAnsi="Cambria Math"/>
@@ -6903,7 +6888,7 @@
                           <m:sup>
                             <m:r>
                               <m:rPr>
-                                <m:sty m:val="bi"/>
+                                <m:sty m:val="p"/>
                               </m:rPr>
                               <w:rPr>
                                 <w:rFonts w:ascii="Cambria Math" w:hAnsi="Cambria Math"/>
@@ -6917,7 +6902,7 @@
                         </m:sSubSup>
                         <m:r>
                           <m:rPr>
-                            <m:sty m:val="bi"/>
+                            <m:sty m:val="p"/>
                           </m:rPr>
                           <w:rPr>
                             <w:rFonts w:ascii="Cambria Math" w:hAnsi="Cambria Math"/>
@@ -6931,7 +6916,7 @@
                       <m:sup>
                         <m:r>
                           <m:rPr>
-                            <m:sty m:val="bi"/>
+                            <m:sty m:val="p"/>
                           </m:rPr>
                           <w:rPr>
                             <w:rFonts w:ascii="Cambria Math" w:hAnsi="Cambria Math"/>
@@ -6962,7 +6947,7 @@
                       <m:e>
                         <m:r>
                           <m:rPr>
-                            <m:sty m:val="bi"/>
+                            <m:sty m:val="p"/>
                           </m:rPr>
                           <w:rPr>
                             <w:rFonts w:ascii="Cambria Math" w:hAnsi="Cambria Math"/>
@@ -6976,7 +6961,7 @@
                       <m:sub>
                         <m:r>
                           <m:rPr>
-                            <m:sty m:val="bi"/>
+                            <m:sty m:val="p"/>
                           </m:rPr>
                           <w:rPr>
                             <w:rFonts w:ascii="Cambria Math" w:hAnsi="Cambria Math"/>
@@ -6990,7 +6975,7 @@
                       <m:sup>
                         <m:r>
                           <m:rPr>
-                            <m:sty m:val="bi"/>
+                            <m:sty m:val="p"/>
                           </m:rPr>
                           <w:rPr>
                             <w:rFonts w:ascii="Cambria Math" w:hAnsi="Cambria Math"/>
@@ -9294,6 +9279,39 @@
           </w:p>
         </w:tc>
       </w:tr>
+      <w:tr>
+        <w:tc>
+          <w:tcPr>
+            <w:tcW w:w="3823" w:type="dxa"/>
+          </w:tcPr>
+          <w:p>
+            <w:pPr>
+              <w:rPr>
+                <w:rFonts w:ascii="Times New Roman" w:hAnsi="Times New Roman" w:cs="Times New Roman"/>
+                <w:b/>
+                <w:bCs/>
+                <w:sz w:val="24"/>
+                <w:szCs w:val="24"/>
+              </w:rPr>
+            </w:pPr>
+          </w:p>
+        </w:tc>
+        <w:tc>
+          <w:tcPr>
+            <w:tcW w:w="5913" w:type="dxa"/>
+          </w:tcPr>
+          <w:p>
+            <w:pPr>
+              <w:jc w:val="center"/>
+              <w:rPr>
+                <w:rFonts w:ascii="Times New Roman" w:hAnsi="Times New Roman" w:cs="Times New Roman"/>
+                <w:sz w:val="24"/>
+                <w:szCs w:val="24"/>
+              </w:rPr>
+            </w:pPr>
+          </w:p>
+        </w:tc>
+      </w:tr>
     </w:tbl>
     <w:p>
       <w:pPr>
@@ -9309,7 +9327,6 @@
           <w:sz w:val="26"/>
           <w:szCs w:val="26"/>
         </w:rPr>
-        <w:lastRenderedPageBreak/>
         <w:t xml:space="preserve">Таблица </w:t>
       </w:r>
       <w:r>
@@ -9420,7 +9437,7 @@
                   <m:e>
                     <m:r>
                       <m:rPr>
-                        <m:sty m:val="p"/>
+                        <m:sty m:val="bi"/>
                       </m:rPr>
                       <w:rPr>
                         <w:rFonts w:ascii="Cambria Math" w:hAnsi="Cambria Math"/>
@@ -9433,7 +9450,7 @@
                   <m:sub>
                     <m:r>
                       <m:rPr>
-                        <m:sty m:val="p"/>
+                        <m:sty m:val="bi"/>
                       </m:rPr>
                       <w:rPr>
                         <w:rFonts w:ascii="Cambria Math" w:hAnsi="Cambria Math"/>
@@ -9446,7 +9463,7 @@
                   <m:sup>
                     <m:r>
                       <m:rPr>
-                        <m:sty m:val="p"/>
+                        <m:sty m:val="bi"/>
                       </m:rPr>
                       <w:rPr>
                         <w:rFonts w:ascii="Cambria Math" w:hAnsi="Cambria Math"/>
@@ -9496,7 +9513,7 @@
                   <m:e>
                     <m:r>
                       <m:rPr>
-                        <m:sty m:val="p"/>
+                        <m:sty m:val="bi"/>
                       </m:rPr>
                       <w:rPr>
                         <w:rFonts w:ascii="Cambria Math" w:hAnsi="Cambria Math"/>
@@ -9509,7 +9526,7 @@
                   <m:sub>
                     <m:r>
                       <m:rPr>
-                        <m:sty m:val="p"/>
+                        <m:sty m:val="bi"/>
                       </m:rPr>
                       <w:rPr>
                         <w:rFonts w:ascii="Cambria Math" w:hAnsi="Cambria Math"/>
@@ -9561,7 +9578,7 @@
                   <m:e>
                     <m:r>
                       <m:rPr>
-                        <m:sty m:val="p"/>
+                        <m:sty m:val="bi"/>
                       </m:rPr>
                       <w:rPr>
                         <w:rFonts w:ascii="Cambria Math" w:hAnsi="Cambria Math"/>
@@ -9575,7 +9592,7 @@
                   <m:sub>
                     <m:r>
                       <m:rPr>
-                        <m:sty m:val="p"/>
+                        <m:sty m:val="bi"/>
                       </m:rPr>
                       <w:rPr>
                         <w:rFonts w:ascii="Cambria Math" w:hAnsi="Cambria Math"/>
@@ -9628,7 +9645,7 @@
                   <m:e>
                     <m:r>
                       <m:rPr>
-                        <m:sty m:val="p"/>
+                        <m:sty m:val="bi"/>
                       </m:rPr>
                       <w:rPr>
                         <w:rFonts w:ascii="Cambria Math" w:hAnsi="Cambria Math"/>
@@ -9642,7 +9659,7 @@
                   <m:sub>
                     <m:r>
                       <m:rPr>
-                        <m:sty m:val="p"/>
+                        <m:sty m:val="bi"/>
                       </m:rPr>
                       <w:rPr>
                         <w:rFonts w:ascii="Cambria Math" w:hAnsi="Cambria Math"/>
@@ -9656,7 +9673,7 @@
                   <m:sup>
                     <m:r>
                       <m:rPr>
-                        <m:sty m:val="p"/>
+                        <m:sty m:val="bi"/>
                       </m:rPr>
                       <w:rPr>
                         <w:rFonts w:ascii="Cambria Math" w:hAnsi="Cambria Math"/>
@@ -9685,31 +9702,20 @@
                   <m:e>
                     <m:r>
                       <m:rPr>
-                        <m:sty m:val="p"/>
+                        <m:sty m:val="bi"/>
                       </m:rPr>
                       <w:rPr>
                         <w:rFonts w:ascii="Cambria Math" w:hAnsi="Cambria Math"/>
                         <w:sz w:val="24"/>
                         <w:szCs w:val="24"/>
                       </w:rPr>
-                      <m:t>(</m:t>
-                    </m:r>
-                    <m:r>
-                      <m:rPr>
-                        <m:sty m:val="p"/>
-                      </m:rPr>
-                      <w:rPr>
-                        <w:rFonts w:ascii="Cambria Math" w:hAnsi="Cambria Math"/>
-                        <w:sz w:val="24"/>
-                        <w:szCs w:val="24"/>
-                      </w:rPr>
-                      <m:t>x</m:t>
+                      <m:t>(x</m:t>
                     </m:r>
                   </m:e>
                   <m:sub>
                     <m:r>
                       <m:rPr>
-                        <m:sty m:val="p"/>
+                        <m:sty m:val="bi"/>
                       </m:rPr>
                       <w:rPr>
                         <w:rFonts w:ascii="Cambria Math" w:hAnsi="Cambria Math"/>
@@ -9722,7 +9728,7 @@
                   <m:sup>
                     <m:r>
                       <m:rPr>
-                        <m:sty m:val="p"/>
+                        <m:sty m:val="bi"/>
                       </m:rPr>
                       <w:rPr>
                         <w:rFonts w:ascii="Cambria Math" w:hAnsi="Cambria Math"/>
@@ -9735,7 +9741,7 @@
                 </m:sSubSup>
                 <m:r>
                   <m:rPr>
-                    <m:sty m:val="p"/>
+                    <m:sty m:val="bi"/>
                   </m:rPr>
                   <w:rPr>
                     <w:rFonts w:ascii="Cambria Math" w:hAnsi="Cambria Math"/>
@@ -9784,7 +9790,7 @@
                   <m:e>
                     <m:r>
                       <m:rPr>
-                        <m:sty m:val="p"/>
+                        <m:sty m:val="bi"/>
                       </m:rPr>
                       <w:rPr>
                         <w:rFonts w:ascii="Cambria Math" w:hAnsi="Cambria Math"/>
@@ -9797,7 +9803,7 @@
                   <m:sub>
                     <m:r>
                       <m:rPr>
-                        <m:sty m:val="p"/>
+                        <m:sty m:val="bi"/>
                       </m:rPr>
                       <w:rPr>
                         <w:rFonts w:ascii="Cambria Math" w:hAnsi="Cambria Math"/>
@@ -9810,7 +9816,7 @@
                 </m:sSub>
                 <m:r>
                   <m:rPr>
-                    <m:sty m:val="p"/>
+                    <m:sty m:val="bi"/>
                   </m:rPr>
                   <w:rPr>
                     <w:rFonts w:ascii="Cambria Math" w:hAnsi="Cambria Math"/>
@@ -9853,7 +9859,7 @@
                       <m:e>
                         <m:r>
                           <m:rPr>
-                            <m:sty m:val="p"/>
+                            <m:sty m:val="bi"/>
                           </m:rPr>
                           <w:rPr>
                             <w:rFonts w:ascii="Cambria Math" w:hAnsi="Cambria Math"/>
@@ -9866,7 +9872,7 @@
                       <m:sub>
                         <m:r>
                           <m:rPr>
-                            <m:sty m:val="p"/>
+                            <m:sty m:val="bi"/>
                           </m:rPr>
                           <w:rPr>
                             <w:rFonts w:ascii="Cambria Math" w:hAnsi="Cambria Math"/>
@@ -9879,7 +9885,7 @@
                       <m:sup>
                         <m:r>
                           <m:rPr>
-                            <m:sty m:val="p"/>
+                            <m:sty m:val="bi"/>
                           </m:rPr>
                           <w:rPr>
                             <w:rFonts w:ascii="Cambria Math" w:hAnsi="Cambria Math"/>
@@ -9892,7 +9898,7 @@
                     </m:sSubSup>
                     <m:r>
                       <m:rPr>
-                        <m:sty m:val="p"/>
+                        <m:sty m:val="bi"/>
                       </m:rPr>
                       <w:rPr>
                         <w:rFonts w:ascii="Cambria Math" w:hAnsi="Cambria Math"/>
@@ -9920,7 +9926,7 @@
                       <m:e>
                         <m:r>
                           <m:rPr>
-                            <m:sty m:val="p"/>
+                            <m:sty m:val="bi"/>
                           </m:rPr>
                           <w:rPr>
                             <w:rFonts w:ascii="Cambria Math" w:hAnsi="Cambria Math"/>
@@ -9934,7 +9940,7 @@
                       <m:sub>
                         <m:r>
                           <m:rPr>
-                            <m:sty m:val="p"/>
+                            <m:sty m:val="bi"/>
                           </m:rPr>
                           <w:rPr>
                             <w:rFonts w:ascii="Cambria Math" w:hAnsi="Cambria Math"/>
@@ -9948,7 +9954,7 @@
                       <m:sup>
                         <m:r>
                           <m:rPr>
-                            <m:sty m:val="p"/>
+                            <m:sty m:val="bi"/>
                           </m:rPr>
                           <w:rPr>
                             <w:rFonts w:ascii="Cambria Math" w:hAnsi="Cambria Math"/>
@@ -9964,7 +9970,7 @@
                   <m:den>
                     <m:r>
                       <m:rPr>
-                        <m:sty m:val="p"/>
+                        <m:sty m:val="bi"/>
                       </m:rPr>
                       <w:rPr>
                         <w:rFonts w:ascii="Cambria Math" w:hAnsi="Cambria Math"/>
@@ -10015,7 +10021,7 @@
                   <m:e>
                     <m:r>
                       <m:rPr>
-                        <m:sty m:val="p"/>
+                        <m:sty m:val="bi"/>
                       </m:rPr>
                       <w:rPr>
                         <w:rFonts w:ascii="Cambria Math" w:hAnsi="Cambria Math"/>
@@ -10028,7 +10034,7 @@
                   <m:sub>
                     <m:r>
                       <m:rPr>
-                        <m:sty m:val="p"/>
+                        <m:sty m:val="bi"/>
                       </m:rPr>
                       <w:rPr>
                         <w:rFonts w:ascii="Cambria Math" w:hAnsi="Cambria Math"/>
@@ -10071,7 +10077,7 @@
                       <m:e>
                         <m:r>
                           <m:rPr>
-                            <m:sty m:val="p"/>
+                            <m:sty m:val="bi"/>
                           </m:rPr>
                           <w:rPr>
                             <w:rFonts w:ascii="Cambria Math" w:hAnsi="Cambria Math"/>
@@ -10084,7 +10090,7 @@
                       <m:sub>
                         <m:r>
                           <m:rPr>
-                            <m:sty m:val="p"/>
+                            <m:sty m:val="bi"/>
                           </m:rPr>
                           <w:rPr>
                             <w:rFonts w:ascii="Cambria Math" w:hAnsi="Cambria Math"/>
@@ -10099,7 +10105,7 @@
                 </m:d>
                 <m:r>
                   <m:rPr>
-                    <m:sty m:val="p"/>
+                    <m:sty m:val="bi"/>
                   </m:rPr>
                   <w:rPr>
                     <w:rFonts w:ascii="Cambria Math" w:hAnsi="Cambria Math"/>
@@ -10110,7 +10116,7 @@
                 </m:r>
                 <m:r>
                   <m:rPr>
-                    <m:sty m:val="p"/>
+                    <m:sty m:val="bi"/>
                   </m:rPr>
                   <w:rPr>
                     <w:rFonts w:ascii="Cambria Math" w:hAnsi="Cambria Math"/>
@@ -10138,7 +10144,7 @@
                   <m:num>
                     <m:r>
                       <m:rPr>
-                        <m:sty m:val="p"/>
+                        <m:sty m:val="bi"/>
                       </m:rPr>
                       <w:rPr>
                         <w:rFonts w:ascii="Cambria Math" w:hAnsi="Cambria Math"/>
@@ -10152,7 +10158,7 @@
                   <m:den>
                     <m:r>
                       <m:rPr>
-                        <m:sty m:val="p"/>
+                        <m:sty m:val="bi"/>
                       </m:rPr>
                       <w:rPr>
                         <w:rFonts w:ascii="Cambria Math" w:hAnsi="Cambria Math"/>
@@ -10166,7 +10172,7 @@
                 </m:f>
                 <m:r>
                   <m:rPr>
-                    <m:sty m:val="p"/>
+                    <m:sty m:val="bi"/>
                   </m:rPr>
                   <w:rPr>
                     <w:rFonts w:ascii="Cambria Math" w:hAnsi="Cambria Math"/>
@@ -10178,7 +10184,7 @@
                 </m:r>
                 <m:r>
                   <m:rPr>
-                    <m:sty m:val="p"/>
+                    <m:sty m:val="bi"/>
                   </m:rPr>
                   <w:rPr>
                     <w:rFonts w:ascii="Cambria Math" w:hAnsi="Cambria Math"/>
@@ -10205,7 +10211,7 @@
                   <m:e>
                     <m:r>
                       <m:rPr>
-                        <m:sty m:val="p"/>
+                        <m:sty m:val="bi"/>
                       </m:rPr>
                       <w:rPr>
                         <w:rFonts w:ascii="Cambria Math" w:hAnsi="Cambria Math"/>
@@ -10219,7 +10225,7 @@
                   <m:sub>
                     <m:r>
                       <m:rPr>
-                        <m:sty m:val="p"/>
+                        <m:sty m:val="bi"/>
                       </m:rPr>
                       <w:rPr>
                         <w:rFonts w:ascii="Cambria Math" w:hAnsi="Cambria Math"/>
@@ -10233,7 +10239,7 @@
                 </m:sSub>
                 <m:r>
                   <m:rPr>
-                    <m:sty m:val="p"/>
+                    <m:sty m:val="bi"/>
                   </m:rPr>
                   <w:rPr>
                     <w:rFonts w:ascii="Cambria Math" w:hAnsi="Cambria Math"/>
@@ -10283,7 +10289,7 @@
                   <m:e>
                     <m:r>
                       <m:rPr>
-                        <m:sty m:val="p"/>
+                        <m:sty m:val="bi"/>
                       </m:rPr>
                       <w:rPr>
                         <w:rFonts w:ascii="Cambria Math" w:hAnsi="Cambria Math"/>
@@ -10296,7 +10302,7 @@
                   <m:sub>
                     <m:r>
                       <m:rPr>
-                        <m:sty m:val="p"/>
+                        <m:sty m:val="bi"/>
                       </m:rPr>
                       <w:rPr>
                         <w:rFonts w:ascii="Cambria Math" w:hAnsi="Cambria Math"/>
@@ -10309,7 +10315,7 @@
                 </m:sSub>
                 <m:r>
                   <m:rPr>
-                    <m:sty m:val="p"/>
+                    <m:sty m:val="bi"/>
                   </m:rPr>
                   <w:rPr>
                     <w:rFonts w:ascii="Cambria Math" w:hAnsi="Cambria Math"/>
@@ -10337,7 +10343,7 @@
                   <m:e>
                     <m:r>
                       <m:rPr>
-                        <m:sty m:val="p"/>
+                        <m:sty m:val="bi"/>
                       </m:rPr>
                       <w:rPr>
                         <w:rFonts w:ascii="Cambria Math" w:hAnsi="Cambria Math"/>
@@ -10351,7 +10357,7 @@
                   <m:sub>
                     <m:r>
                       <m:rPr>
-                        <m:sty m:val="p"/>
+                        <m:sty m:val="bi"/>
                       </m:rPr>
                       <w:rPr>
                         <w:rFonts w:ascii="Cambria Math" w:hAnsi="Cambria Math"/>
@@ -10365,7 +10371,7 @@
                   <m:sup>
                     <m:r>
                       <m:rPr>
-                        <m:sty m:val="p"/>
+                        <m:sty m:val="bi"/>
                       </m:rPr>
                       <w:rPr>
                         <w:rFonts w:ascii="Cambria Math" w:hAnsi="Cambria Math"/>
@@ -10410,7 +10416,7 @@
                       <m:e>
                         <m:r>
                           <m:rPr>
-                            <m:sty m:val="p"/>
+                            <m:sty m:val="bi"/>
                           </m:rPr>
                           <w:rPr>
                             <w:rFonts w:ascii="Cambria Math" w:hAnsi="Cambria Math"/>
@@ -10423,7 +10429,7 @@
                       <m:sub>
                         <m:r>
                           <m:rPr>
-                            <m:sty m:val="p"/>
+                            <m:sty m:val="bi"/>
                           </m:rPr>
                           <w:rPr>
                             <w:rFonts w:ascii="Cambria Math" w:hAnsi="Cambria Math"/>
@@ -10436,7 +10442,7 @@
                       <m:sup>
                         <m:r>
                           <m:rPr>
-                            <m:sty m:val="p"/>
+                            <m:sty m:val="bi"/>
                           </m:rPr>
                           <w:rPr>
                             <w:rFonts w:ascii="Cambria Math" w:hAnsi="Cambria Math"/>
@@ -10462,7 +10468,7 @@
                 </m:d>
                 <m:r>
                   <m:rPr>
-                    <m:sty m:val="p"/>
+                    <m:sty m:val="bi"/>
                   </m:rPr>
                   <w:rPr>
                     <w:rFonts w:ascii="Cambria Math" w:hAnsi="Cambria Math"/>
@@ -10473,7 +10479,7 @@
                 </m:r>
                 <m:r>
                   <m:rPr>
-                    <m:sty m:val="p"/>
+                    <m:sty m:val="bi"/>
                   </m:rPr>
                   <w:rPr>
                     <w:rFonts w:ascii="Cambria Math" w:hAnsi="Cambria Math"/>
@@ -10500,7 +10506,7 @@
                   <m:e>
                     <m:r>
                       <m:rPr>
-                        <m:sty m:val="p"/>
+                        <m:sty m:val="bi"/>
                       </m:rPr>
                       <w:rPr>
                         <w:rFonts w:ascii="Cambria Math" w:hAnsi="Cambria Math"/>
@@ -10513,7 +10519,7 @@
                   <m:sub>
                     <m:r>
                       <m:rPr>
-                        <m:sty m:val="p"/>
+                        <m:sty m:val="bi"/>
                       </m:rPr>
                       <w:rPr>
                         <w:rFonts w:ascii="Cambria Math" w:hAnsi="Cambria Math"/>
@@ -10556,7 +10562,7 @@
                       <m:e>
                         <m:r>
                           <m:rPr>
-                            <m:sty m:val="p"/>
+                            <m:sty m:val="bi"/>
                           </m:rPr>
                           <w:rPr>
                             <w:rFonts w:ascii="Cambria Math" w:hAnsi="Cambria Math"/>
@@ -10569,7 +10575,7 @@
                       <m:sub>
                         <m:r>
                           <m:rPr>
-                            <m:sty m:val="p"/>
+                            <m:sty m:val="bi"/>
                           </m:rPr>
                           <w:rPr>
                             <w:rFonts w:ascii="Cambria Math" w:hAnsi="Cambria Math"/>
@@ -10584,7 +10590,7 @@
                 </m:d>
                 <m:r>
                   <m:rPr>
-                    <m:sty m:val="p"/>
+                    <m:sty m:val="bi"/>
                   </m:rPr>
                   <w:rPr>
                     <w:rFonts w:ascii="Cambria Math" w:hAnsi="Cambria Math"/>
@@ -12493,19 +12499,7 @@
                     <w:szCs w:val="24"/>
                     <w:lang w:val="en-US"/>
                   </w:rPr>
-                  <m:t xml:space="preserve"> </m:t>
-                </m:r>
-                <m:r>
-                  <m:rPr>
-                    <m:sty m:val="p"/>
-                  </m:rPr>
-                  <w:rPr>
-                    <w:rFonts w:ascii="Cambria Math" w:hAnsi="Cambria Math"/>
-                    <w:sz w:val="24"/>
-                    <w:szCs w:val="24"/>
-                    <w:lang w:val="en-US"/>
-                  </w:rPr>
-                  <m:t>= 0.</m:t>
+                  <m:t xml:space="preserve"> = 0.</m:t>
                 </m:r>
                 <m:r>
                   <m:rPr>
@@ -12716,18 +12710,7 @@
                     <w:sz w:val="24"/>
                     <w:szCs w:val="24"/>
                   </w:rPr>
-                  <m:t xml:space="preserve"> </m:t>
-                </m:r>
-                <m:r>
-                  <m:rPr>
-                    <m:sty m:val="p"/>
-                  </m:rPr>
-                  <w:rPr>
-                    <w:rFonts w:ascii="Cambria Math" w:hAnsi="Cambria Math"/>
-                    <w:sz w:val="24"/>
-                    <w:szCs w:val="24"/>
-                  </w:rPr>
-                  <m:t xml:space="preserve">= 0.976 </m:t>
+                  <m:t xml:space="preserve"> = 0.976 </m:t>
                 </m:r>
               </m:oMath>
             </m:oMathPara>
@@ -14421,4 +14404,16 @@
     </a:ext>
   </a:extLst>
 </a:theme>
+</file>
+
+<file path=customXml/item1.xml><?xml version="1.0" encoding="utf-8"?>
+<b:Sources xmlns:b="http://schemas.openxmlformats.org/officeDocument/2006/bibliography" xmlns="http://schemas.openxmlformats.org/officeDocument/2006/bibliography" SelectedStyle="\APASixthEditionOfficeOnline.xsl" StyleName="APA" Version="6"/>
+</file>
+
+<file path=customXml/itemProps1.xml><?xml version="1.0" encoding="utf-8"?>
+<ds:datastoreItem xmlns:ds="http://schemas.openxmlformats.org/officeDocument/2006/customXml" ds:itemID="{F497B426-846B-4C61-85FF-775754E82E43}">
+  <ds:schemaRefs>
+    <ds:schemaRef ds:uri="http://schemas.openxmlformats.org/officeDocument/2006/bibliography"/>
+  </ds:schemaRefs>
+</ds:datastoreItem>
 </file>
</xml_diff>